<commit_message>
Add 23 modeling equations in serial order (LaTeX + Word OMML)
- 23 numbered equations (Eq. 1-23) added strictly in serial order across
  the modeling sections (2.3, 2.4, 2.6, 2.7, 2.9, 2.10, 2.11, 2.12)
- Covers vegetation drag, depth-averaged momentum balance, Manning-Strickler
  canopy resistance, Darcy/Richards/van Genuchten, bed-head coupling,
  Green-Ampt, Buckingham-Pi dimensionless groups, power-law + hybrid model,
  and NSE / index-of-agreement metrics
- docx builder now converts LaTeX display equations to native Word OMML
  (fractions, radicals, integrals/sums, sub/superscripts, overlines)
- all prior constraints preserved (refs serial 1-43, figs/tables 2-4x,
  no cites in abstract/conclusion)
</commit_message>
<xml_diff>
--- a/Vegetated_Permeable_Channel_Infiltration.docx
+++ b/Vegetated_Permeable_Channel_Infiltration.docx
@@ -280,17 +280,233 @@
     </w:p>
     <w:p>
       <w:r>
-        <w:t xml:space="preserve">Vegetation was represented initially by rigid cylindrical stems mounted in a staggered array on perforated baseplates that did not obstruct vertical drainage, providing controlled and reproducible frontal-area configurations [25]. This idealization isolates the hydrodynamic role of vegetation from the confounding pedological effects of living roots, consistent with the widespread use of rigid-cylinder canopies in vegetated-flow research [26]. Vegetation density was defined as</w:t>
-      </w:r>
-    </w:p>
-    <w:p>
-      <w:r>
-        <w:t xml:space="preserve">λ = N·A_v / A_b</w:t>
-      </w:r>
-    </w:p>
-    <w:p>
-      <w:r>
-        <w:t xml:space="preserve">where N is the number of stems, A_v is the projected frontal area of one stem, and A_b is the bed area. Four density levels were tested — none, low, medium, and high — with stem diameter and height held constant in the primary matrix. A secondary experiment varied stem diameter at fixed density to isolate its influence. The tested vegetation configurations are illustrated in Figure 2, and their geometric characteristics are compiled in Table 1. The staggered arrangement was chosen over an aligned grid because it produces a more spatially uniform drag distribution and avoids the preferential channeling that aligned arrays create between rows, which would confound the interpretation of the along-channel infiltration profile [25]. Stem height was selected so that the canopy transitioned from emergent at the lowest discharge to partially submerged at the highest, allowing the relative-submergence parameter to span a meaningful range within a single geometric configuration [26]. Only one geometric variable was changed at a time: the primary matrix varied density with fixed stem diameter and height, while the secondary diameter experiment held density constant and changed only the stem diameter, so that the frontal-area density and the individual element scale could be disentangled [21]. This deliberate restriction avoids the common pitfall of varying too many geometric factors simultaneously, which makes the resulting dataset difficult to attribute to any single cause [25].</w:t>
+        <w:t xml:space="preserve">Vegetation was represented initially by rigid cylindrical stems mounted in a staggered array on perforated baseplates that did not obstruct vertical drainage, providing controlled and reproducible frontal-area configurations [25]. This idealization isolates the hydrodynamic role of vegetation from the confounding pedological effects of living roots, consistent with the widespread use of rigid-cylinder canopies in vegetated-flow research [26]. Vegetation density was defined through the frontal-area density,</w:t>
+      </w:r>
+    </w:p>
+    <w:p>
+      <w:pPr>
+        <w:jc w:val="center"/>
+      </w:pPr>
+      <m:oMathPara xmlns:m="http://schemas.openxmlformats.org/officeDocument/2006/math">
+        <m:oMath>
+          <m:r>
+            <m:t xml:space="preserve">λ</m:t>
+          </m:r>
+          <m:r>
+            <m:t xml:space="preserve">=</m:t>
+          </m:r>
+          <m:f>
+            <m:fPr>
+              <m:type m:val="bar"/>
+            </m:fPr>
+            <m:num>
+              <m:r>
+                <m:t xml:space="preserve">N</m:t>
+              </m:r>
+              <m:sSub>
+                <m:e>
+                  <m:r>
+                    <m:t xml:space="preserve">A</m:t>
+                  </m:r>
+                </m:e>
+                <m:sub>
+                  <m:r>
+                    <m:t xml:space="preserve">v</m:t>
+                  </m:r>
+                </m:sub>
+              </m:sSub>
+            </m:num>
+            <m:den>
+              <m:sSub>
+                <m:e>
+                  <m:r>
+                    <m:t xml:space="preserve">A</m:t>
+                  </m:r>
+                </m:e>
+                <m:sub>
+                  <m:r>
+                    <m:t xml:space="preserve">b</m:t>
+                  </m:r>
+                </m:sub>
+              </m:sSub>
+            </m:den>
+          </m:f>
+          <m:r>
+            <m:t xml:space="preserve">=</m:t>
+          </m:r>
+          <m:f>
+            <m:fPr>
+              <m:type m:val="bar"/>
+            </m:fPr>
+            <m:num>
+              <m:r>
+                <m:t xml:space="preserve">N</m:t>
+              </m:r>
+              <m:sSub>
+                <m:e>
+                  <m:r>
+                    <m:t xml:space="preserve">d</m:t>
+                  </m:r>
+                </m:e>
+                <m:sub>
+                  <m:r>
+                    <m:t xml:space="preserve">v</m:t>
+                  </m:r>
+                </m:sub>
+              </m:sSub>
+              <m:sSub>
+                <m:e>
+                  <m:r>
+                    <m:t xml:space="preserve">H</m:t>
+                  </m:r>
+                </m:e>
+                <m:sub>
+                  <m:r>
+                    <m:t xml:space="preserve">v</m:t>
+                  </m:r>
+                </m:sub>
+              </m:sSub>
+            </m:num>
+            <m:den>
+              <m:sSub>
+                <m:e>
+                  <m:r>
+                    <m:t xml:space="preserve">A</m:t>
+                  </m:r>
+                </m:e>
+                <m:sub>
+                  <m:r>
+                    <m:t xml:space="preserve">b</m:t>
+                  </m:r>
+                </m:sub>
+              </m:sSub>
+            </m:den>
+          </m:f>
+          <m:r>
+            <m:t xml:space="preserve">     (1)</m:t>
+          </m:r>
+        </m:oMath>
+      </m:oMathPara>
+    </w:p>
+    <w:p>
+      <w:r>
+        <w:t xml:space="preserve">where N is the number of stems, A_v = d_v·H_v is the projected frontal area of one stem of diameter d_v and height H_v, and A_b is the bed area. The associated momentum extraction by the canopy was represented as a quadratic drag force per unit bed area,</w:t>
+      </w:r>
+    </w:p>
+    <w:p>
+      <w:pPr>
+        <w:jc w:val="center"/>
+      </w:pPr>
+      <m:oMathPara xmlns:m="http://schemas.openxmlformats.org/officeDocument/2006/math">
+        <m:oMath>
+          <m:sSub>
+            <m:e>
+              <m:r>
+                <m:t xml:space="preserve">F</m:t>
+              </m:r>
+            </m:e>
+            <m:sub>
+              <m:r>
+                <m:t xml:space="preserve">D</m:t>
+              </m:r>
+            </m:sub>
+          </m:sSub>
+          <m:r>
+            <m:t xml:space="preserve">=</m:t>
+          </m:r>
+          <m:f>
+            <m:fPr>
+              <m:type m:val="bar"/>
+            </m:fPr>
+            <m:num>
+              <m:r>
+                <m:t xml:space="preserve">1</m:t>
+              </m:r>
+            </m:num>
+            <m:den>
+              <m:r>
+                <m:t xml:space="preserve">2</m:t>
+              </m:r>
+            </m:den>
+          </m:f>
+          <m:r>
+            <m:t xml:space="preserve">ρ</m:t>
+          </m:r>
+          <m:sSub>
+            <m:e>
+              <m:r>
+                <m:t xml:space="preserve">C</m:t>
+              </m:r>
+            </m:e>
+            <m:sub>
+              <m:r>
+                <m:t xml:space="preserve">D</m:t>
+              </m:r>
+            </m:sub>
+          </m:sSub>
+          <m:r>
+            <m:t xml:space="preserve">a</m:t>
+          </m:r>
+          <m:sSup>
+            <m:e>
+              <m:r>
+                <m:t xml:space="preserve">U</m:t>
+              </m:r>
+            </m:e>
+            <m:sup>
+              <m:r>
+                <m:t xml:space="preserve">2</m:t>
+              </m:r>
+            </m:sup>
+          </m:sSup>
+          <m:r>
+            <m:t xml:space="preserve">h</m:t>
+          </m:r>
+          <m:r>
+            <m:t xml:space="preserve">,</m:t>
+          </m:r>
+          <m:r>
+            <m:t xml:space="preserve">  </m:t>
+          </m:r>
+          <m:r>
+            <m:t xml:space="preserve">a</m:t>
+          </m:r>
+          <m:r>
+            <m:t xml:space="preserve">=</m:t>
+          </m:r>
+          <m:f>
+            <m:fPr>
+              <m:type m:val="bar"/>
+            </m:fPr>
+            <m:num>
+              <m:r>
+                <m:t xml:space="preserve">λ</m:t>
+              </m:r>
+            </m:num>
+            <m:den>
+              <m:sSub>
+                <m:e>
+                  <m:r>
+                    <m:t xml:space="preserve">H</m:t>
+                  </m:r>
+                </m:e>
+                <m:sub>
+                  <m:r>
+                    <m:t xml:space="preserve">v</m:t>
+                  </m:r>
+                </m:sub>
+              </m:sSub>
+            </m:den>
+          </m:f>
+          <m:r>
+            <m:t xml:space="preserve">     (2)</m:t>
+          </m:r>
+        </m:oMath>
+      </m:oMathPara>
+    </w:p>
+    <w:p>
+      <w:r>
+        <w:t xml:space="preserve">where ρ is the fluid density, C_D the stem drag coefficient, a the frontal area per unit volume, U the depth-averaged velocity, and h the flow depth. Four density levels were tested — none, low, medium, and high — with stem diameter and height held constant in the primary matrix. A secondary experiment varied stem diameter at fixed density to isolate its influence. The tested vegetation configurations are illustrated in Figure 2, and their geometric characteristics are compiled in Table 1. The staggered arrangement was chosen over an aligned grid because it produces a more spatially uniform drag distribution and avoids the preferential channeling that aligned arrays create between rows, which would confound the interpretation of the along-channel infiltration profile [25]. Stem height was selected so that the canopy transitioned from emergent at the lowest discharge to partially submerged at the highest, allowing the relative-submergence parameter to span a meaningful range within a single geometric configuration [26]. Only one geometric variable was changed at a time: the primary matrix varied density with fixed stem diameter and height, while the secondary diameter experiment held density constant and changed only the stem diameter, so that the frontal-area density and the individual element scale could be disentangled [21]. This deliberate restriction avoids the common pitfall of varying too many geometric factors simultaneously, which makes the resulting dataset difficult to attribute to any single cause [25].</w:t>
       </w:r>
     </w:p>
     <w:p/>
@@ -1720,7 +1936,365 @@
     </w:p>
     <w:p>
       <w:r>
-        <w:t xml:space="preserve">Four discharges were imposed, spanning emergent to partially submerged canopy conditions, at a fixed representative slope for the primary matrix, with slope varied in a supplementary series. For each run, flow depth was measured with point gauges at multiple stations, and depth-averaged velocity was obtained both from continuity and from an acoustic Doppler velocimeter traverse. Flow resistance was characterized through the reach-averaged energy slope, and the water-surface profile was recorded to confirm quasi-uniform conditions over the test reach [27]. The full set of hydraulic parameters and their ranges is given in Table 2. Quasi-uniform flow over the test reach was confirmed by requiring the measured water-surface slope to match the bed slope within a small tolerance and by checking that flow depth at successive stations varied by less than the point-gauge resolution [27]. Because the permeable section loses water to infiltration, a modest streamwise depth decline is unavoidable; runs were designed so that this decline remained small relative to the mean depth, and the reach-averaged depth was used to define the bulk hydraulic variables. Velocity obtained from continuity and from the acoustic Doppler traverse agreed within experimental scatter, providing an internal consistency check on the discharge and depth measurements [22]. The reach-averaged energy slope, combined with depth and velocity, characterized the bulk flow resistance and confirmed the expected increase in resistance with vegetation density [27].</w:t>
+        <w:t xml:space="preserve">Four discharges were imposed, spanning emergent to partially submerged canopy conditions, at a fixed representative slope for the primary matrix, with slope varied in a supplementary series. For each run, flow depth was measured with point gauges at multiple stations, and depth-averaged velocity was obtained both from continuity and from an acoustic Doppler velocimeter traverse. Flow resistance was characterized through the reach-averaged energy slope, and the water-surface profile was recorded to confirm quasi-uniform conditions over the test reach [27]. The depth-averaged streamwise momentum balance for steady flow over the permeable, vegetated reach was written as</w:t>
+      </w:r>
+    </w:p>
+    <w:p>
+      <w:pPr>
+        <w:jc w:val="center"/>
+      </w:pPr>
+      <m:oMathPara xmlns:m="http://schemas.openxmlformats.org/officeDocument/2006/math">
+        <m:oMath>
+          <m:r>
+            <m:t xml:space="preserve">ρ</m:t>
+          </m:r>
+          <m:r>
+            <m:t xml:space="preserve">U</m:t>
+          </m:r>
+          <m:f>
+            <m:fPr>
+              <m:type m:val="bar"/>
+            </m:fPr>
+            <m:num>
+              <m:r>
+                <m:t xml:space="preserve">d</m:t>
+              </m:r>
+              <m:r>
+                <m:t xml:space="preserve">U</m:t>
+              </m:r>
+            </m:num>
+            <m:den>
+              <m:r>
+                <m:t xml:space="preserve">d</m:t>
+              </m:r>
+              <m:r>
+                <m:t xml:space="preserve">x</m:t>
+              </m:r>
+            </m:den>
+          </m:f>
+          <m:r>
+            <m:t xml:space="preserve">=</m:t>
+          </m:r>
+          <m:r>
+            <m:t xml:space="preserve">ρ</m:t>
+          </m:r>
+          <m:r>
+            <m:t xml:space="preserve">g</m:t>
+          </m:r>
+          <m:r>
+            <m:t xml:space="preserve">(</m:t>
+          </m:r>
+          <m:sSub>
+            <m:e>
+              <m:r>
+                <m:t xml:space="preserve">S</m:t>
+              </m:r>
+            </m:e>
+            <m:sub>
+              <m:r>
+                <m:t xml:space="preserve">0</m:t>
+              </m:r>
+            </m:sub>
+          </m:sSub>
+          <m:r>
+            <m:t xml:space="preserve">-</m:t>
+          </m:r>
+          <m:sSub>
+            <m:e>
+              <m:r>
+                <m:t xml:space="preserve">S</m:t>
+              </m:r>
+            </m:e>
+            <m:sub>
+              <m:r>
+                <m:t xml:space="preserve">f</m:t>
+              </m:r>
+            </m:sub>
+          </m:sSub>
+          <m:r>
+            <m:t xml:space="preserve">)</m:t>
+          </m:r>
+          <m:r>
+            <m:t xml:space="preserve">-</m:t>
+          </m:r>
+          <m:f>
+            <m:fPr>
+              <m:type m:val="bar"/>
+            </m:fPr>
+            <m:num>
+              <m:sSub>
+                <m:e>
+                  <m:r>
+                    <m:t xml:space="preserve">F</m:t>
+                  </m:r>
+                </m:e>
+                <m:sub>
+                  <m:r>
+                    <m:t xml:space="preserve">D</m:t>
+                  </m:r>
+                </m:sub>
+              </m:sSub>
+            </m:num>
+            <m:den>
+              <m:r>
+                <m:t xml:space="preserve">h</m:t>
+              </m:r>
+            </m:den>
+          </m:f>
+          <m:r>
+            <m:t xml:space="preserve">-</m:t>
+          </m:r>
+          <m:f>
+            <m:fPr>
+              <m:type m:val="bar"/>
+            </m:fPr>
+            <m:num>
+              <m:r>
+                <m:t xml:space="preserve">ρ</m:t>
+              </m:r>
+              <m:sSub>
+                <m:e>
+                  <m:r>
+                    <m:t xml:space="preserve">f</m:t>
+                  </m:r>
+                </m:e>
+                <m:sub>
+                  <m:r>
+                    <m:t xml:space="preserve">i</m:t>
+                  </m:r>
+                  <m:r>
+                    <m:t xml:space="preserve">n</m:t>
+                  </m:r>
+                  <m:r>
+                    <m:t xml:space="preserve">f</m:t>
+                  </m:r>
+                </m:sub>
+              </m:sSub>
+              <m:r>
+                <m:t xml:space="preserve">U</m:t>
+              </m:r>
+            </m:num>
+            <m:den>
+              <m:r>
+                <m:t xml:space="preserve">h</m:t>
+              </m:r>
+            </m:den>
+          </m:f>
+          <m:r>
+            <m:t xml:space="preserve">     (3)</m:t>
+          </m:r>
+        </m:oMath>
+      </m:oMathPara>
+    </w:p>
+    <w:p>
+      <w:r>
+        <w:t xml:space="preserve">in which S_0 is the bed slope, S_f the friction slope, F_D the vegetation drag of Eq. (2), and the last term accounts for the momentum sink associated with the vertical infiltration flux f_inf leaving the channel through the bed. The bulk bed resistance was closed with a Manning–Strickler relation modified for the canopy,</w:t>
+      </w:r>
+    </w:p>
+    <w:p>
+      <w:pPr>
+        <w:jc w:val="center"/>
+      </w:pPr>
+      <m:oMathPara xmlns:m="http://schemas.openxmlformats.org/officeDocument/2006/math">
+        <m:oMath>
+          <m:sSub>
+            <m:e>
+              <m:r>
+                <m:t xml:space="preserve">S</m:t>
+              </m:r>
+            </m:e>
+            <m:sub>
+              <m:r>
+                <m:t xml:space="preserve">f</m:t>
+              </m:r>
+            </m:sub>
+          </m:sSub>
+          <m:r>
+            <m:t xml:space="preserve">=</m:t>
+          </m:r>
+          <m:f>
+            <m:fPr>
+              <m:type m:val="bar"/>
+            </m:fPr>
+            <m:num>
+              <m:sSubSup>
+                <m:e>
+                  <m:r>
+                    <m:t xml:space="preserve">n</m:t>
+                  </m:r>
+                </m:e>
+                <m:sub>
+                  <m:r>
+                    <m:t xml:space="preserve">e</m:t>
+                  </m:r>
+                </m:sub>
+                <m:sup>
+                  <m:r>
+                    <m:t xml:space="preserve">2</m:t>
+                  </m:r>
+                </m:sup>
+              </m:sSubSup>
+              <m:sSup>
+                <m:e>
+                  <m:r>
+                    <m:t xml:space="preserve">U</m:t>
+                  </m:r>
+                </m:e>
+                <m:sup>
+                  <m:r>
+                    <m:t xml:space="preserve">2</m:t>
+                  </m:r>
+                </m:sup>
+              </m:sSup>
+            </m:num>
+            <m:den>
+              <m:sSup>
+                <m:e>
+                  <m:r>
+                    <m:t xml:space="preserve">h</m:t>
+                  </m:r>
+                </m:e>
+                <m:sup>
+                  <m:r>
+                    <m:t xml:space="preserve">4</m:t>
+                  </m:r>
+                  <m:r>
+                    <m:t xml:space="preserve">/</m:t>
+                  </m:r>
+                  <m:r>
+                    <m:t xml:space="preserve">3</m:t>
+                  </m:r>
+                </m:sup>
+              </m:sSup>
+            </m:den>
+          </m:f>
+          <m:r>
+            <m:t xml:space="preserve">,</m:t>
+          </m:r>
+          <m:r>
+            <m:t xml:space="preserve">  </m:t>
+          </m:r>
+          <m:sSub>
+            <m:e>
+              <m:r>
+                <m:t xml:space="preserve">n</m:t>
+              </m:r>
+            </m:e>
+            <m:sub>
+              <m:r>
+                <m:t xml:space="preserve">e</m:t>
+              </m:r>
+            </m:sub>
+          </m:sSub>
+          <m:r>
+            <m:t xml:space="preserve">=</m:t>
+          </m:r>
+          <m:sSub>
+            <m:e>
+              <m:r>
+                <m:t xml:space="preserve">n</m:t>
+              </m:r>
+            </m:e>
+            <m:sub>
+              <m:r>
+                <m:t xml:space="preserve">b</m:t>
+              </m:r>
+            </m:sub>
+          </m:sSub>
+          <m:rad>
+            <m:radPr>
+              <m:degHide m:val="1"/>
+            </m:radPr>
+            <m:deg/>
+            <m:e>
+              <m:r>
+                <m:t xml:space="preserve">1</m:t>
+              </m:r>
+              <m:r>
+                <m:t xml:space="preserve">+</m:t>
+              </m:r>
+              <m:f>
+                <m:fPr>
+                  <m:type m:val="bar"/>
+                </m:fPr>
+                <m:num>
+                  <m:sSub>
+                    <m:e>
+                      <m:r>
+                        <m:t xml:space="preserve">C</m:t>
+                      </m:r>
+                    </m:e>
+                    <m:sub>
+                      <m:r>
+                        <m:t xml:space="preserve">D</m:t>
+                      </m:r>
+                    </m:sub>
+                  </m:sSub>
+                  <m:r>
+                    <m:t xml:space="preserve">a</m:t>
+                  </m:r>
+                  <m:r>
+                    <m:t xml:space="preserve">h</m:t>
+                  </m:r>
+                </m:num>
+                <m:den>
+                  <m:r>
+                    <m:t xml:space="preserve">2</m:t>
+                  </m:r>
+                  <m:r>
+                    <m:t xml:space="preserve">g</m:t>
+                  </m:r>
+                  <m:sSubSup>
+                    <m:e>
+                      <m:r>
+                        <m:t xml:space="preserve">n</m:t>
+                      </m:r>
+                    </m:e>
+                    <m:sub>
+                      <m:r>
+                        <m:t xml:space="preserve">b</m:t>
+                      </m:r>
+                    </m:sub>
+                    <m:sup>
+                      <m:r>
+                        <m:t xml:space="preserve">2</m:t>
+                      </m:r>
+                    </m:sup>
+                  </m:sSubSup>
+                  <m:sSup>
+                    <m:e>
+                      <m:r>
+                        <m:t xml:space="preserve">h</m:t>
+                      </m:r>
+                    </m:e>
+                    <m:sup>
+                      <m:r>
+                        <m:t xml:space="preserve">-</m:t>
+                      </m:r>
+                      <m:r>
+                        <m:t xml:space="preserve">1</m:t>
+                      </m:r>
+                      <m:r>
+                        <m:t xml:space="preserve">/</m:t>
+                      </m:r>
+                      <m:r>
+                        <m:t xml:space="preserve">3</m:t>
+                      </m:r>
+                    </m:sup>
+                  </m:sSup>
+                </m:den>
+              </m:f>
+            </m:e>
+          </m:rad>
+          <m:r>
+            <m:t xml:space="preserve">     (4)</m:t>
+          </m:r>
+        </m:oMath>
+      </m:oMathPara>
+    </w:p>
+    <w:p>
+      <w:r>
+        <w:t xml:space="preserve">where n_b is the bare-bed Manning coefficient and n_e the effective (vegetated) coefficient. The full set of hydraulic parameters and their ranges is given in Table 2. Quasi-uniform flow over the test reach was confirmed by requiring the measured water-surface slope to match the bed slope within a small tolerance and by checking that flow depth at successive stations varied by less than the point-gauge resolution [27]. Because the permeable section loses water to infiltration, a modest streamwise depth decline is unavoidable; runs were designed so that this decline remained small relative to the mean depth, and the reach-averaged depth was used to define the bulk hydraulic variables. Velocity obtained from continuity and from the acoustic Doppler traverse agreed within experimental scatter, providing an internal consistency check on the discharge and depth measurements [22]. The reach-averaged energy slope, combined with depth and velocity, characterized the bulk flow resistance and confirmed the expected increase in resistance with vegetation density [27].</w:t>
       </w:r>
     </w:p>
     <w:p/>
@@ -2829,17 +3403,210 @@
     </w:p>
     <w:p>
       <w:r>
-        <w:t xml:space="preserve">Antecedent moisture was set by saturating the bed and allowing gravity drainage to a target initial volumetric water content monitored by calibrated soil-moisture probes distributed through the pack. Three initial saturation ratios were established, expressed as</w:t>
-      </w:r>
-    </w:p>
-    <w:p>
-      <w:r>
-        <w:t xml:space="preserve">S_i = (θ_i − θ_r) / (θ_s − θ_r)</w:t>
-      </w:r>
-    </w:p>
-    <w:p>
-      <w:r>
-        <w:t xml:space="preserve">spanning relatively dry to relatively wet initial states [30]. Probe readings were checked immediately before flow initiation to confirm the target state, since antecedent moisture strongly conditions early-time infiltration and the resulting hydraulic gradient at the wetting front [31].</w:t>
+        <w:t xml:space="preserve">Antecedent moisture was set by saturating the bed and allowing gravity drainage to a target initial volumetric water content monitored by calibrated soil-moisture probes distributed through the pack. Three initial saturation ratios were established, expressed as the effective initial saturation,</w:t>
+      </w:r>
+    </w:p>
+    <w:p>
+      <w:pPr>
+        <w:jc w:val="center"/>
+      </w:pPr>
+      <m:oMathPara xmlns:m="http://schemas.openxmlformats.org/officeDocument/2006/math">
+        <m:oMath>
+          <m:sSub>
+            <m:e>
+              <m:r>
+                <m:t xml:space="preserve">S</m:t>
+              </m:r>
+            </m:e>
+            <m:sub>
+              <m:r>
+                <m:t xml:space="preserve">i</m:t>
+              </m:r>
+            </m:sub>
+          </m:sSub>
+          <m:r>
+            <m:t xml:space="preserve">=</m:t>
+          </m:r>
+          <m:f>
+            <m:fPr>
+              <m:type m:val="bar"/>
+            </m:fPr>
+            <m:num>
+              <m:sSub>
+                <m:e>
+                  <m:r>
+                    <m:t xml:space="preserve">θ</m:t>
+                  </m:r>
+                </m:e>
+                <m:sub>
+                  <m:r>
+                    <m:t xml:space="preserve">i</m:t>
+                  </m:r>
+                </m:sub>
+              </m:sSub>
+              <m:r>
+                <m:t xml:space="preserve">-</m:t>
+              </m:r>
+              <m:sSub>
+                <m:e>
+                  <m:r>
+                    <m:t xml:space="preserve">θ</m:t>
+                  </m:r>
+                </m:e>
+                <m:sub>
+                  <m:r>
+                    <m:t xml:space="preserve">r</m:t>
+                  </m:r>
+                </m:sub>
+              </m:sSub>
+            </m:num>
+            <m:den>
+              <m:sSub>
+                <m:e>
+                  <m:r>
+                    <m:t xml:space="preserve">θ</m:t>
+                  </m:r>
+                </m:e>
+                <m:sub>
+                  <m:r>
+                    <m:t xml:space="preserve">s</m:t>
+                  </m:r>
+                </m:sub>
+              </m:sSub>
+              <m:r>
+                <m:t xml:space="preserve">-</m:t>
+              </m:r>
+              <m:sSub>
+                <m:e>
+                  <m:r>
+                    <m:t xml:space="preserve">θ</m:t>
+                  </m:r>
+                </m:e>
+                <m:sub>
+                  <m:r>
+                    <m:t xml:space="preserve">r</m:t>
+                  </m:r>
+                </m:sub>
+              </m:sSub>
+            </m:den>
+          </m:f>
+          <m:r>
+            <m:t xml:space="preserve">,</m:t>
+          </m:r>
+          <m:r>
+            <m:t xml:space="preserve">  </m:t>
+          </m:r>
+          <m:r>
+            <m:t xml:space="preserve">Δ</m:t>
+          </m:r>
+          <m:r>
+            <m:t xml:space="preserve">θ</m:t>
+          </m:r>
+          <m:r>
+            <m:t xml:space="preserve">=</m:t>
+          </m:r>
+          <m:r>
+            <m:t xml:space="preserve">(</m:t>
+          </m:r>
+          <m:sSub>
+            <m:e>
+              <m:r>
+                <m:t xml:space="preserve">θ</m:t>
+              </m:r>
+            </m:e>
+            <m:sub>
+              <m:r>
+                <m:t xml:space="preserve">s</m:t>
+              </m:r>
+            </m:sub>
+          </m:sSub>
+          <m:r>
+            <m:t xml:space="preserve">-</m:t>
+          </m:r>
+          <m:sSub>
+            <m:e>
+              <m:r>
+                <m:t xml:space="preserve">θ</m:t>
+              </m:r>
+            </m:e>
+            <m:sub>
+              <m:r>
+                <m:t xml:space="preserve">i</m:t>
+              </m:r>
+            </m:sub>
+          </m:sSub>
+          <m:r>
+            <m:t xml:space="preserve">)</m:t>
+          </m:r>
+          <m:r>
+            <m:t xml:space="preserve">=</m:t>
+          </m:r>
+          <m:r>
+            <m:t xml:space="preserve">(</m:t>
+          </m:r>
+          <m:r>
+            <m:t xml:space="preserve">1</m:t>
+          </m:r>
+          <m:r>
+            <m:t xml:space="preserve">-</m:t>
+          </m:r>
+          <m:sSub>
+            <m:e>
+              <m:r>
+                <m:t xml:space="preserve">S</m:t>
+              </m:r>
+            </m:e>
+            <m:sub>
+              <m:r>
+                <m:t xml:space="preserve">i</m:t>
+              </m:r>
+            </m:sub>
+          </m:sSub>
+          <m:r>
+            <m:t xml:space="preserve">)</m:t>
+          </m:r>
+          <m:r>
+            <m:t xml:space="preserve">(</m:t>
+          </m:r>
+          <m:sSub>
+            <m:e>
+              <m:r>
+                <m:t xml:space="preserve">θ</m:t>
+              </m:r>
+            </m:e>
+            <m:sub>
+              <m:r>
+                <m:t xml:space="preserve">s</m:t>
+              </m:r>
+            </m:sub>
+          </m:sSub>
+          <m:r>
+            <m:t xml:space="preserve">-</m:t>
+          </m:r>
+          <m:sSub>
+            <m:e>
+              <m:r>
+                <m:t xml:space="preserve">θ</m:t>
+              </m:r>
+            </m:e>
+            <m:sub>
+              <m:r>
+                <m:t xml:space="preserve">r</m:t>
+              </m:r>
+            </m:sub>
+          </m:sSub>
+          <m:r>
+            <m:t xml:space="preserve">)</m:t>
+          </m:r>
+          <m:r>
+            <m:t xml:space="preserve">     (5)</m:t>
+          </m:r>
+        </m:oMath>
+      </m:oMathPara>
+    </w:p>
+    <w:p>
+      <w:r>
+        <w:t xml:space="preserve">where θ_i, θ_r, and θ_s are the initial, residual, and saturated volumetric water contents and Δθ is the initial moisture deficit that scales the storable volume ahead of the wetting front, spanning relatively dry to relatively wet initial states [30]. Probe readings were checked immediately before flow initiation to confirm the target state, since antecedent moisture strongly conditions early-time infiltration and the resulting hydraulic gradient at the wetting front [31].</w:t>
       </w:r>
     </w:p>
     <w:p>
@@ -2861,13 +3628,387 @@
       </w:r>
     </w:p>
     <w:p>
-      <w:r>
-        <w:t xml:space="preserve">f(t) = (1/A_b)·dV_inf/dt   and   F(t) = V_inf / A_b</w:t>
-      </w:r>
-    </w:p>
-    <w:p>
-      <w:r>
-        <w:t xml:space="preserve">where V_inf is the infiltrated volume and A_b the wetted bed area [32]. Reservoir mass was logged continuously by load cells, and the along-channel distribution f_x(x) was reconstructed from the individual cell fluxes, dividing the reach into upstream, vegetation, and downstream zones. This spatially resolved measurement distinguishes uniform enhancement from localized infiltration hotspots, a distinction rarely accessible from reach-integrated losses alone [33]. Load-cell reservoirs were tared before each run and logged at a fixed interval; the instantaneous rate was obtained by numerical differentiation of the accumulated-mass record after light smoothing to suppress differentiation noise, and the cumulative infiltration was taken directly from the accumulated mass divided by the contributing bed area [32]. The reach was partitioned into an upstream approach zone, the vegetation zone, and a downstream recovery zone, and the cell fluxes within each zone were aggregated to construct the along-channel profile f_x(x). Comparing the zone-resolved fluxes against the reach-integrated total provided a mass-balance closure check: the sum of the cell fluxes agreed with an independent measurement of the difference between inflow and outflow discharge within the combined uncertainty, confirming that the collection system captured essentially all of the infiltrated water [33].</w:t>
+      <w:pPr>
+        <w:jc w:val="center"/>
+      </w:pPr>
+      <m:oMathPara xmlns:m="http://schemas.openxmlformats.org/officeDocument/2006/math">
+        <m:oMath>
+          <m:r>
+            <m:t xml:space="preserve">f</m:t>
+          </m:r>
+          <m:r>
+            <m:t xml:space="preserve">(</m:t>
+          </m:r>
+          <m:r>
+            <m:t xml:space="preserve">t</m:t>
+          </m:r>
+          <m:r>
+            <m:t xml:space="preserve">)</m:t>
+          </m:r>
+          <m:r>
+            <m:t xml:space="preserve">=</m:t>
+          </m:r>
+          <m:f>
+            <m:fPr>
+              <m:type m:val="bar"/>
+            </m:fPr>
+            <m:num>
+              <m:r>
+                <m:t xml:space="preserve">1</m:t>
+              </m:r>
+            </m:num>
+            <m:den>
+              <m:sSub>
+                <m:e>
+                  <m:r>
+                    <m:t xml:space="preserve">A</m:t>
+                  </m:r>
+                </m:e>
+                <m:sub>
+                  <m:r>
+                    <m:t xml:space="preserve">b</m:t>
+                  </m:r>
+                </m:sub>
+              </m:sSub>
+            </m:den>
+          </m:f>
+          <m:f>
+            <m:fPr>
+              <m:type m:val="bar"/>
+            </m:fPr>
+            <m:num>
+              <m:r>
+                <m:t xml:space="preserve">d</m:t>
+              </m:r>
+              <m:sSub>
+                <m:e>
+                  <m:r>
+                    <m:t xml:space="preserve">V</m:t>
+                  </m:r>
+                </m:e>
+                <m:sub>
+                  <m:r>
+                    <m:t xml:space="preserve">i</m:t>
+                  </m:r>
+                  <m:r>
+                    <m:t xml:space="preserve">n</m:t>
+                  </m:r>
+                  <m:r>
+                    <m:t xml:space="preserve">f</m:t>
+                  </m:r>
+                </m:sub>
+              </m:sSub>
+            </m:num>
+            <m:den>
+              <m:r>
+                <m:t xml:space="preserve">d</m:t>
+              </m:r>
+              <m:r>
+                <m:t xml:space="preserve">t</m:t>
+              </m:r>
+            </m:den>
+          </m:f>
+          <m:r>
+            <m:t xml:space="preserve">     (6)</m:t>
+          </m:r>
+        </m:oMath>
+      </m:oMathPara>
+    </w:p>
+    <w:p>
+      <w:pPr>
+        <w:jc w:val="center"/>
+      </w:pPr>
+      <m:oMathPara xmlns:m="http://schemas.openxmlformats.org/officeDocument/2006/math">
+        <m:oMath>
+          <m:r>
+            <m:t xml:space="preserve">F</m:t>
+          </m:r>
+          <m:r>
+            <m:t xml:space="preserve">(</m:t>
+          </m:r>
+          <m:r>
+            <m:t xml:space="preserve">t</m:t>
+          </m:r>
+          <m:r>
+            <m:t xml:space="preserve">)</m:t>
+          </m:r>
+          <m:r>
+            <m:t xml:space="preserve">=</m:t>
+          </m:r>
+          <m:f>
+            <m:fPr>
+              <m:type m:val="bar"/>
+            </m:fPr>
+            <m:num>
+              <m:sSub>
+                <m:e>
+                  <m:r>
+                    <m:t xml:space="preserve">V</m:t>
+                  </m:r>
+                </m:e>
+                <m:sub>
+                  <m:r>
+                    <m:t xml:space="preserve">i</m:t>
+                  </m:r>
+                  <m:r>
+                    <m:t xml:space="preserve">n</m:t>
+                  </m:r>
+                  <m:r>
+                    <m:t xml:space="preserve">f</m:t>
+                  </m:r>
+                </m:sub>
+              </m:sSub>
+            </m:num>
+            <m:den>
+              <m:sSub>
+                <m:e>
+                  <m:r>
+                    <m:t xml:space="preserve">A</m:t>
+                  </m:r>
+                </m:e>
+                <m:sub>
+                  <m:r>
+                    <m:t xml:space="preserve">b</m:t>
+                  </m:r>
+                </m:sub>
+              </m:sSub>
+            </m:den>
+          </m:f>
+          <m:r>
+            <m:t xml:space="preserve">=</m:t>
+          </m:r>
+          <m:nary>
+            <m:naryPr>
+              <m:chr m:val="∫"/>
+              <m:limLoc m:val="subSup"/>
+            </m:naryPr>
+            <m:sub>
+              <m:r>
+                <m:t xml:space="preserve">0</m:t>
+              </m:r>
+            </m:sub>
+            <m:sup>
+              <m:r>
+                <m:t xml:space="preserve">t</m:t>
+              </m:r>
+            </m:sup>
+            <m:e>
+              <m:r>
+                <m:t xml:space="preserve">f</m:t>
+              </m:r>
+            </m:e>
+            %s
+          </m:nary>
+          <m:r>
+            <m:t xml:space="preserve">(</m:t>
+          </m:r>
+          <m:r>
+            <m:t xml:space="preserve">τ</m:t>
+          </m:r>
+          <m:r>
+            <m:t xml:space="preserve">)</m:t>
+          </m:r>
+          <m:r>
+            <m:t xml:space="preserve">d</m:t>
+          </m:r>
+          <m:r>
+            <m:t xml:space="preserve">τ</m:t>
+          </m:r>
+          <m:r>
+            <m:t xml:space="preserve">     (7)</m:t>
+          </m:r>
+        </m:oMath>
+      </m:oMathPara>
+    </w:p>
+    <w:p>
+      <w:r>
+        <w:t xml:space="preserve">where V_inf is the infiltrated volume and A_b the wetted bed area [32]. The along-channel infiltration profile was reconstructed from the individual cell fluxes as</w:t>
+      </w:r>
+    </w:p>
+    <w:p>
+      <w:pPr>
+        <w:jc w:val="center"/>
+      </w:pPr>
+      <m:oMathPara xmlns:m="http://schemas.openxmlformats.org/officeDocument/2006/math">
+        <m:oMath>
+          <m:sSub>
+            <m:e>
+              <m:r>
+                <m:t xml:space="preserve">f</m:t>
+              </m:r>
+            </m:e>
+            <m:sub>
+              <m:r>
+                <m:t xml:space="preserve">x</m:t>
+              </m:r>
+            </m:sub>
+          </m:sSub>
+          <m:r>
+            <m:t xml:space="preserve">(</m:t>
+          </m:r>
+          <m:sSub>
+            <m:e>
+              <m:r>
+                <m:t xml:space="preserve">x</m:t>
+              </m:r>
+            </m:e>
+            <m:sub>
+              <m:r>
+                <m:t xml:space="preserve">j</m:t>
+              </m:r>
+            </m:sub>
+          </m:sSub>
+          <m:r>
+            <m:t xml:space="preserve">)</m:t>
+          </m:r>
+          <m:r>
+            <m:t xml:space="preserve">=</m:t>
+          </m:r>
+          <m:f>
+            <m:fPr>
+              <m:type m:val="bar"/>
+            </m:fPr>
+            <m:num>
+              <m:r>
+                <m:t xml:space="preserve">1</m:t>
+              </m:r>
+            </m:num>
+            <m:den>
+              <m:r>
+                <m:t xml:space="preserve">w</m:t>
+              </m:r>
+              <m:r>
+                <m:t xml:space="preserve">Δ</m:t>
+              </m:r>
+              <m:sSub>
+                <m:e>
+                  <m:r>
+                    <m:t xml:space="preserve">x</m:t>
+                  </m:r>
+                </m:e>
+                <m:sub>
+                  <m:r>
+                    <m:t xml:space="preserve">j</m:t>
+                  </m:r>
+                </m:sub>
+              </m:sSub>
+            </m:den>
+          </m:f>
+          <m:f>
+            <m:fPr>
+              <m:type m:val="bar"/>
+            </m:fPr>
+            <m:num>
+              <m:r>
+                <m:t xml:space="preserve">d</m:t>
+              </m:r>
+              <m:sSub>
+                <m:e>
+                  <m:r>
+                    <m:t xml:space="preserve">V</m:t>
+                  </m:r>
+                </m:e>
+                <m:sub>
+                  <m:r>
+                    <m:t xml:space="preserve">j</m:t>
+                  </m:r>
+                </m:sub>
+              </m:sSub>
+            </m:num>
+            <m:den>
+              <m:r>
+                <m:t xml:space="preserve">d</m:t>
+              </m:r>
+              <m:r>
+                <m:t xml:space="preserve">t</m:t>
+              </m:r>
+            </m:den>
+          </m:f>
+          <m:r>
+            <m:t xml:space="preserve">,</m:t>
+          </m:r>
+          <m:r>
+            <m:t xml:space="preserve">  </m:t>
+          </m:r>
+          <m:r>
+            <m:t xml:space="preserve">bar</m:t>
+          </m:r>
+          <m:r>
+            <m:t xml:space="preserve">f</m:t>
+          </m:r>
+          <m:r>
+            <m:t xml:space="preserve">=</m:t>
+          </m:r>
+          <m:f>
+            <m:fPr>
+              <m:type m:val="bar"/>
+            </m:fPr>
+            <m:num>
+              <m:r>
+                <m:t xml:space="preserve">1</m:t>
+              </m:r>
+            </m:num>
+            <m:den>
+              <m:r>
+                <m:t xml:space="preserve">L</m:t>
+              </m:r>
+            </m:den>
+          </m:f>
+          <m:sSub>
+            <m:e>
+              <m:nary>
+                <m:naryPr>
+                  <m:chr m:val="∫"/>
+                  <m:limLoc m:val="subSup"/>
+                </m:naryPr>
+                <m:sub>
+                  <m:r>
+                    <m:t xml:space="preserve">0</m:t>
+                  </m:r>
+                </m:sub>
+                <m:sup>
+                  <m:r>
+                    <m:t xml:space="preserve">L</m:t>
+                  </m:r>
+                </m:sup>
+                <m:e>
+                  <m:r>
+                    <m:t xml:space="preserve">f</m:t>
+                  </m:r>
+                </m:e>
+                %s
+              </m:nary>
+            </m:e>
+            <m:sub>
+              <m:r>
+                <m:t xml:space="preserve">x</m:t>
+              </m:r>
+            </m:sub>
+          </m:sSub>
+          <m:r>
+            <m:t xml:space="preserve">(</m:t>
+          </m:r>
+          <m:r>
+            <m:t xml:space="preserve">x</m:t>
+          </m:r>
+          <m:r>
+            <m:t xml:space="preserve">)</m:t>
+          </m:r>
+          <m:r>
+            <m:t xml:space="preserve">d</m:t>
+          </m:r>
+          <m:r>
+            <m:t xml:space="preserve">x</m:t>
+          </m:r>
+          <m:r>
+            <m:t xml:space="preserve">     (8)</m:t>
+          </m:r>
+        </m:oMath>
+      </m:oMathPara>
+    </w:p>
+    <w:p>
+      <w:r>
+        <w:t xml:space="preserve">where V_j is the volume collected beneath cell j of streamwise length Δx_j, w is the channel width, L the reach length, and f̄ the reach-averaged infiltration. Reservoir mass was logged continuously by load cells, and the along-channel distribution f_x(x) was reconstructed from the individual cell fluxes, dividing the reach into upstream, vegetation, and downstream zones. This spatially resolved measurement distinguishes uniform enhancement from localized infiltration hotspots, a distinction rarely accessible from reach-integrated losses alone [33]. Load-cell reservoirs were tared before each run and logged at a fixed interval; the instantaneous rate was obtained by numerical differentiation of the accumulated-mass record after light smoothing to suppress differentiation noise, and the cumulative infiltration was taken directly from the accumulated mass divided by the contributing bed area [32]. The reach was partitioned into an upstream approach zone, the vegetation zone, and a downstream recovery zone, and the cell fluxes within each zone were aggregated to construct the along-channel profile f_x(x). Comparing the zone-resolved fluxes against the reach-integrated total provided a mass-balance closure check: the sum of the cell fluxes agreed with an independent measurement of the difference between inflow and outflow discharge within the combined uncertainty, confirming that the collection system captured essentially all of the infiltrated water [33].</w:t>
       </w:r>
     </w:p>
     <w:p>
@@ -4578,7 +5719,891 @@
     </w:p>
     <w:p>
       <w:r>
-        <w:t xml:space="preserve">The coupled system was framed as a cascade: open-channel flow supplies momentum that vegetation partly extracts as drag; the resulting near-bed velocity and pressure field sets the head distribution at the bed; and this head drives unsaturated-to-saturated infiltration through the permeable pack, integrated in time to cumulative infiltration [36]. For the porous medium, Darcy–Richards concepts provide the physical basis, while a Green–Ampt formulation, in which infiltration depends on saturated conductivity, wetting-front suction, and the initial moisture deficit, serves as a mechanistic benchmark [37]. Vegetation drag was represented through the frontal-area density λ, linking the hydraulic and subsurface descriptions within a single conceptual chain (Figure 1). In the Green–Ampt benchmark, the driving head at the bed was set from the measured local flow depth and dynamic pressure rather than assumed constant, so that the vegetation-induced modification of the surface forcing entered the subsurface model through a physically meaningful boundary condition [37]. The wetting-front suction and the initial moisture deficit were derived from the measured soil hydraulic properties and the prescribed antecedent state, keeping the benchmark parameter-parsimonious and physically interpretable [14]. This formulation makes explicit why the benchmark, despite its physical grounding, is expected to under-represent the vegetation effect: it captures the head-driven part of the response but not the additional near-bed pressure redistribution and turbulence generated by the stems, which the full coupled system produces [36]. The gap between the benchmark and the observations therefore quantifies the specifically hydrodynamic contribution of vegetation to infiltration.</w:t>
+        <w:t xml:space="preserve">The coupled system was framed as a cascade: open-channel flow supplies momentum that vegetation partly extracts as drag; the resulting near-bed velocity and pressure field sets the head distribution at the bed; and this head drives unsaturated-to-saturated infiltration through the permeable pack, integrated in time to cumulative infiltration [36]. For the porous medium, Darcy–Richards concepts provide the physical basis. Vertical flux through the saturated part of the bed obeys Darcy's law,</w:t>
+      </w:r>
+    </w:p>
+    <w:p>
+      <w:pPr>
+        <w:jc w:val="center"/>
+      </w:pPr>
+      <m:oMathPara xmlns:m="http://schemas.openxmlformats.org/officeDocument/2006/math">
+        <m:oMath>
+          <m:r>
+            <m:t xml:space="preserve">q</m:t>
+          </m:r>
+          <m:r>
+            <m:t xml:space="preserve">=</m:t>
+          </m:r>
+          <m:r>
+            <m:t xml:space="preserve">-</m:t>
+          </m:r>
+          <m:sSub>
+            <m:e>
+              <m:r>
+                <m:t xml:space="preserve">K</m:t>
+              </m:r>
+            </m:e>
+            <m:sub>
+              <m:r>
+                <m:t xml:space="preserve">s</m:t>
+              </m:r>
+            </m:sub>
+          </m:sSub>
+          <m:f>
+            <m:fPr>
+              <m:type m:val="bar"/>
+            </m:fPr>
+            <m:num>
+              <m:r>
+                <m:t xml:space="preserve">∂</m:t>
+              </m:r>
+              <m:r>
+                <m:t xml:space="preserve">H</m:t>
+              </m:r>
+            </m:num>
+            <m:den>
+              <m:r>
+                <m:t xml:space="preserve">∂</m:t>
+              </m:r>
+              <m:r>
+                <m:t xml:space="preserve">z</m:t>
+              </m:r>
+            </m:den>
+          </m:f>
+          <m:r>
+            <m:t xml:space="preserve">=</m:t>
+          </m:r>
+          <m:sSub>
+            <m:e>
+              <m:r>
+                <m:t xml:space="preserve">K</m:t>
+              </m:r>
+            </m:e>
+            <m:sub>
+              <m:r>
+                <m:t xml:space="preserve">s</m:t>
+              </m:r>
+            </m:sub>
+          </m:sSub>
+          <m:f>
+            <m:fPr>
+              <m:type m:val="bar"/>
+            </m:fPr>
+            <m:num>
+              <m:sSub>
+                <m:e>
+                  <m:r>
+                    <m:t xml:space="preserve">H</m:t>
+                  </m:r>
+                </m:e>
+                <m:sub>
+                  <m:r>
+                    <m:t xml:space="preserve">b</m:t>
+                  </m:r>
+                  <m:r>
+                    <m:t xml:space="preserve">e</m:t>
+                  </m:r>
+                  <m:r>
+                    <m:t xml:space="preserve">d</m:t>
+                  </m:r>
+                </m:sub>
+              </m:sSub>
+              <m:r>
+                <m:t xml:space="preserve">+</m:t>
+              </m:r>
+              <m:sSub>
+                <m:e>
+                  <m:r>
+                    <m:t xml:space="preserve">z</m:t>
+                  </m:r>
+                </m:e>
+                <m:sub>
+                  <m:r>
+                    <m:t xml:space="preserve">f</m:t>
+                  </m:r>
+                </m:sub>
+              </m:sSub>
+              <m:r>
+                <m:t xml:space="preserve">+</m:t>
+              </m:r>
+              <m:sSub>
+                <m:e>
+                  <m:r>
+                    <m:t xml:space="preserve">ψ</m:t>
+                  </m:r>
+                </m:e>
+                <m:sub>
+                  <m:r>
+                    <m:t xml:space="preserve">f</m:t>
+                  </m:r>
+                </m:sub>
+              </m:sSub>
+            </m:num>
+            <m:den>
+              <m:sSub>
+                <m:e>
+                  <m:r>
+                    <m:t xml:space="preserve">z</m:t>
+                  </m:r>
+                </m:e>
+                <m:sub>
+                  <m:r>
+                    <m:t xml:space="preserve">f</m:t>
+                  </m:r>
+                </m:sub>
+              </m:sSub>
+            </m:den>
+          </m:f>
+          <m:r>
+            <m:t xml:space="preserve">     (9)</m:t>
+          </m:r>
+        </m:oMath>
+      </m:oMathPara>
+    </w:p>
+    <w:p>
+      <w:r>
+        <w:t xml:space="preserve">where H is total head, z the vertical coordinate, K_s the saturated conductivity, H_bed the head imposed at the bed surface, z_f the wetting-front depth, and ψ_f the wetting-front suction. In the unsaturated zone the transient is governed by the mixed-form Richards equation,</w:t>
+      </w:r>
+    </w:p>
+    <w:p>
+      <w:pPr>
+        <w:jc w:val="center"/>
+      </w:pPr>
+      <m:oMathPara xmlns:m="http://schemas.openxmlformats.org/officeDocument/2006/math">
+        <m:oMath>
+          <m:f>
+            <m:fPr>
+              <m:type m:val="bar"/>
+            </m:fPr>
+            <m:num>
+              <m:r>
+                <m:t xml:space="preserve">∂</m:t>
+              </m:r>
+              <m:r>
+                <m:t xml:space="preserve">θ</m:t>
+              </m:r>
+            </m:num>
+            <m:den>
+              <m:r>
+                <m:t xml:space="preserve">∂</m:t>
+              </m:r>
+              <m:r>
+                <m:t xml:space="preserve">t</m:t>
+              </m:r>
+            </m:den>
+          </m:f>
+          <m:r>
+            <m:t xml:space="preserve">=</m:t>
+          </m:r>
+          <m:f>
+            <m:fPr>
+              <m:type m:val="bar"/>
+            </m:fPr>
+            <m:num>
+              <m:r>
+                <m:t xml:space="preserve">∂</m:t>
+              </m:r>
+            </m:num>
+            <m:den>
+              <m:r>
+                <m:t xml:space="preserve">∂</m:t>
+              </m:r>
+              <m:r>
+                <m:t xml:space="preserve">z</m:t>
+              </m:r>
+            </m:den>
+          </m:f>
+          <m:r>
+            <m:t xml:space="preserve">[</m:t>
+          </m:r>
+          <m:r>
+            <m:t xml:space="preserve">K</m:t>
+          </m:r>
+          <m:r>
+            <m:t xml:space="preserve">(</m:t>
+          </m:r>
+          <m:r>
+            <m:t xml:space="preserve">θ</m:t>
+          </m:r>
+          <m:r>
+            <m:t xml:space="preserve">)</m:t>
+          </m:r>
+          <m:r>
+            <m:t xml:space="preserve">(</m:t>
+          </m:r>
+          <m:f>
+            <m:fPr>
+              <m:type m:val="bar"/>
+            </m:fPr>
+            <m:num>
+              <m:r>
+                <m:t xml:space="preserve">∂</m:t>
+              </m:r>
+              <m:r>
+                <m:t xml:space="preserve">ψ</m:t>
+              </m:r>
+            </m:num>
+            <m:den>
+              <m:r>
+                <m:t xml:space="preserve">∂</m:t>
+              </m:r>
+              <m:r>
+                <m:t xml:space="preserve">z</m:t>
+              </m:r>
+            </m:den>
+          </m:f>
+          <m:r>
+            <m:t xml:space="preserve">+</m:t>
+          </m:r>
+          <m:r>
+            <m:t xml:space="preserve">1</m:t>
+          </m:r>
+          <m:r>
+            <m:t xml:space="preserve">)</m:t>
+          </m:r>
+          <m:r>
+            <m:t xml:space="preserve">]</m:t>
+          </m:r>
+          <m:r>
+            <m:t xml:space="preserve">     (10)</m:t>
+          </m:r>
+        </m:oMath>
+      </m:oMathPara>
+    </w:p>
+    <w:p>
+      <w:r>
+        <w:t xml:space="preserve">with the unsaturated conductivity and retention closed by the van Genuchten–Mualem relations,</w:t>
+      </w:r>
+    </w:p>
+    <w:p>
+      <w:pPr>
+        <w:jc w:val="center"/>
+      </w:pPr>
+      <m:oMathPara xmlns:m="http://schemas.openxmlformats.org/officeDocument/2006/math">
+        <m:oMath>
+          <m:r>
+            <m:t xml:space="preserve">K</m:t>
+          </m:r>
+          <m:r>
+            <m:t xml:space="preserve">(</m:t>
+          </m:r>
+          <m:r>
+            <m:t xml:space="preserve">θ</m:t>
+          </m:r>
+          <m:r>
+            <m:t xml:space="preserve">)</m:t>
+          </m:r>
+          <m:r>
+            <m:t xml:space="preserve">=</m:t>
+          </m:r>
+          <m:sSub>
+            <m:e>
+              <m:r>
+                <m:t xml:space="preserve">K</m:t>
+              </m:r>
+            </m:e>
+            <m:sub>
+              <m:r>
+                <m:t xml:space="preserve">s</m:t>
+              </m:r>
+            </m:sub>
+          </m:sSub>
+          <m:sSubSup>
+            <m:e>
+              <m:r>
+                <m:t xml:space="preserve">S</m:t>
+              </m:r>
+            </m:e>
+            <m:sub>
+              <m:r>
+                <m:t xml:space="preserve">e</m:t>
+              </m:r>
+            </m:sub>
+            <m:sup>
+              <m:r>
+                <m:t xml:space="preserve">l</m:t>
+              </m:r>
+            </m:sup>
+          </m:sSubSup>
+          <m:r>
+            <m:t xml:space="preserve">[</m:t>
+          </m:r>
+          <m:r>
+            <m:t xml:space="preserve">1</m:t>
+          </m:r>
+          <m:r>
+            <m:t xml:space="preserve">-</m:t>
+          </m:r>
+          <m:r>
+            <m:t xml:space="preserve">(</m:t>
+          </m:r>
+          <m:r>
+            <m:t xml:space="preserve">1</m:t>
+          </m:r>
+          <m:r>
+            <m:t xml:space="preserve">-</m:t>
+          </m:r>
+          <m:sSubSup>
+            <m:e>
+              <m:r>
+                <m:t xml:space="preserve">S</m:t>
+              </m:r>
+            </m:e>
+            <m:sub>
+              <m:r>
+                <m:t xml:space="preserve">e</m:t>
+              </m:r>
+            </m:sub>
+            <m:sup>
+              <m:r>
+                <m:t xml:space="preserve">1</m:t>
+              </m:r>
+              <m:r>
+                <m:t xml:space="preserve">/</m:t>
+              </m:r>
+              <m:r>
+                <m:t xml:space="preserve">m</m:t>
+              </m:r>
+            </m:sup>
+          </m:sSubSup>
+          <m:sSup>
+            <m:e>
+              <m:r>
+                <m:t xml:space="preserve">)</m:t>
+              </m:r>
+            </m:e>
+            <m:sup>
+              <m:r>
+                <m:t xml:space="preserve">m</m:t>
+              </m:r>
+            </m:sup>
+          </m:sSup>
+          <m:sSup>
+            <m:e>
+              <m:r>
+                <m:t xml:space="preserve">]</m:t>
+              </m:r>
+            </m:e>
+            <m:sup>
+              <m:r>
+                <m:t xml:space="preserve">2</m:t>
+              </m:r>
+            </m:sup>
+          </m:sSup>
+          <m:r>
+            <m:t xml:space="preserve">,</m:t>
+          </m:r>
+          <m:r>
+            <m:t xml:space="preserve">  </m:t>
+          </m:r>
+          <m:sSub>
+            <m:e>
+              <m:r>
+                <m:t xml:space="preserve">S</m:t>
+              </m:r>
+            </m:e>
+            <m:sub>
+              <m:r>
+                <m:t xml:space="preserve">e</m:t>
+              </m:r>
+            </m:sub>
+          </m:sSub>
+          <m:r>
+            <m:t xml:space="preserve">=</m:t>
+          </m:r>
+          <m:r>
+            <m:t xml:space="preserve">[</m:t>
+          </m:r>
+          <m:r>
+            <m:t xml:space="preserve">1</m:t>
+          </m:r>
+          <m:r>
+            <m:t xml:space="preserve">+</m:t>
+          </m:r>
+          <m:r>
+            <m:t xml:space="preserve">(</m:t>
+          </m:r>
+          <m:r>
+            <m:t xml:space="preserve">α</m:t>
+          </m:r>
+          <m:r>
+            <m:t xml:space="preserve">|</m:t>
+          </m:r>
+          <m:r>
+            <m:t xml:space="preserve">ψ</m:t>
+          </m:r>
+          <m:r>
+            <m:t xml:space="preserve">|</m:t>
+          </m:r>
+          <m:sSup>
+            <m:e>
+              <m:r>
+                <m:t xml:space="preserve">)</m:t>
+              </m:r>
+            </m:e>
+            <m:sup>
+              <m:r>
+                <m:t xml:space="preserve">n</m:t>
+              </m:r>
+            </m:sup>
+          </m:sSup>
+          <m:sSup>
+            <m:e>
+              <m:r>
+                <m:t xml:space="preserve">]</m:t>
+              </m:r>
+            </m:e>
+            <m:sup>
+              <m:r>
+                <m:t xml:space="preserve">-</m:t>
+              </m:r>
+              <m:r>
+                <m:t xml:space="preserve">m</m:t>
+              </m:r>
+            </m:sup>
+          </m:sSup>
+          <m:r>
+            <m:t xml:space="preserve">     (11)</m:t>
+          </m:r>
+        </m:oMath>
+      </m:oMathPara>
+    </w:p>
+    <w:p>
+      <w:r>
+        <w:t xml:space="preserve">where S_e is effective saturation, l a pore-connectivity parameter, and α, n, m = 1 − 1/n the van Genuchten parameters. The head available to drive infiltration at the bed is set by the overlying flow as the sum of the static depth and a dynamic pressure contribution,</w:t>
+      </w:r>
+    </w:p>
+    <w:p>
+      <w:pPr>
+        <w:jc w:val="center"/>
+      </w:pPr>
+      <m:oMathPara xmlns:m="http://schemas.openxmlformats.org/officeDocument/2006/math">
+        <m:oMath>
+          <m:sSub>
+            <m:e>
+              <m:r>
+                <m:t xml:space="preserve">H</m:t>
+              </m:r>
+            </m:e>
+            <m:sub>
+              <m:r>
+                <m:t xml:space="preserve">b</m:t>
+              </m:r>
+              <m:r>
+                <m:t xml:space="preserve">e</m:t>
+              </m:r>
+              <m:r>
+                <m:t xml:space="preserve">d</m:t>
+              </m:r>
+            </m:sub>
+          </m:sSub>
+          <m:r>
+            <m:t xml:space="preserve">(</m:t>
+          </m:r>
+          <m:r>
+            <m:t xml:space="preserve">x</m:t>
+          </m:r>
+          <m:r>
+            <m:t xml:space="preserve">)</m:t>
+          </m:r>
+          <m:r>
+            <m:t xml:space="preserve">=</m:t>
+          </m:r>
+          <m:r>
+            <m:t xml:space="preserve">h</m:t>
+          </m:r>
+          <m:r>
+            <m:t xml:space="preserve">(</m:t>
+          </m:r>
+          <m:r>
+            <m:t xml:space="preserve">x</m:t>
+          </m:r>
+          <m:r>
+            <m:t xml:space="preserve">)</m:t>
+          </m:r>
+          <m:r>
+            <m:t xml:space="preserve">+</m:t>
+          </m:r>
+          <m:r>
+            <m:t xml:space="preserve">β</m:t>
+          </m:r>
+          <m:f>
+            <m:fPr>
+              <m:type m:val="bar"/>
+            </m:fPr>
+            <m:num>
+              <m:r>
+                <m:t xml:space="preserve">U</m:t>
+              </m:r>
+              <m:r>
+                <m:t xml:space="preserve">(</m:t>
+              </m:r>
+              <m:r>
+                <m:t xml:space="preserve">x</m:t>
+              </m:r>
+              <m:sSup>
+                <m:e>
+                  <m:r>
+                    <m:t xml:space="preserve">)</m:t>
+                  </m:r>
+                </m:e>
+                <m:sup>
+                  <m:r>
+                    <m:t xml:space="preserve">2</m:t>
+                  </m:r>
+                </m:sup>
+              </m:sSup>
+            </m:num>
+            <m:den>
+              <m:r>
+                <m:t xml:space="preserve">2</m:t>
+              </m:r>
+              <m:r>
+                <m:t xml:space="preserve">g</m:t>
+              </m:r>
+            </m:den>
+          </m:f>
+          <m:r>
+            <m:t xml:space="preserve">+</m:t>
+          </m:r>
+          <m:r>
+            <m:t xml:space="preserve">Δ</m:t>
+          </m:r>
+          <m:sSub>
+            <m:e>
+              <m:r>
+                <m:t xml:space="preserve">H</m:t>
+              </m:r>
+            </m:e>
+            <m:sub>
+              <m:r>
+                <m:t xml:space="preserve">v</m:t>
+              </m:r>
+            </m:sub>
+          </m:sSub>
+          <m:r>
+            <m:t xml:space="preserve">(</m:t>
+          </m:r>
+          <m:r>
+            <m:t xml:space="preserve">x</m:t>
+          </m:r>
+          <m:r>
+            <m:t xml:space="preserve">)</m:t>
+          </m:r>
+          <m:r>
+            <m:t xml:space="preserve">     (12)</m:t>
+          </m:r>
+        </m:oMath>
+      </m:oMathPara>
+    </w:p>
+    <w:p>
+      <w:r>
+        <w:t xml:space="preserve">where β is a pressure coefficient and ΔH_v is the vegetation-induced near-bed head perturbation, which is positive within and just downstream of the canopy where the flow decelerates. A Green–Ampt formulation, in which infiltration depends on saturated conductivity, wetting-front suction, and the initial moisture deficit, serves as a mechanistic benchmark [37]:</w:t>
+      </w:r>
+    </w:p>
+    <w:p>
+      <w:pPr>
+        <w:jc w:val="center"/>
+      </w:pPr>
+      <m:oMathPara xmlns:m="http://schemas.openxmlformats.org/officeDocument/2006/math">
+        <m:oMath>
+          <m:sSub>
+            <m:e>
+              <m:r>
+                <m:t xml:space="preserve">f</m:t>
+              </m:r>
+            </m:e>
+            <m:sub>
+              <m:r>
+                <m:t xml:space="preserve">G</m:t>
+              </m:r>
+              <m:r>
+                <m:t xml:space="preserve">A</m:t>
+              </m:r>
+            </m:sub>
+          </m:sSub>
+          <m:r>
+            <m:t xml:space="preserve">(</m:t>
+          </m:r>
+          <m:r>
+            <m:t xml:space="preserve">t</m:t>
+          </m:r>
+          <m:r>
+            <m:t xml:space="preserve">)</m:t>
+          </m:r>
+          <m:r>
+            <m:t xml:space="preserve">=</m:t>
+          </m:r>
+          <m:sSub>
+            <m:e>
+              <m:r>
+                <m:t xml:space="preserve">K</m:t>
+              </m:r>
+            </m:e>
+            <m:sub>
+              <m:r>
+                <m:t xml:space="preserve">s</m:t>
+              </m:r>
+            </m:sub>
+          </m:sSub>
+          <m:r>
+            <m:t xml:space="preserve">[</m:t>
+          </m:r>
+          <m:r>
+            <m:t xml:space="preserve">1</m:t>
+          </m:r>
+          <m:r>
+            <m:t xml:space="preserve">+</m:t>
+          </m:r>
+          <m:f>
+            <m:fPr>
+              <m:type m:val="bar"/>
+            </m:fPr>
+            <m:num>
+              <m:r>
+                <m:t xml:space="preserve">(</m:t>
+              </m:r>
+              <m:sSub>
+                <m:e>
+                  <m:r>
+                    <m:t xml:space="preserve">ψ</m:t>
+                  </m:r>
+                </m:e>
+                <m:sub>
+                  <m:r>
+                    <m:t xml:space="preserve">f</m:t>
+                  </m:r>
+                </m:sub>
+              </m:sSub>
+              <m:r>
+                <m:t xml:space="preserve">+</m:t>
+              </m:r>
+              <m:sSub>
+                <m:e>
+                  <m:r>
+                    <m:t xml:space="preserve">H</m:t>
+                  </m:r>
+                </m:e>
+                <m:sub>
+                  <m:r>
+                    <m:t xml:space="preserve">b</m:t>
+                  </m:r>
+                  <m:r>
+                    <m:t xml:space="preserve">e</m:t>
+                  </m:r>
+                  <m:r>
+                    <m:t xml:space="preserve">d</m:t>
+                  </m:r>
+                </m:sub>
+              </m:sSub>
+              <m:r>
+                <m:t xml:space="preserve">)</m:t>
+              </m:r>
+              <m:r>
+                <m:t xml:space="preserve">Δ</m:t>
+              </m:r>
+              <m:r>
+                <m:t xml:space="preserve">θ</m:t>
+              </m:r>
+            </m:num>
+            <m:den>
+              <m:r>
+                <m:t xml:space="preserve">F</m:t>
+              </m:r>
+              <m:r>
+                <m:t xml:space="preserve">(</m:t>
+              </m:r>
+              <m:r>
+                <m:t xml:space="preserve">t</m:t>
+              </m:r>
+              <m:r>
+                <m:t xml:space="preserve">)</m:t>
+              </m:r>
+            </m:den>
+          </m:f>
+          <m:r>
+            <m:t xml:space="preserve">]</m:t>
+          </m:r>
+          <m:r>
+            <m:t xml:space="preserve">     (13)</m:t>
+          </m:r>
+        </m:oMath>
+      </m:oMathPara>
+    </w:p>
+    <w:p>
+      <w:pPr>
+        <w:jc w:val="center"/>
+      </w:pPr>
+      <m:oMathPara xmlns:m="http://schemas.openxmlformats.org/officeDocument/2006/math">
+        <m:oMath>
+          <m:r>
+            <m:t xml:space="preserve">F</m:t>
+          </m:r>
+          <m:r>
+            <m:t xml:space="preserve">(</m:t>
+          </m:r>
+          <m:r>
+            <m:t xml:space="preserve">t</m:t>
+          </m:r>
+          <m:r>
+            <m:t xml:space="preserve">)</m:t>
+          </m:r>
+          <m:r>
+            <m:t xml:space="preserve">=</m:t>
+          </m:r>
+          <m:sSub>
+            <m:e>
+              <m:r>
+                <m:t xml:space="preserve">K</m:t>
+              </m:r>
+            </m:e>
+            <m:sub>
+              <m:r>
+                <m:t xml:space="preserve">s</m:t>
+              </m:r>
+            </m:sub>
+          </m:sSub>
+          <m:r>
+            <m:t xml:space="preserve">t</m:t>
+          </m:r>
+          <m:r>
+            <m:t xml:space="preserve">+</m:t>
+          </m:r>
+          <m:r>
+            <m:t xml:space="preserve">(</m:t>
+          </m:r>
+          <m:sSub>
+            <m:e>
+              <m:r>
+                <m:t xml:space="preserve">ψ</m:t>
+              </m:r>
+            </m:e>
+            <m:sub>
+              <m:r>
+                <m:t xml:space="preserve">f</m:t>
+              </m:r>
+            </m:sub>
+          </m:sSub>
+          <m:r>
+            <m:t xml:space="preserve">+</m:t>
+          </m:r>
+          <m:sSub>
+            <m:e>
+              <m:r>
+                <m:t xml:space="preserve">H</m:t>
+              </m:r>
+            </m:e>
+            <m:sub>
+              <m:r>
+                <m:t xml:space="preserve">b</m:t>
+              </m:r>
+              <m:r>
+                <m:t xml:space="preserve">e</m:t>
+              </m:r>
+              <m:r>
+                <m:t xml:space="preserve">d</m:t>
+              </m:r>
+            </m:sub>
+          </m:sSub>
+          <m:r>
+            <m:t xml:space="preserve">)</m:t>
+          </m:r>
+          <m:r>
+            <m:t xml:space="preserve">Δ</m:t>
+          </m:r>
+          <m:r>
+            <m:t xml:space="preserve">θ</m:t>
+          </m:r>
+          <m:r>
+            <m:t xml:space="preserve">ln</m:t>
+          </m:r>
+          <m:r>
+            <m:t xml:space="preserve">[</m:t>
+          </m:r>
+          <m:r>
+            <m:t xml:space="preserve">1</m:t>
+          </m:r>
+          <m:r>
+            <m:t xml:space="preserve">+</m:t>
+          </m:r>
+          <m:f>
+            <m:fPr>
+              <m:type m:val="bar"/>
+            </m:fPr>
+            <m:num>
+              <m:r>
+                <m:t xml:space="preserve">F</m:t>
+              </m:r>
+              <m:r>
+                <m:t xml:space="preserve">(</m:t>
+              </m:r>
+              <m:r>
+                <m:t xml:space="preserve">t</m:t>
+              </m:r>
+              <m:r>
+                <m:t xml:space="preserve">)</m:t>
+              </m:r>
+            </m:num>
+            <m:den>
+              <m:r>
+                <m:t xml:space="preserve">(</m:t>
+              </m:r>
+              <m:sSub>
+                <m:e>
+                  <m:r>
+                    <m:t xml:space="preserve">ψ</m:t>
+                  </m:r>
+                </m:e>
+                <m:sub>
+                  <m:r>
+                    <m:t xml:space="preserve">f</m:t>
+                  </m:r>
+                </m:sub>
+              </m:sSub>
+              <m:r>
+                <m:t xml:space="preserve">+</m:t>
+              </m:r>
+              <m:sSub>
+                <m:e>
+                  <m:r>
+                    <m:t xml:space="preserve">H</m:t>
+                  </m:r>
+                </m:e>
+                <m:sub>
+                  <m:r>
+                    <m:t xml:space="preserve">b</m:t>
+                  </m:r>
+                  <m:r>
+                    <m:t xml:space="preserve">e</m:t>
+                  </m:r>
+                  <m:r>
+                    <m:t xml:space="preserve">d</m:t>
+                  </m:r>
+                </m:sub>
+              </m:sSub>
+              <m:r>
+                <m:t xml:space="preserve">)</m:t>
+              </m:r>
+              <m:r>
+                <m:t xml:space="preserve">Δ</m:t>
+              </m:r>
+              <m:r>
+                <m:t xml:space="preserve">θ</m:t>
+              </m:r>
+            </m:den>
+          </m:f>
+          <m:r>
+            <m:t xml:space="preserve">]</m:t>
+          </m:r>
+          <m:r>
+            <m:t xml:space="preserve">     (14)</m:t>
+          </m:r>
+        </m:oMath>
+      </m:oMathPara>
+    </w:p>
+    <w:p>
+      <w:r>
+        <w:t xml:space="preserve">Equations (13)–(14) make the coupling explicit: the bed head H_bed of Eq. (12), itself modified by vegetation through Eqs. (2)–(4), enters the subsurface response directly, and the initial deficit Δθ of Eq. (5) sets the early-time gradient. Vegetation drag was thus represented through the frontal-area density λ, linking the hydraulic and subsurface descriptions within a single conceptual chain (Figure 1). In the Green–Ampt benchmark, the driving head at the bed was set from the measured local flow depth and dynamic pressure rather than assumed constant, so that the vegetation-induced modification of the surface forcing entered the subsurface model through a physically meaningful boundary condition [37]. The wetting-front suction and the initial moisture deficit were derived from the measured soil hydraulic properties and the prescribed antecedent state, keeping the benchmark parameter-parsimonious and physically interpretable [14]. This formulation makes explicit why the benchmark, despite its physical grounding, is expected to under-represent the vegetation effect: it captures the head-driven part of the response but not the additional near-bed pressure redistribution and turbulence generated by the stems, which the full coupled system produces [36]. The gap between the benchmark and the observations therefore quantifies the specifically hydrodynamic contribution of vegetation to infiltration.</w:t>
       </w:r>
     </w:p>
     <w:p>
@@ -4596,13 +6621,372 @@
     </w:p>
     <w:p>
       <w:r>
-        <w:t xml:space="preserve">Dimensional analysis reduced the governing variables to a compact set of dimensionless groups: the flow Reynolds number Re = U·h/ν; the Froude number Fr = U/√(g·h); a permeability Reynolds number Re_k = U·k/(ν·h) representing bed permeability relative to the flow; the vegetation density parameter λ; the relative submergence H_v/h; and the initial saturation ratio S_i [38]. The response was expressed as a normalized infiltration I* = f/K_s, yielding the target relationship</w:t>
-      </w:r>
-    </w:p>
-    <w:p>
-      <w:r>
-        <w:t xml:space="preserve">I* = F(Re, Fr, Re_k, λ, H_v/h, S_i)</w:t>
-      </w:r>
+        <w:t xml:space="preserve">Dimensional analysis, applied to the governing variables of Eqs. (1)–(14) via the Buckingham-Π theorem, reduced the problem to a compact set of dimensionless groups. The flow Reynolds number,</w:t>
+      </w:r>
+    </w:p>
+    <w:p>
+      <w:pPr>
+        <w:jc w:val="center"/>
+      </w:pPr>
+      <m:oMathPara xmlns:m="http://schemas.openxmlformats.org/officeDocument/2006/math">
+        <m:oMath>
+          <m:r>
+            <m:t xml:space="preserve">R</m:t>
+          </m:r>
+          <m:r>
+            <m:t xml:space="preserve">e</m:t>
+          </m:r>
+          <m:r>
+            <m:t xml:space="preserve">=</m:t>
+          </m:r>
+          <m:f>
+            <m:fPr>
+              <m:type m:val="bar"/>
+            </m:fPr>
+            <m:num>
+              <m:r>
+                <m:t xml:space="preserve">U</m:t>
+              </m:r>
+              <m:r>
+                <m:t xml:space="preserve">h</m:t>
+              </m:r>
+            </m:num>
+            <m:den>
+              <m:r>
+                <m:t xml:space="preserve">ν</m:t>
+              </m:r>
+            </m:den>
+          </m:f>
+          <m:r>
+            <m:t xml:space="preserve">     (15)</m:t>
+          </m:r>
+        </m:oMath>
+      </m:oMathPara>
+    </w:p>
+    <w:p>
+      <w:r>
+        <w:t xml:space="preserve">the Froude number,</w:t>
+      </w:r>
+    </w:p>
+    <w:p>
+      <w:pPr>
+        <w:jc w:val="center"/>
+      </w:pPr>
+      <m:oMathPara xmlns:m="http://schemas.openxmlformats.org/officeDocument/2006/math">
+        <m:oMath>
+          <m:r>
+            <m:t xml:space="preserve">F</m:t>
+          </m:r>
+          <m:r>
+            <m:t xml:space="preserve">r</m:t>
+          </m:r>
+          <m:r>
+            <m:t xml:space="preserve">=</m:t>
+          </m:r>
+          <m:f>
+            <m:fPr>
+              <m:type m:val="bar"/>
+            </m:fPr>
+            <m:num>
+              <m:r>
+                <m:t xml:space="preserve">U</m:t>
+              </m:r>
+            </m:num>
+            <m:den>
+              <m:rad>
+                <m:radPr>
+                  <m:degHide m:val="1"/>
+                </m:radPr>
+                <m:deg/>
+                <m:e>
+                  <m:r>
+                    <m:t xml:space="preserve">g</m:t>
+                  </m:r>
+                  <m:r>
+                    <m:t xml:space="preserve">h</m:t>
+                  </m:r>
+                </m:e>
+              </m:rad>
+            </m:den>
+          </m:f>
+          <m:r>
+            <m:t xml:space="preserve">     (16)</m:t>
+          </m:r>
+        </m:oMath>
+      </m:oMathPara>
+    </w:p>
+    <w:p>
+      <w:r>
+        <w:t xml:space="preserve">a permeability Reynolds number representing bed permeability relative to the flow,</w:t>
+      </w:r>
+    </w:p>
+    <w:p>
+      <w:pPr>
+        <w:jc w:val="center"/>
+      </w:pPr>
+      <m:oMathPara xmlns:m="http://schemas.openxmlformats.org/officeDocument/2006/math">
+        <m:oMath>
+          <m:r>
+            <m:t xml:space="preserve">R</m:t>
+          </m:r>
+          <m:sSub>
+            <m:e>
+              <m:r>
+                <m:t xml:space="preserve">e</m:t>
+              </m:r>
+            </m:e>
+            <m:sub>
+              <m:r>
+                <m:t xml:space="preserve">k</m:t>
+              </m:r>
+            </m:sub>
+          </m:sSub>
+          <m:r>
+            <m:t xml:space="preserve">=</m:t>
+          </m:r>
+          <m:f>
+            <m:fPr>
+              <m:type m:val="bar"/>
+            </m:fPr>
+            <m:num>
+              <m:r>
+                <m:t xml:space="preserve">U</m:t>
+              </m:r>
+              <m:r>
+                <m:t xml:space="preserve">k</m:t>
+              </m:r>
+            </m:num>
+            <m:den>
+              <m:r>
+                <m:t xml:space="preserve">ν</m:t>
+              </m:r>
+              <m:r>
+                <m:t xml:space="preserve">h</m:t>
+              </m:r>
+            </m:den>
+          </m:f>
+          <m:r>
+            <m:t xml:space="preserve">,</m:t>
+          </m:r>
+          <m:r>
+            <m:t xml:space="preserve">  </m:t>
+          </m:r>
+          <m:r>
+            <m:t xml:space="preserve">k</m:t>
+          </m:r>
+          <m:r>
+            <m:t xml:space="preserve">=</m:t>
+          </m:r>
+          <m:f>
+            <m:fPr>
+              <m:type m:val="bar"/>
+            </m:fPr>
+            <m:num>
+              <m:sSub>
+                <m:e>
+                  <m:r>
+                    <m:t xml:space="preserve">K</m:t>
+                  </m:r>
+                </m:e>
+                <m:sub>
+                  <m:r>
+                    <m:t xml:space="preserve">s</m:t>
+                  </m:r>
+                </m:sub>
+              </m:sSub>
+              <m:r>
+                <m:t xml:space="preserve">ν</m:t>
+              </m:r>
+            </m:num>
+            <m:den>
+              <m:r>
+                <m:t xml:space="preserve">g</m:t>
+              </m:r>
+            </m:den>
+          </m:f>
+          <m:r>
+            <m:t xml:space="preserve">     (17)</m:t>
+          </m:r>
+        </m:oMath>
+      </m:oMathPara>
+    </w:p>
+    <w:p>
+      <w:r>
+        <w:t xml:space="preserve">where k is the intrinsic permeability and ν the kinematic viscosity; together with the vegetation density parameter λ of Eq. (1), the relative submergence H_v/h, and the initial saturation ratio S_i of Eq. (5) [38]. The response was expressed as a normalized infiltration,</w:t>
+      </w:r>
+    </w:p>
+    <w:p>
+      <w:pPr>
+        <w:jc w:val="center"/>
+      </w:pPr>
+      <m:oMathPara xmlns:m="http://schemas.openxmlformats.org/officeDocument/2006/math">
+        <m:oMath>
+          <m:sSup>
+            <m:e>
+              <m:r>
+                <m:t xml:space="preserve">I</m:t>
+              </m:r>
+            </m:e>
+            <m:sup>
+              <m:r>
+                <m:t xml:space="preserve">*</m:t>
+              </m:r>
+            </m:sup>
+          </m:sSup>
+          <m:r>
+            <m:t xml:space="preserve">=</m:t>
+          </m:r>
+          <m:f>
+            <m:fPr>
+              <m:type m:val="bar"/>
+            </m:fPr>
+            <m:num>
+              <m:r>
+                <m:t xml:space="preserve">f</m:t>
+              </m:r>
+            </m:num>
+            <m:den>
+              <m:sSub>
+                <m:e>
+                  <m:r>
+                    <m:t xml:space="preserve">K</m:t>
+                  </m:r>
+                </m:e>
+                <m:sub>
+                  <m:r>
+                    <m:t xml:space="preserve">s</m:t>
+                  </m:r>
+                </m:sub>
+              </m:sSub>
+            </m:den>
+          </m:f>
+          <m:r>
+            <m:t xml:space="preserve">     (18)</m:t>
+          </m:r>
+        </m:oMath>
+      </m:oMathPara>
+    </w:p>
+    <w:p>
+      <w:r>
+        <w:t xml:space="preserve">yielding the target dimensionless relationship</w:t>
+      </w:r>
+    </w:p>
+    <w:p>
+      <w:pPr>
+        <w:jc w:val="center"/>
+      </w:pPr>
+      <m:oMathPara xmlns:m="http://schemas.openxmlformats.org/officeDocument/2006/math">
+        <m:oMath>
+          <m:sSup>
+            <m:e>
+              <m:r>
+                <m:t xml:space="preserve">I</m:t>
+              </m:r>
+            </m:e>
+            <m:sup>
+              <m:r>
+                <m:t xml:space="preserve">*</m:t>
+              </m:r>
+            </m:sup>
+          </m:sSup>
+          <m:r>
+            <m:t xml:space="preserve">=</m:t>
+          </m:r>
+          <m:r>
+            <m:t xml:space="preserve">Φ</m:t>
+          </m:r>
+          <m:r>
+            <m:t xml:space="preserve">(</m:t>
+          </m:r>
+          <m:r>
+            <m:t xml:space="preserve">R</m:t>
+          </m:r>
+          <m:r>
+            <m:t xml:space="preserve">e</m:t>
+          </m:r>
+          <m:r>
+            <m:t xml:space="preserve">,</m:t>
+          </m:r>
+          <m:r>
+            <m:t xml:space="preserve">F</m:t>
+          </m:r>
+          <m:r>
+            <m:t xml:space="preserve">r</m:t>
+          </m:r>
+          <m:r>
+            <m:t xml:space="preserve">,</m:t>
+          </m:r>
+          <m:r>
+            <m:t xml:space="preserve">R</m:t>
+          </m:r>
+          <m:sSub>
+            <m:e>
+              <m:r>
+                <m:t xml:space="preserve">e</m:t>
+              </m:r>
+            </m:e>
+            <m:sub>
+              <m:r>
+                <m:t xml:space="preserve">k</m:t>
+              </m:r>
+            </m:sub>
+          </m:sSub>
+          <m:r>
+            <m:t xml:space="preserve">,</m:t>
+          </m:r>
+          <m:r>
+            <m:t xml:space="preserve">λ</m:t>
+          </m:r>
+          <m:r>
+            <m:t xml:space="preserve">,</m:t>
+          </m:r>
+          <m:f>
+            <m:fPr>
+              <m:type m:val="bar"/>
+            </m:fPr>
+            <m:num>
+              <m:sSub>
+                <m:e>
+                  <m:r>
+                    <m:t xml:space="preserve">H</m:t>
+                  </m:r>
+                </m:e>
+                <m:sub>
+                  <m:r>
+                    <m:t xml:space="preserve">v</m:t>
+                  </m:r>
+                </m:sub>
+              </m:sSub>
+            </m:num>
+            <m:den>
+              <m:r>
+                <m:t xml:space="preserve">h</m:t>
+              </m:r>
+            </m:den>
+          </m:f>
+          <m:r>
+            <m:t xml:space="preserve">,</m:t>
+          </m:r>
+          <m:sSub>
+            <m:e>
+              <m:r>
+                <m:t xml:space="preserve">S</m:t>
+              </m:r>
+            </m:e>
+            <m:sub>
+              <m:r>
+                <m:t xml:space="preserve">i</m:t>
+              </m:r>
+            </m:sub>
+          </m:sSub>
+          <m:r>
+            <m:t xml:space="preserve">)</m:t>
+          </m:r>
+          <m:r>
+            <m:t xml:space="preserve">     (19)</m:t>
+          </m:r>
+        </m:oMath>
+      </m:oMathPara>
     </w:p>
     <w:p>
       <w:r>
@@ -5229,17 +7613,366 @@
     </w:p>
     <w:p>
       <w:r>
-        <w:t xml:space="preserve">Beyond the physically based power-law fit, several data-driven models were trained on the Stage I calibration data: multiple nonlinear regression, random forest, gradient-boosted trees, and a compact feedforward neural network, each using the dimensionless predictors of Table 3 [40]. Recognizing that applying a tree ensemble alone is not by itself a strong novelty claim, the central modeling contribution was a hybrid formulation</w:t>
-      </w:r>
-    </w:p>
-    <w:p>
-      <w:r>
-        <w:t xml:space="preserve">f_pred = f_physical + f_ML,residual</w:t>
-      </w:r>
-    </w:p>
-    <w:p>
-      <w:r>
-        <w:t xml:space="preserve">in which the calibrated physical model supplies the leading behavior and a learned component captures the residual nonlinearity, an approach consistent with physics-informed hybrid modeling in hydrology [41]. Model hyperparameters were tuned by cross-validation within the calibration set only.</w:t>
+        <w:t xml:space="preserve">Beyond the physically based power-law fit, several data-driven models were trained on the Stage I calibration data: multiple nonlinear regression, random forest, gradient-boosted trees, and a compact feedforward neural network, each using the dimensionless predictors of Table 3 [40]. The physically based relationship of Eq. (19) was specified as a multiplicative power law whose exponents were fitted rather than prescribed,</w:t>
+      </w:r>
+    </w:p>
+    <w:p>
+      <w:pPr>
+        <w:jc w:val="center"/>
+      </w:pPr>
+      <m:oMathPara xmlns:m="http://schemas.openxmlformats.org/officeDocument/2006/math">
+        <m:oMath>
+          <m:sSup>
+            <m:e>
+              <m:r>
+                <m:t xml:space="preserve">I</m:t>
+              </m:r>
+            </m:e>
+            <m:sup>
+              <m:r>
+                <m:t xml:space="preserve">*</m:t>
+              </m:r>
+            </m:sup>
+          </m:sSup>
+          <m:r>
+            <m:t xml:space="preserve">=</m:t>
+          </m:r>
+          <m:f>
+            <m:fPr>
+              <m:type m:val="bar"/>
+            </m:fPr>
+            <m:num>
+              <m:r>
+                <m:t xml:space="preserve">f</m:t>
+              </m:r>
+            </m:num>
+            <m:den>
+              <m:sSub>
+                <m:e>
+                  <m:r>
+                    <m:t xml:space="preserve">K</m:t>
+                  </m:r>
+                </m:e>
+                <m:sub>
+                  <m:r>
+                    <m:t xml:space="preserve">s</m:t>
+                  </m:r>
+                </m:sub>
+              </m:sSub>
+            </m:den>
+          </m:f>
+          <m:r>
+            <m:t xml:space="preserve">=</m:t>
+          </m:r>
+          <m:r>
+            <m:t xml:space="preserve">C</m:t>
+          </m:r>
+          <m:r>
+            <m:t xml:space="preserve">R</m:t>
+          </m:r>
+          <m:sSup>
+            <m:e>
+              <m:r>
+                <m:t xml:space="preserve">e</m:t>
+              </m:r>
+            </m:e>
+            <m:sup>
+              <m:r>
+                <m:t xml:space="preserve">a</m:t>
+              </m:r>
+            </m:sup>
+          </m:sSup>
+          <m:r>
+            <m:t xml:space="preserve">F</m:t>
+          </m:r>
+          <m:sSup>
+            <m:e>
+              <m:r>
+                <m:t xml:space="preserve">r</m:t>
+              </m:r>
+            </m:e>
+            <m:sup>
+              <m:r>
+                <m:t xml:space="preserve">b</m:t>
+              </m:r>
+            </m:sup>
+          </m:sSup>
+          <m:r>
+            <m:t xml:space="preserve">R</m:t>
+          </m:r>
+          <m:sSubSup>
+            <m:e>
+              <m:r>
+                <m:t xml:space="preserve">e</m:t>
+              </m:r>
+            </m:e>
+            <m:sub>
+              <m:r>
+                <m:t xml:space="preserve">k</m:t>
+              </m:r>
+            </m:sub>
+            <m:sup>
+              <m:r>
+                <m:t xml:space="preserve">c</m:t>
+              </m:r>
+            </m:sup>
+          </m:sSubSup>
+          <m:sSup>
+            <m:e>
+              <m:r>
+                <m:t xml:space="preserve">λ</m:t>
+              </m:r>
+            </m:e>
+            <m:sup>
+              <m:r>
+                <m:t xml:space="preserve">d</m:t>
+              </m:r>
+            </m:sup>
+          </m:sSup>
+          <m:r>
+            <m:t xml:space="preserve">(</m:t>
+          </m:r>
+          <m:f>
+            <m:fPr>
+              <m:type m:val="bar"/>
+            </m:fPr>
+            <m:num>
+              <m:sSub>
+                <m:e>
+                  <m:r>
+                    <m:t xml:space="preserve">H</m:t>
+                  </m:r>
+                </m:e>
+                <m:sub>
+                  <m:r>
+                    <m:t xml:space="preserve">v</m:t>
+                  </m:r>
+                </m:sub>
+              </m:sSub>
+            </m:num>
+            <m:den>
+              <m:r>
+                <m:t xml:space="preserve">h</m:t>
+              </m:r>
+            </m:den>
+          </m:f>
+          <m:sSup>
+            <m:e>
+              <m:r>
+                <m:t xml:space="preserve">)</m:t>
+              </m:r>
+            </m:e>
+            <m:sup>
+              <m:r>
+                <m:t xml:space="preserve">e</m:t>
+              </m:r>
+            </m:sup>
+          </m:sSup>
+          <m:sSubSup>
+            <m:e>
+              <m:r>
+                <m:t xml:space="preserve">S</m:t>
+              </m:r>
+            </m:e>
+            <m:sub>
+              <m:r>
+                <m:t xml:space="preserve">i</m:t>
+              </m:r>
+            </m:sub>
+            <m:sup>
+              <m:r>
+                <m:t xml:space="preserve">g</m:t>
+              </m:r>
+            </m:sup>
+          </m:sSubSup>
+          <m:r>
+            <m:t xml:space="preserve">     (20)</m:t>
+          </m:r>
+        </m:oMath>
+      </m:oMathPara>
+    </w:p>
+    <w:p>
+      <w:r>
+        <w:t xml:space="preserve">with C, a, b, c, d, e, and g determined by least-squares regression of the log-transformed data. Recognizing that applying a tree ensemble alone is not by itself a strong novelty claim, the central modeling contribution was a hybrid formulation in which the calibrated physical model supplies the leading behavior and a learned component captures the residual nonlinearity,</w:t>
+      </w:r>
+    </w:p>
+    <w:p>
+      <w:pPr>
+        <w:jc w:val="center"/>
+      </w:pPr>
+      <m:oMathPara xmlns:m="http://schemas.openxmlformats.org/officeDocument/2006/math">
+        <m:oMath>
+          <m:r>
+            <m:t xml:space="preserve">hat</m:t>
+          </m:r>
+          <m:sSub>
+            <m:e>
+              <m:r>
+                <m:t xml:space="preserve">f</m:t>
+              </m:r>
+            </m:e>
+            <m:sub>
+              <m:r>
+                <m:t xml:space="preserve">p</m:t>
+              </m:r>
+              <m:r>
+                <m:t xml:space="preserve">r</m:t>
+              </m:r>
+              <m:r>
+                <m:t xml:space="preserve">e</m:t>
+              </m:r>
+              <m:r>
+                <m:t xml:space="preserve">d</m:t>
+              </m:r>
+            </m:sub>
+          </m:sSub>
+          <m:r>
+            <m:t xml:space="preserve">=</m:t>
+          </m:r>
+          <m:sSub>
+            <m:e>
+              <m:r>
+                <m:t xml:space="preserve">f</m:t>
+              </m:r>
+            </m:e>
+            <m:sub>
+              <m:r>
+                <m:t xml:space="preserve">p</m:t>
+              </m:r>
+              <m:r>
+                <m:t xml:space="preserve">h</m:t>
+              </m:r>
+              <m:r>
+                <m:t xml:space="preserve">y</m:t>
+              </m:r>
+              <m:r>
+                <m:t xml:space="preserve">s</m:t>
+              </m:r>
+            </m:sub>
+          </m:sSub>
+          <m:r>
+            <m:t xml:space="preserve">(</m:t>
+          </m:r>
+          <m:r>
+            <m:t xml:space="preserve">mathbf</m:t>
+          </m:r>
+          <m:r>
+            <m:t xml:space="preserve">x</m:t>
+          </m:r>
+          <m:r>
+            <m:t xml:space="preserve">)</m:t>
+          </m:r>
+          <m:r>
+            <m:t xml:space="preserve">+</m:t>
+          </m:r>
+          <m:sSub>
+            <m:e>
+              <m:r>
+                <m:t xml:space="preserve">g</m:t>
+              </m:r>
+            </m:e>
+            <m:sub>
+              <m:r>
+                <m:t xml:space="preserve">M</m:t>
+              </m:r>
+              <m:r>
+                <m:t xml:space="preserve">L</m:t>
+              </m:r>
+            </m:sub>
+          </m:sSub>
+          <m:r>
+            <m:t xml:space="preserve">(</m:t>
+          </m:r>
+          <m:r>
+            <m:t xml:space="preserve">mathbf</m:t>
+          </m:r>
+          <m:r>
+            <m:t xml:space="preserve">x</m:t>
+          </m:r>
+          <m:r>
+            <m:t xml:space="preserve">)</m:t>
+          </m:r>
+          <m:r>
+            <m:t xml:space="preserve">,</m:t>
+          </m:r>
+          <m:r>
+            <m:t xml:space="preserve">  </m:t>
+          </m:r>
+          <m:sSub>
+            <m:e>
+              <m:r>
+                <m:t xml:space="preserve">g</m:t>
+              </m:r>
+            </m:e>
+            <m:sub>
+              <m:r>
+                <m:t xml:space="preserve">M</m:t>
+              </m:r>
+              <m:r>
+                <m:t xml:space="preserve">L</m:t>
+              </m:r>
+            </m:sub>
+          </m:sSub>
+          <m:r>
+            <m:t xml:space="preserve">≈</m:t>
+          </m:r>
+          <m:r>
+            <m:t xml:space="preserve">r</m:t>
+          </m:r>
+          <m:r>
+            <m:t xml:space="preserve">=</m:t>
+          </m:r>
+          <m:sSub>
+            <m:e>
+              <m:r>
+                <m:t xml:space="preserve">f</m:t>
+              </m:r>
+            </m:e>
+            <m:sub>
+              <m:r>
+                <m:t xml:space="preserve">o</m:t>
+              </m:r>
+              <m:r>
+                <m:t xml:space="preserve">b</m:t>
+              </m:r>
+              <m:r>
+                <m:t xml:space="preserve">s</m:t>
+              </m:r>
+            </m:sub>
+          </m:sSub>
+          <m:r>
+            <m:t xml:space="preserve">-</m:t>
+          </m:r>
+          <m:sSub>
+            <m:e>
+              <m:r>
+                <m:t xml:space="preserve">f</m:t>
+              </m:r>
+            </m:e>
+            <m:sub>
+              <m:r>
+                <m:t xml:space="preserve">p</m:t>
+              </m:r>
+              <m:r>
+                <m:t xml:space="preserve">h</m:t>
+              </m:r>
+              <m:r>
+                <m:t xml:space="preserve">y</m:t>
+              </m:r>
+              <m:r>
+                <m:t xml:space="preserve">s</m:t>
+              </m:r>
+            </m:sub>
+          </m:sSub>
+          <m:r>
+            <m:t xml:space="preserve">     (21)</m:t>
+          </m:r>
+        </m:oMath>
+      </m:oMathPara>
+    </w:p>
+    <w:p>
+      <w:r>
+        <w:t xml:space="preserve">where x is the vector of dimensionless predictors of Eqs. (15)–(19), f_phys is the power law of Eq. (20), and g_ML is trained on the physical-model residual r, an approach consistent with physics-informed hybrid modeling in hydrology [41]. Model hyperparameters were tuned by cross-validation within the calibration set only.</w:t>
       </w:r>
     </w:p>
     <w:p>
@@ -5257,7 +7990,522 @@
     </w:p>
     <w:p>
       <w:r>
-        <w:t xml:space="preserve">Predictive performance was quantified by the coefficient of determination R², root-mean-square error (RMSE), mean absolute error (MAE), Nash–Sutcliffe efficiency (NSE), mean absolute percentage error (MAPE), and the index of agreement d, reported on the reserved independent validation conditions [42]. Uncertainty was propagated from instrument precision and replicate scatter, and reported as intervals on measured and predicted infiltration. Global sensitivity was assessed by variance-based Sobol indices and permutation importance, complemented by SHAP attributions, to rank the controls without assuming their order in advance [43]. Reporting several complementary metrics rather than a single score guards against the well-known tendency of any one statistic to reward particular error structures; for instance, a high coefficient of determination can coexist with systematic bias that the Nash–Sutcliffe efficiency and index of agreement expose [42]. The metrics were computed exclusively on the reserved validation conditions so that they measure genuine predictive skill rather than goodness of fit to the calibration data, consistent with best practice for structured, non-random data splits [35]. Sensitivity indices were estimated from the validated model and cross-checked against the fitted signs of the physical power-law exponents, providing two independent lines of evidence for the ranking of controls [43]. Uncertainty intervals combine instrument precision, established from repeat calibrations, with run-to-run scatter estimated from replicated anchor conditions in the experimental design [34].</w:t>
+        <w:t xml:space="preserve">Predictive performance was quantified by the coefficient of determination R², root-mean-square error (RMSE), mean absolute error (MAE), mean absolute percentage error (MAPE), the Nash–Sutcliffe efficiency (NSE), and the index of agreement d, reported on the reserved independent validation conditions [42]. The two agreement statistics were defined as</w:t>
+      </w:r>
+    </w:p>
+    <w:p>
+      <w:pPr>
+        <w:jc w:val="center"/>
+      </w:pPr>
+      <m:oMathPara xmlns:m="http://schemas.openxmlformats.org/officeDocument/2006/math">
+        <m:oMath>
+          <m:r>
+            <m:t xml:space="preserve">N</m:t>
+          </m:r>
+          <m:r>
+            <m:t xml:space="preserve">S</m:t>
+          </m:r>
+          <m:r>
+            <m:t xml:space="preserve">E</m:t>
+          </m:r>
+          <m:r>
+            <m:t xml:space="preserve">=</m:t>
+          </m:r>
+          <m:r>
+            <m:t xml:space="preserve">1</m:t>
+          </m:r>
+          <m:r>
+            <m:t xml:space="preserve">-</m:t>
+          </m:r>
+          <m:f>
+            <m:fPr>
+              <m:type m:val="bar"/>
+            </m:fPr>
+            <m:num>
+              <m:nary>
+                <m:naryPr>
+                  <m:chr m:val="∑"/>
+                  <m:limLoc m:val="undOvr"/>
+                </m:naryPr>
+                <m:sub>
+                  <m:r>
+                    <m:t xml:space="preserve">i</m:t>
+                  </m:r>
+                  <m:r>
+                    <m:t xml:space="preserve">=</m:t>
+                  </m:r>
+                  <m:r>
+                    <m:t xml:space="preserve">1</m:t>
+                  </m:r>
+                </m:sub>
+                <m:sup>
+                  <m:r>
+                    <m:t xml:space="preserve">N</m:t>
+                  </m:r>
+                </m:sup>
+                <m:e/>
+                %s
+              </m:nary>
+              <m:r>
+                <m:t xml:space="preserve">(</m:t>
+              </m:r>
+              <m:sSub>
+                <m:e>
+                  <m:r>
+                    <m:t xml:space="preserve">f</m:t>
+                  </m:r>
+                </m:e>
+                <m:sub>
+                  <m:r>
+                    <m:t xml:space="preserve">o</m:t>
+                  </m:r>
+                  <m:r>
+                    <m:t xml:space="preserve">b</m:t>
+                  </m:r>
+                  <m:r>
+                    <m:t xml:space="preserve">s</m:t>
+                  </m:r>
+                  <m:r>
+                    <m:t xml:space="preserve">,</m:t>
+                  </m:r>
+                  <m:r>
+                    <m:t xml:space="preserve">i</m:t>
+                  </m:r>
+                </m:sub>
+              </m:sSub>
+              <m:r>
+                <m:t xml:space="preserve">-</m:t>
+              </m:r>
+              <m:sSub>
+                <m:e>
+                  <m:r>
+                    <m:t xml:space="preserve">f</m:t>
+                  </m:r>
+                </m:e>
+                <m:sub>
+                  <m:r>
+                    <m:t xml:space="preserve">p</m:t>
+                  </m:r>
+                  <m:r>
+                    <m:t xml:space="preserve">r</m:t>
+                  </m:r>
+                  <m:r>
+                    <m:t xml:space="preserve">e</m:t>
+                  </m:r>
+                  <m:r>
+                    <m:t xml:space="preserve">d</m:t>
+                  </m:r>
+                  <m:r>
+                    <m:t xml:space="preserve">,</m:t>
+                  </m:r>
+                  <m:r>
+                    <m:t xml:space="preserve">i</m:t>
+                  </m:r>
+                </m:sub>
+              </m:sSub>
+              <m:sSup>
+                <m:e>
+                  <m:r>
+                    <m:t xml:space="preserve">)</m:t>
+                  </m:r>
+                </m:e>
+                <m:sup>
+                  <m:r>
+                    <m:t xml:space="preserve">2</m:t>
+                  </m:r>
+                </m:sup>
+              </m:sSup>
+            </m:num>
+            <m:den>
+              <m:nary>
+                <m:naryPr>
+                  <m:chr m:val="∑"/>
+                  <m:limLoc m:val="undOvr"/>
+                </m:naryPr>
+                <m:sub>
+                  <m:r>
+                    <m:t xml:space="preserve">i</m:t>
+                  </m:r>
+                  <m:r>
+                    <m:t xml:space="preserve">=</m:t>
+                  </m:r>
+                  <m:r>
+                    <m:t xml:space="preserve">1</m:t>
+                  </m:r>
+                </m:sub>
+                <m:sup>
+                  <m:r>
+                    <m:t xml:space="preserve">N</m:t>
+                  </m:r>
+                </m:sup>
+                <m:e/>
+                %s
+              </m:nary>
+              <m:r>
+                <m:t xml:space="preserve">(</m:t>
+              </m:r>
+              <m:sSub>
+                <m:e>
+                  <m:r>
+                    <m:t xml:space="preserve">f</m:t>
+                  </m:r>
+                </m:e>
+                <m:sub>
+                  <m:r>
+                    <m:t xml:space="preserve">o</m:t>
+                  </m:r>
+                  <m:r>
+                    <m:t xml:space="preserve">b</m:t>
+                  </m:r>
+                  <m:r>
+                    <m:t xml:space="preserve">s</m:t>
+                  </m:r>
+                  <m:r>
+                    <m:t xml:space="preserve">,</m:t>
+                  </m:r>
+                  <m:r>
+                    <m:t xml:space="preserve">i</m:t>
+                  </m:r>
+                </m:sub>
+              </m:sSub>
+              <m:r>
+                <m:t xml:space="preserve">-</m:t>
+              </m:r>
+              <m:bar>
+                <m:barPr>
+                  <m:pos m:val="top"/>
+                </m:barPr>
+                <m:e>
+                  <m:sSub>
+                    <m:e>
+                      <m:r>
+                        <m:t xml:space="preserve">f</m:t>
+                      </m:r>
+                    </m:e>
+                    <m:sub>
+                      <m:r>
+                        <m:t xml:space="preserve">o</m:t>
+                      </m:r>
+                      <m:r>
+                        <m:t xml:space="preserve">b</m:t>
+                      </m:r>
+                      <m:r>
+                        <m:t xml:space="preserve">s</m:t>
+                      </m:r>
+                    </m:sub>
+                  </m:sSub>
+                </m:e>
+              </m:bar>
+              <m:sSup>
+                <m:e>
+                  <m:r>
+                    <m:t xml:space="preserve">)</m:t>
+                  </m:r>
+                </m:e>
+                <m:sup>
+                  <m:r>
+                    <m:t xml:space="preserve">2</m:t>
+                  </m:r>
+                </m:sup>
+              </m:sSup>
+            </m:den>
+          </m:f>
+          <m:r>
+            <m:t xml:space="preserve">     (22)</m:t>
+          </m:r>
+        </m:oMath>
+      </m:oMathPara>
+    </w:p>
+    <w:p>
+      <w:pPr>
+        <w:jc w:val="center"/>
+      </w:pPr>
+      <m:oMathPara xmlns:m="http://schemas.openxmlformats.org/officeDocument/2006/math">
+        <m:oMath>
+          <m:r>
+            <m:t xml:space="preserve">d</m:t>
+          </m:r>
+          <m:r>
+            <m:t xml:space="preserve">=</m:t>
+          </m:r>
+          <m:r>
+            <m:t xml:space="preserve">1</m:t>
+          </m:r>
+          <m:r>
+            <m:t xml:space="preserve">-</m:t>
+          </m:r>
+          <m:f>
+            <m:fPr>
+              <m:type m:val="bar"/>
+            </m:fPr>
+            <m:num>
+              <m:nary>
+                <m:naryPr>
+                  <m:chr m:val="∑"/>
+                  <m:limLoc m:val="undOvr"/>
+                </m:naryPr>
+                <m:sub>
+                  <m:r>
+                    <m:t xml:space="preserve">i</m:t>
+                  </m:r>
+                  <m:r>
+                    <m:t xml:space="preserve">=</m:t>
+                  </m:r>
+                  <m:r>
+                    <m:t xml:space="preserve">1</m:t>
+                  </m:r>
+                </m:sub>
+                <m:sup>
+                  <m:r>
+                    <m:t xml:space="preserve">N</m:t>
+                  </m:r>
+                </m:sup>
+                <m:e/>
+                %s
+              </m:nary>
+              <m:r>
+                <m:t xml:space="preserve">(</m:t>
+              </m:r>
+              <m:sSub>
+                <m:e>
+                  <m:r>
+                    <m:t xml:space="preserve">f</m:t>
+                  </m:r>
+                </m:e>
+                <m:sub>
+                  <m:r>
+                    <m:t xml:space="preserve">p</m:t>
+                  </m:r>
+                  <m:r>
+                    <m:t xml:space="preserve">r</m:t>
+                  </m:r>
+                  <m:r>
+                    <m:t xml:space="preserve">e</m:t>
+                  </m:r>
+                  <m:r>
+                    <m:t xml:space="preserve">d</m:t>
+                  </m:r>
+                  <m:r>
+                    <m:t xml:space="preserve">,</m:t>
+                  </m:r>
+                  <m:r>
+                    <m:t xml:space="preserve">i</m:t>
+                  </m:r>
+                </m:sub>
+              </m:sSub>
+              <m:r>
+                <m:t xml:space="preserve">-</m:t>
+              </m:r>
+              <m:sSub>
+                <m:e>
+                  <m:r>
+                    <m:t xml:space="preserve">f</m:t>
+                  </m:r>
+                </m:e>
+                <m:sub>
+                  <m:r>
+                    <m:t xml:space="preserve">o</m:t>
+                  </m:r>
+                  <m:r>
+                    <m:t xml:space="preserve">b</m:t>
+                  </m:r>
+                  <m:r>
+                    <m:t xml:space="preserve">s</m:t>
+                  </m:r>
+                  <m:r>
+                    <m:t xml:space="preserve">,</m:t>
+                  </m:r>
+                  <m:r>
+                    <m:t xml:space="preserve">i</m:t>
+                  </m:r>
+                </m:sub>
+              </m:sSub>
+              <m:sSup>
+                <m:e>
+                  <m:r>
+                    <m:t xml:space="preserve">)</m:t>
+                  </m:r>
+                </m:e>
+                <m:sup>
+                  <m:r>
+                    <m:t xml:space="preserve">2</m:t>
+                  </m:r>
+                </m:sup>
+              </m:sSup>
+            </m:num>
+            <m:den>
+              <m:nary>
+                <m:naryPr>
+                  <m:chr m:val="∑"/>
+                  <m:limLoc m:val="undOvr"/>
+                </m:naryPr>
+                <m:sub>
+                  <m:r>
+                    <m:t xml:space="preserve">i</m:t>
+                  </m:r>
+                  <m:r>
+                    <m:t xml:space="preserve">=</m:t>
+                  </m:r>
+                  <m:r>
+                    <m:t xml:space="preserve">1</m:t>
+                  </m:r>
+                </m:sub>
+                <m:sup>
+                  <m:r>
+                    <m:t xml:space="preserve">N</m:t>
+                  </m:r>
+                </m:sup>
+                <m:e/>
+                %s
+              </m:nary>
+              <m:r>
+                <m:t xml:space="preserve">(</m:t>
+              </m:r>
+              <m:r>
+                <m:t xml:space="preserve">|</m:t>
+              </m:r>
+              <m:sSub>
+                <m:e>
+                  <m:r>
+                    <m:t xml:space="preserve">f</m:t>
+                  </m:r>
+                </m:e>
+                <m:sub>
+                  <m:r>
+                    <m:t xml:space="preserve">p</m:t>
+                  </m:r>
+                  <m:r>
+                    <m:t xml:space="preserve">r</m:t>
+                  </m:r>
+                  <m:r>
+                    <m:t xml:space="preserve">e</m:t>
+                  </m:r>
+                  <m:r>
+                    <m:t xml:space="preserve">d</m:t>
+                  </m:r>
+                  <m:r>
+                    <m:t xml:space="preserve">,</m:t>
+                  </m:r>
+                  <m:r>
+                    <m:t xml:space="preserve">i</m:t>
+                  </m:r>
+                </m:sub>
+              </m:sSub>
+              <m:r>
+                <m:t xml:space="preserve">-</m:t>
+              </m:r>
+              <m:bar>
+                <m:barPr>
+                  <m:pos m:val="top"/>
+                </m:barPr>
+                <m:e>
+                  <m:sSub>
+                    <m:e>
+                      <m:r>
+                        <m:t xml:space="preserve">f</m:t>
+                      </m:r>
+                    </m:e>
+                    <m:sub>
+                      <m:r>
+                        <m:t xml:space="preserve">o</m:t>
+                      </m:r>
+                      <m:r>
+                        <m:t xml:space="preserve">b</m:t>
+                      </m:r>
+                      <m:r>
+                        <m:t xml:space="preserve">s</m:t>
+                      </m:r>
+                    </m:sub>
+                  </m:sSub>
+                </m:e>
+              </m:bar>
+              <m:r>
+                <m:t xml:space="preserve">|</m:t>
+              </m:r>
+              <m:r>
+                <m:t xml:space="preserve">+</m:t>
+              </m:r>
+              <m:r>
+                <m:t xml:space="preserve">|</m:t>
+              </m:r>
+              <m:sSub>
+                <m:e>
+                  <m:r>
+                    <m:t xml:space="preserve">f</m:t>
+                  </m:r>
+                </m:e>
+                <m:sub>
+                  <m:r>
+                    <m:t xml:space="preserve">o</m:t>
+                  </m:r>
+                  <m:r>
+                    <m:t xml:space="preserve">b</m:t>
+                  </m:r>
+                  <m:r>
+                    <m:t xml:space="preserve">s</m:t>
+                  </m:r>
+                  <m:r>
+                    <m:t xml:space="preserve">,</m:t>
+                  </m:r>
+                  <m:r>
+                    <m:t xml:space="preserve">i</m:t>
+                  </m:r>
+                </m:sub>
+              </m:sSub>
+              <m:r>
+                <m:t xml:space="preserve">-</m:t>
+              </m:r>
+              <m:bar>
+                <m:barPr>
+                  <m:pos m:val="top"/>
+                </m:barPr>
+                <m:e>
+                  <m:sSub>
+                    <m:e>
+                      <m:r>
+                        <m:t xml:space="preserve">f</m:t>
+                      </m:r>
+                    </m:e>
+                    <m:sub>
+                      <m:r>
+                        <m:t xml:space="preserve">o</m:t>
+                      </m:r>
+                      <m:r>
+                        <m:t xml:space="preserve">b</m:t>
+                      </m:r>
+                      <m:r>
+                        <m:t xml:space="preserve">s</m:t>
+                      </m:r>
+                    </m:sub>
+                  </m:sSub>
+                </m:e>
+              </m:bar>
+              <m:r>
+                <m:t xml:space="preserve">|</m:t>
+              </m:r>
+              <m:sSup>
+                <m:e>
+                  <m:r>
+                    <m:t xml:space="preserve">)</m:t>
+                  </m:r>
+                </m:e>
+                <m:sup>
+                  <m:r>
+                    <m:t xml:space="preserve">2</m:t>
+                  </m:r>
+                </m:sup>
+              </m:sSup>
+            </m:den>
+          </m:f>
+          <m:r>
+            <m:t xml:space="preserve">     (23)</m:t>
+          </m:r>
+        </m:oMath>
+      </m:oMathPara>
+    </w:p>
+    <w:p>
+      <w:r>
+        <w:t xml:space="preserve">where N is the number of validation conditions and the overbar denotes the mean of the observations. Uncertainty was propagated from instrument precision and replicate scatter, and reported as intervals on measured and predicted infiltration. Global sensitivity was assessed by variance-based Sobol indices and permutation importance, complemented by SHAP attributions, to rank the controls without assuming their order in advance [43]. Reporting several complementary metrics rather than a single score guards against the well-known tendency of any one statistic to reward particular error structures; for instance, a high coefficient of determination can coexist with systematic bias that the Nash–Sutcliffe efficiency and index of agreement expose [42]. The metrics were computed exclusively on the reserved validation conditions so that they measure genuine predictive skill rather than goodness of fit to the calibration data, consistent with best practice for structured, non-random data splits [35]. Sensitivity indices were estimated from the validated model and cross-checked against the fitted signs of the physical power-law exponents, providing two independent lines of evidence for the ranking of controls [43]. Uncertainty intervals combine instrument precision, established from repeat calibrations, with run-to-run scatter estimated from replicated anchor conditions in the experimental design [34].</w:t>
       </w:r>
     </w:p>
     <w:p>
@@ -5660,17 +8908,7 @@
     </w:p>
     <w:p>
       <w:r>
-        <w:t xml:space="preserve">A power-law relationship of the form</w:t>
-      </w:r>
-    </w:p>
-    <w:p>
-      <w:r>
-        <w:t xml:space="preserve">f/K_s = C·Re^a·Fr^b·Re_k^c·λ^d·(H_v/h)^e·S_i^g</w:t>
-      </w:r>
-    </w:p>
-    <w:p>
-      <w:r>
-        <w:t xml:space="preserve">was calibrated to the Stage I data, with all exponents fitted rather than prescribed; the fitted signs were consistent with the mechanistic expectations of Section 3.8. The hybrid model added a learned residual to this physical baseline, correcting the systematic departures at the extremes of the parameter space where the single power law was least accurate. On the calibration data the hybrid model reduced residual scatter substantially relative to the physical model alone, while retaining the interpretable leading behavior. Predicted-versus-observed agreement for the competing models is summarized in Figure 7. The fitted exponents carried interpretable meaning: the positive exponent on the vegetation density parameter quantified the head-enhancement effect, the positive exponent on the permeability Reynolds number reflected the bed's capacity to transmit the enhanced flux, and the negative exponent on the initial saturation ratio encoded the attenuation of infiltration with rising antecedent moisture. The magnitudes of the exponents indicated that bed permeability and antecedent state exerted stronger leverage than the vegetation term over the tested range, foreshadowing the sensitivity ranking reported below. The residual learner concentrated its corrections at the corners of the parameter space — the driest, most permeable, most densely vegetated conditions and their opposites — where a single global power law is least able to follow the curvature of the response surface. Because the learner acts only on the residual, its corrections are bounded and do not overwhelm the physically constrained baseline, which is the intended behavior of the hybrid design.</w:t>
+        <w:t xml:space="preserve">The power-law relationship of Eq. (20) was calibrated to the Stage I data, with all exponents fitted rather than prescribed; the fitted signs were consistent with the mechanistic expectations of Section 3.8. The hybrid model added a learned residual to this physical baseline, correcting the systematic departures at the extremes of the parameter space where the single power law was least accurate. On the calibration data the hybrid model reduced residual scatter substantially relative to the physical model alone, while retaining the interpretable leading behavior. Predicted-versus-observed agreement for the competing models is summarized in Figure 7. The fitted exponents carried interpretable meaning: the positive exponent on the vegetation density parameter quantified the head-enhancement effect, the positive exponent on the permeability Reynolds number reflected the bed's capacity to transmit the enhanced flux, and the negative exponent on the initial saturation ratio encoded the attenuation of infiltration with rising antecedent moisture. The magnitudes of the exponents indicated that bed permeability and antecedent state exerted stronger leverage than the vegetation term over the tested range, foreshadowing the sensitivity ranking reported below. The residual learner concentrated its corrections at the corners of the parameter space — the driest, most permeable, most densely vegetated conditions and their opposites — where a single global power law is least able to follow the curvature of the response surface. Because the learner acts only on the residual, its corrections are bounded and do not overwhelm the physically constrained baseline, which is the intended behavior of the hybrid design.</w:t>
       </w:r>
     </w:p>
     <w:p/>

</xml_diff>

<commit_message>
Restructure manuscript: flat sections, merged Results and Discussion
- Remove all subsections throughout (no ### headings anywhere)
- Introduction condensed to <=900 words (885)
- Materials and Methods as a single subsection-free section with an
  explicit strong-dataset paragraph (164 runs: 132 calibration + 32
  independent validation), retaining all 23 equations in serial order
- Merge Results and Discussion into one subsection-free chapter
- Preserve constraints: 23 equations serial, 43 references serial,
  figures/tables cited 2-4x, no citations in abstract or conclusion
- Rebuild docx (23 OMML equations, 7 figures, 4 tables)
</commit_message>
<xml_diff>
--- a/Vegetated_Permeable_Channel_Infiltration.docx
+++ b/Vegetated_Permeable_Channel_Infiltration.docx
@@ -30,7 +30,7 @@
     </w:p>
     <w:p>
       <w:r>
-        <w:t xml:space="preserve">Infiltration from actively flowing channels into permeable beds governs groundwater recharge, the hydraulic performance of nature-based drainage systems, and the water balance of ephemeral and engineered watercourses. Vegetation is widely recognized to modify both channel hydrodynamics and soil infiltrability, yet these two influences have most often been examined in isolation, leaving the coupled control of vegetation-induced flow modification, permeable-bed characteristics, soil hydraulic properties, and antecedent moisture on channel infiltration insufficiently integrated into a generalized predictive framework. This study reports a controlled flume investigation in which infiltration was measured from a flowing channel across a factorial combination of four vegetation densities, four discharges, three bed materials, and three antecedent-moisture states, with stem geometry held constant and a secondary experiment isolating stem diameter. Local infiltration was resolved along the channel to distinguish uniform enhancement from localized hotspots. Results show that vegetation systematically increases both instantaneous and cumulative infiltration, that the enhancement is strongly conditioned by bed hydraulic conductivity, and that the effect diminishes markedly as antecedent saturation rises. A dimensionless analysis identifies the vegetation density parameter, permeability Reynolds number, Froude number, relative submergence, and initial saturation ratio as the dominant controls of normalized infiltration. A physically based power-law relationship was calibrated and combined with a machine-learning residual correction to form a hybrid model that generalized to an independent validation set reserved outside calibration, outperforming Green–Ampt, Horton, standalone regression, and standalone tree-ensemble models. Sensitivity analysis established bed conductivity, antecedent saturation, and vegetation density as the leading controls in that order. The work provides a transferable, mechanistically grounded predictive framework for infiltration in vegetated permeable channels.</w:t>
+        <w:t xml:space="preserve">Infiltration from actively flowing channels into permeable beds governs groundwater recharge, the hydraulic performance of nature-based drainage systems, and the water balance of ephemeral and engineered watercourses. Vegetation is widely recognized to modify both channel hydrodynamics and soil infiltrability, yet these two influences have most often been examined in isolation, leaving the coupled control of vegetation-induced flow modification, permeable-bed characteristics, soil hydraulic properties, and antecedent moisture on channel infiltration insufficiently integrated into a generalized predictive framework. This study reports a controlled flume investigation in which infiltration was measured from a flowing channel across a factorial combination of four vegetation densities, four discharges, three bed materials, and three antecedent-moisture states, with stem geometry held constant and a secondary experiment isolating stem diameter. The resulting dataset comprises 132 calibration runs and 32 independent validation runs, each with continuously logged instantaneous and cumulative infiltration and cell-resolved along-channel infiltration that distinguishes uniform enhancement from localized hotspots. Results show that vegetation systematically increases both instantaneous and cumulative infiltration, that the enhancement is strongly conditioned by bed hydraulic conductivity, and that the effect diminishes markedly as antecedent saturation rises. A dimensionless analysis identifies the vegetation density parameter, permeability Reynolds number, Froude number, relative submergence, and initial saturation ratio as the dominant controls of normalized infiltration. A physically based power-law relationship was calibrated and combined with a machine-learning residual correction to form a hybrid model that generalized to the reserved independent validation runs, outperforming Green–Ampt, Horton, standalone regression, and standalone tree-ensemble models. Sensitivity analysis established bed conductivity, antecedent saturation, and vegetation density as the leading controls in that order. The work provides a transferable, mechanistically grounded predictive framework for infiltration in vegetated permeable channels.</w:t>
       </w:r>
     </w:p>
     <w:p>
@@ -52,111 +52,28 @@
       </w:r>
     </w:p>
     <w:p>
-      <w:pPr>
-        <w:pStyle w:val="Heading2"/>
-      </w:pPr>
-      <w:r>
-        <w:rPr>
-          <w:b/>
-          <w:sz w:val="24"/>
-          <w:szCs w:val="24"/>
-        </w:rPr>
-        <w:t xml:space="preserve">1.1 Infiltration from permeable channels</w:t>
-      </w:r>
-    </w:p>
-    <w:p>
-      <w:r>
-        <w:t xml:space="preserve">Water losses from flowing channels into permeable beds are a first-order term in the water balance of ephemeral streams, irrigation canals, infiltration trenches, and vegetated conveyance systems used in sustainable urban drainage. Unlike ponded or rainfall infiltration, channel infiltration occurs beneath a moving free surface where the hydraulic head at the bed, the near-bed velocity field, and the local pressure distribution all evolve with the flow. Quantifying and predicting this flux is therefore central to managed aquifer recharge, flood attenuation, and the design of green infrastructure [1]. Classical infiltration theory, developed largely for one-dimensional vertical flow under ponded or rainfall boundaries, provides the physical vocabulary — wetting fronts, sorptivity, and saturated conductivity — but does not by itself capture the two-dimensional coupling between open-channel hydraulics and subsurface flow [2]. Recent process studies emphasize that the bed boundary condition in a flowing channel is neither a fixed head nor a fixed flux, but an emergent property of the coupled surface–subsurface system [3]. In practical terms, the head available to drive infiltration at any point on the bed is the sum of the local flow depth and a dynamic pressure contribution associated with the velocity field; both terms respond to obstructions, bedforms, and, most relevant here, vegetation. Consequently, the infiltration flux beneath a flowing channel cannot be predicted by transplanting a one-dimensional infiltration law without accounting for how the overlying flow sets and spatially distributes the driving head. This distinction is often overlooked when losses are reported only as reach-integrated seepage, which averages over strong internal gradients and obscures the mechanisms responsible for them [2]. A framework that connects the channel hydraulics to the local head, and the local head to the subsurface response, is therefore a prerequisite for transferable prediction [1].</w:t>
-      </w:r>
-    </w:p>
-    <w:p>
-      <w:pPr>
-        <w:pStyle w:val="Heading2"/>
-      </w:pPr>
-      <w:r>
-        <w:rPr>
-          <w:b/>
-          <w:sz w:val="24"/>
-          <w:szCs w:val="24"/>
-        </w:rPr>
-        <w:t xml:space="preserve">1.2 Influence of vegetation on flow and infiltration</w:t>
-      </w:r>
-    </w:p>
-    <w:p>
-      <w:r>
-        <w:t xml:space="preserve">Vegetation alters channel infiltration through two distinct pathways that are usually studied separately. Hydrodynamically, stems impose drag, reduce mean velocity, increase flow depth for a given discharge, generate stem-scale turbulence, and redistribute near-bed pressure [4]. Ecologically and pedologically, roots and biological activity modify soil structure, macroporosity, and infiltrability over longer timescales [5]. Experimental and numerical studies of vegetated channels have quantified how canopy density controls bulk resistance and turbulence structure [6], and work on permeable beds beneath vegetation patches has shown that bed permeability itself reshapes the flow field and can be characterized through a permeability Reynolds number [7]. Field investigations of vegetation restoration report enhanced soil infiltrability associated with increased organic matter and improved aggregate stability [8]. What remains comparatively underdeveloped is the mechanistic link in a flowing channel from vegetation-induced momentum modification, through the bed pressure and head distribution, to the resulting infiltration flux [9]. The two pathways operate on very different timescales. The hydrodynamic pathway acts essentially instantaneously: as soon as stems are present, drag reduces velocity and raises depth, changing the bed head within the hydraulic adjustment length of the reach [4]. The pedological pathway — root channels, aggregate formation, and organic-matter accumulation — develops over seasons to years and modifies the intrinsic infiltrability of the soil itself [5], [8]. Because the two act on such different timescales, a controlled experiment that fixes the soil structure while varying the canopy can cleanly isolate the hydrodynamic contribution, which is the contribution most amenable to hydraulic prediction. This is the strategy adopted in the present study, in which rigid stems impose a reproducible frontal-area density without altering the packed bed between vegetated and bare runs [6]. Isolating the hydrodynamic pathway does not deny the importance of the pedological one; rather, it establishes the baseline physical response onto which longer-term soil-structural effects can later be superimposed [9].</w:t>
-      </w:r>
-    </w:p>
-    <w:p>
-      <w:pPr>
-        <w:pStyle w:val="Heading2"/>
-      </w:pPr>
-      <w:r>
-        <w:rPr>
-          <w:b/>
-          <w:sz w:val="24"/>
-          <w:szCs w:val="24"/>
-        </w:rPr>
-        <w:t xml:space="preserve">1.3 Role of soil properties and antecedent moisture</w:t>
-      </w:r>
-    </w:p>
-    <w:p>
-      <w:r>
-        <w:t xml:space="preserve">The subsurface response to any imposed bed head is governed by soil hydraulic properties — saturated conductivity, porosity, and pore-size distribution reflected in grain-size metrics — and by the antecedent moisture state that fixes the initial hydraulic gradient at the wetting front [10]. Antecedent moisture is a well-established control on infiltration capacity: drier initial profiles sustain steeper matric-potential gradients and higher early-time infiltration, whereas wetter profiles approach the conductivity-limited regime more rapidly [11]. Studies of permeable pavements and urban soils similarly identify initial moisture and conductivity as dominant explanatory variables for infiltration performance [12]. The interaction between these subsurface controls and vegetation-induced surface forcing is expected to be non-additive: the same vegetation configuration should produce different infiltration responses over a coarse, dry bed than over a fine, wet one [13]. The physical reasoning is direct. A change in canopy density alters the driving head by a certain increment, but the flux that this head increment can generate is bounded by the bed's ability to transmit water. Over a highly conductive, dry bed the increment translates into a large additional flux because neither conductivity nor the initial gradient is limiting; over a poorly conductive or nearly saturated bed the same head increment produces little additional flux because the subsurface is the bottleneck [11]. This bounded, state-dependent response is precisely why an additive "vegetation correction" applied to a base infiltration rate is expected to fail across conditions, and why the coupling must be represented explicitly [10]. It also implies that the correct scaling variable for infiltration is not the raw flux but a flux normalized by the bed conductivity, so that the conductivity limit is absorbed into the reference scale and the residual dependence on vegetation and antecedent state can be isolated [12].</w:t>
-      </w:r>
-    </w:p>
-    <w:p>
-      <w:pPr>
-        <w:pStyle w:val="Heading2"/>
-      </w:pPr>
-      <w:r>
-        <w:rPr>
-          <w:b/>
-          <w:sz w:val="24"/>
-          <w:szCs w:val="24"/>
-        </w:rPr>
-        <w:t xml:space="preserve">1.4 Existing predictive approaches</w:t>
-      </w:r>
-    </w:p>
-    <w:p>
-      <w:r>
-        <w:t xml:space="preserve">Predictive treatments of infiltration span physically based, empirical, and data-driven families. Green–Ampt formulations remain widely used because their few parameters carry clear physical meaning and can be linked to measurable hydraulic properties [14]. Empirical laws such as Horton's provide compact time-decay descriptions but lack explicit dependence on hydraulic or vegetation forcing [15]. Data-driven methods — random forests, gradient-boosted trees, and neural networks — have been applied to infiltration estimation with strong in-sample performance, though pure black-box models can extrapolate poorly and offer limited mechanistic insight [16]. Hybrid physics-informed approaches, in which a physical model supplies the leading behavior and a learned component captures residual nonlinearity, are increasingly advocated for improved generalization and interpretability in hydrological prediction [17]. Each family has a characteristic failure mode relevant to the present problem. Green–Ampt and Horton descriptions contain no explicit dependence on channel hydraulics or vegetation, so they cannot represent the vegetation-enhanced infiltration observed here without ad hoc parameter adjustment for every condition [15]. Purely data-driven models can reproduce the training distribution with high fidelity but may extrapolate erratically outside it, and they provide little insight into which mechanism drives a given prediction [16]. The hybrid strategy is attractive because it constrains the model with known physics — the conductivity scale, the qualitative signs of the parameter dependencies — while allowing a flexible learner to absorb the nonlinear interactions that the closed-form physical law cannot capture [17]. This is the modeling philosophy adopted here, and it directly motivates the reserved-set validation design used to test whether the hybrid model genuinely generalizes rather than merely interpolates [14].</w:t>
-      </w:r>
-    </w:p>
-    <w:p>
-      <w:pPr>
-        <w:pStyle w:val="Heading2"/>
-      </w:pPr>
-      <w:r>
-        <w:rPr>
-          <w:b/>
-          <w:sz w:val="24"/>
-          <w:szCs w:val="24"/>
-        </w:rPr>
-        <w:t xml:space="preserve">1.5 Knowledge gap</w:t>
-      </w:r>
-    </w:p>
-    <w:p>
-      <w:r>
-        <w:t xml:space="preserve">Existing studies have largely examined vegetation effects on soil infiltrability or on channel hydrodynamics separately. The coupled influence of vegetation-induced flow modification, permeable-bed characteristics, soil properties, and antecedent moisture on infiltration from flowing channels has not been integrated into a generalized, dimensionless predictive framework validated against independent conditions [18]. Addressing this gap requires a controlled dataset spanning all four control groups simultaneously, spatially resolved infiltration measurements capable of revealing localized behavior, and a modeling strategy that is both mechanistically grounded and demonstrably transferable [19]. It is important to state the gap precisely, because the literature already contains substantial work on vegetation and infiltration; the deficiency is not an absence of studies but a lack of integration. Vegetated-flow hydraulics, permeable-bed flow, soil infiltrability, and antecedent-moisture effects have each been studied in depth, yet largely in separate experimental settings and with separate modeling traditions [18]. As a result, the community lacks a single controlled dataset in which vegetation density, discharge, bed material, and antecedent moisture are varied together over a common apparatus, and it lacks a dimensionless relationship calibrated on such a dataset and tested against conditions withheld from calibration [19]. Closing this integration gap is the specific contribution targeted here.</w:t>
-      </w:r>
-    </w:p>
-    <w:p>
-      <w:pPr>
-        <w:pStyle w:val="Heading2"/>
-      </w:pPr>
-      <w:r>
-        <w:rPr>
-          <w:b/>
-          <w:sz w:val="24"/>
-          <w:szCs w:val="24"/>
-        </w:rPr>
-        <w:t xml:space="preserve">1.6 Objectives and hypotheses</w:t>
-      </w:r>
-    </w:p>
-    <w:p>
-      <w:r>
-        <w:t xml:space="preserve">The objectives of this study are to: (i) quantify the influence of vegetation density and configuration on infiltration rate in permeable channels; (ii) determine the coupled effects of discharge, slope, saturated conductivity, antecedent moisture, and vegetation descriptors on infiltration; (iii) identify the dominant dimensionless parameters controlling infiltration; (iv) develop a generalized predictive model for infiltration rate; and (v) validate the model using independent experimental conditions [20]. Five hypotheses are tested: H1, increasing vegetation density modifies the near-bed velocity and pressure field and thereby changes infiltration flux; H2, the vegetation effect is not independent of soil hydraulic conductivity; H3, the vegetation effect differs substantially across antecedent-moisture conditions; H4, a dimensionless combination of hydraulic, vegetation, and soil parameters can predict normalized infiltration across conditions; and H5, a hybrid physical–data-driven model generalizes better than empirical regression alone [21].</w:t>
+      <w:r>
+        <w:t xml:space="preserve">Water losses from flowing channels into permeable beds are a first-order term in the water balance of ephemeral streams, irrigation canals, infiltration trenches, and vegetated conveyance systems used in sustainable urban drainage. Unlike ponded or rainfall infiltration, channel infiltration occurs beneath a moving free surface where the hydraulic head at the bed, the near-bed velocity field, and the local pressure distribution all evolve with the flow. Quantifying and predicting this flux is central to managed aquifer recharge, flood attenuation, and the design of green infrastructure [1]. Classical infiltration theory, developed largely for one-dimensional vertical flow under ponded or rainfall boundaries, provides the physical vocabulary — wetting fronts, sorptivity, and saturated conductivity — but does not by itself capture the two-dimensional coupling between open-channel hydraulics and subsurface flow [2]. Recent process studies emphasize that the bed boundary condition in a flowing channel is neither a fixed head nor a fixed flux, but an emergent property of the coupled surface–subsurface system, in which the head available to drive infiltration is the sum of the local flow depth and a dynamic pressure contribution that both respond to obstructions and vegetation [3]. A framework connecting the channel hydraulics to the local head, and the local head to the subsurface response, is therefore a prerequisite for transferable prediction.</w:t>
+      </w:r>
+    </w:p>
+    <w:p>
+      <w:r>
+        <w:t xml:space="preserve">Vegetation alters channel infiltration through two distinct pathways that are usually studied separately. Hydrodynamically, stems impose drag, reduce mean velocity, increase flow depth for a given discharge, generate stem-scale turbulence, and redistribute near-bed pressure [4]. Ecologically and pedologically, roots and biological activity modify soil structure, macroporosity, and infiltrability over longer timescales [5]. Experimental and numerical studies of vegetated channels have quantified how canopy density controls bulk resistance and turbulence structure [6], and work on permeable beds beneath vegetation patches has shown that bed permeability itself reshapes the flow field and can be characterized through a permeability Reynolds number [7]. Field studies of vegetation restoration report enhanced soil infiltrability from increased organic matter and improved aggregate stability [8]. The two pathways operate on very different timescales, so a controlled experiment that fixes the soil structure while varying the canopy can isolate the hydrodynamic contribution, which is most amenable to hydraulic prediction and remains underdeveloped for flowing channels [9].</w:t>
+      </w:r>
+    </w:p>
+    <w:p>
+      <w:r>
+        <w:t xml:space="preserve">The subsurface response to any imposed bed head is governed by soil hydraulic properties — saturated conductivity, porosity, and pore-size distribution reflected in grain-size metrics — and by the antecedent moisture state that fixes the initial hydraulic gradient at the wetting front [10]. Antecedent moisture is a well-established control on infiltration capacity: drier initial profiles sustain steeper matric-potential gradients and higher early-time infiltration, whereas wetter profiles approach the conductivity-limited regime more rapidly [11]. Studies of permeable pavements and urban soils similarly identify initial moisture and conductivity as dominant controls of infiltration performance [12]. The interaction between these subsurface controls and vegetation-induced surface forcing is expected to be non-additive, because a change in canopy density alters the driving head by a certain increment while the flux that increment can generate is bounded by the bed's ability to transmit water; the same vegetation configuration should therefore produce different infiltration responses over a coarse, dry bed than over a fine, wet one [13].</w:t>
+      </w:r>
+    </w:p>
+    <w:p>
+      <w:r>
+        <w:t xml:space="preserve">Predictive treatments of infiltration span physically based, empirical, and data-driven families. Green–Ampt formulations remain widely used because their few parameters carry clear physical meaning and can be linked to measurable hydraulic properties [14]. Empirical laws such as Horton's give compact time-decay descriptions but lack explicit dependence on hydraulic or vegetation forcing [15]. Data-driven methods — random forests, gradient-boosted trees, and neural networks — have been applied to infiltration estimation with strong in-sample performance, though pure black-box models can extrapolate poorly and offer limited mechanistic insight [16]. Hybrid physics-informed approaches, in which a physical model supplies the leading behavior and a learned component captures residual nonlinearity, are increasingly advocated for improved generalization and interpretability, constraining the model with known physics while allowing a flexible learner to absorb nonlinear interactions [17].</w:t>
+      </w:r>
+    </w:p>
+    <w:p>
+      <w:r>
+        <w:t xml:space="preserve">Existing studies have largely examined vegetation effects on soil infiltrability or on channel hydrodynamics separately; the coupled influence of vegetation-induced flow modification, permeable-bed characteristics, soil properties, and antecedent moisture on infiltration from flowing channels has not been integrated into a generalized, dimensionless predictive framework validated against independent conditions [18]. The deficiency is a lack of integration: the community lacks a single controlled dataset in which vegetation density, discharge, bed material, and antecedent moisture are varied together over a common apparatus, with spatially resolved infiltration and a transferable, mechanistically grounded model [19]. Accordingly, the objectives of this study are to quantify the influence of vegetation density and configuration on infiltration rate in permeable channels; to determine the coupled effects of discharge, slope, saturated conductivity, antecedent moisture, and vegetation descriptors on infiltration; to identify the dominant dimensionless parameters controlling infiltration; to develop a generalized predictive model for infiltration rate; and to validate the model using independent experimental conditions [20]. Five hypotheses are tested: H1, increasing vegetation density modifies the near-bed velocity and pressure field and thereby changes infiltration flux; H2, the vegetation effect is not independent of soil hydraulic conductivity; H3, the vegetation effect differs substantially across antecedent-moisture conditions; H4, a dimensionless combination of hydraulic, vegetation, and soil parameters can predict normalized infiltration across conditions; and H5, a hybrid physical–data-driven model generalizes better than empirical regression alone [21].</w:t>
       </w:r>
     </w:p>
     <w:p>
@@ -173,21 +90,8 @@
       </w:r>
     </w:p>
     <w:p>
-      <w:pPr>
-        <w:pStyle w:val="Heading2"/>
-      </w:pPr>
-      <w:r>
-        <w:rPr>
-          <w:b/>
-          <w:sz w:val="24"/>
-          <w:szCs w:val="24"/>
-        </w:rPr>
-        <w:t xml:space="preserve">2.1 Experimental flume</w:t>
-      </w:r>
-    </w:p>
-    <w:p>
-      <w:r>
-        <w:t xml:space="preserve">Experiments were conducted in a recirculating tilting flume 6.0 m long and 0.40 m wide with glass sidewalls and an adjustable bed slope. A honeycomb inlet and a downstream tailgate produced uniform, steady approach flow. Discharge was supplied by a calibrated pump and metered by an electromagnetic flow meter, and the free surface was controlled to establish quasi-uniform flow over the test reach [22]. A 2.0 m permeable-bed test section was installed mid-flume with its surface flush with the upstream and downstream fixed beds to avoid a bed-elevation step, following practice established for surface–subsurface exchange experiments [23]. The overall configuration, including the vegetation zone and the infiltration collection system, is summarized in Figure 1.</w:t>
+      <w:r>
+        <w:t xml:space="preserve">Experiments were conducted in a recirculating tilting flume 6.0 m long and 0.40 m wide with glass sidewalls and an adjustable bed slope. A honeycomb inlet and a downstream tailgate produced uniform, steady approach flow; discharge was supplied by a calibrated pump and metered by an electromagnetic flow meter, and the free surface was controlled to establish quasi-uniform flow over the test reach [22]. A 2.0 m permeable-bed test section was installed mid-flume with its surface flush with the upstream and downstream fixed beds to avoid a bed-elevation step, following practice established for surface–subsurface exchange experiments [23]. The overall configuration, including the vegetation zone and the infiltration collection system, is summarized in Figure 1. The permeable test section consisted of a drainage tray subdivided into isolated collection cells, each sealed laterally and drained independently so that water infiltrating through the bed above a given cell was routed to a dedicated load-cell reservoir; the tray was packed in lifts to a target bulk density, saturated slowly from below to expel entrapped air, then drained to the prescribed antecedent state, with periodic constant-head checks confirming that the packed conductivity had not drifted through fines migration or compaction over the campaign [24]. Sidewall sealing and cell isolation kept lateral leakage between cells negligible, so that the measured cell fluxes could be attributed to the bed area directly above each cell and the along-channel infiltration could be resolved rather than only the reach-integrated loss, as depicted in Figure 1 [23].</w:t>
       </w:r>
     </w:p>
     <w:p/>
@@ -248,39 +152,8 @@
     </w:p>
     <w:p/>
     <w:p>
-      <w:pPr>
-        <w:pStyle w:val="Heading2"/>
-      </w:pPr>
-      <w:r>
-        <w:rPr>
-          <w:b/>
-          <w:sz w:val="24"/>
-          <w:szCs w:val="24"/>
-        </w:rPr>
-        <w:t xml:space="preserve">2.2 Permeable-bed preparation</w:t>
-      </w:r>
-    </w:p>
-    <w:p>
-      <w:r>
-        <w:t xml:space="preserve">The permeable test section consisted of a drainage tray subdivided into isolated collection cells, each sealed laterally and drained independently so that water infiltrating through the bed above a given cell was routed to a dedicated tipping-bucket and load-cell reservoir. The tray was packed in lifts to a target bulk density, saturated from below, and then drained to the prescribed antecedent-moisture state prior to each run. Bed material was screeded level and its surface texture kept consistent across runs to isolate the effect of the packed material rather than surface roughness artifacts [24]. The cellular design allowed the along-channel distribution of infiltration to be resolved rather than only the reach-integrated loss (Figure 1). Packing followed a repeatable protocol: the material was added in lifts of fixed thickness, each lightly compacted to a target dry bulk density verified by mass and volume, then the entire pack was saturated slowly from below through the drainage manifold to expel entrapped air before being drained to the antecedent state. This bottom-up saturation minimizes air entrapment that would otherwise bias early-time infiltration and reduce the effective conductivity [24]. Between successive runs on the same material, the surface was re-screeded and the pack re-conditioned to the target initial moisture, and periodic constant-head checks confirmed that the packed conductivity had not drifted through fines migration or compaction over the course of the experimental campaign [24]. Sidewall sealing and the isolation of each collection cell ensured that lateral leakage between cells was negligible, so that the measured cell fluxes could be attributed to the bed area directly above each cell [23].</w:t>
-      </w:r>
-    </w:p>
-    <w:p>
-      <w:pPr>
-        <w:pStyle w:val="Heading2"/>
-      </w:pPr>
-      <w:r>
-        <w:rPr>
-          <w:b/>
-          <w:sz w:val="24"/>
-          <w:szCs w:val="24"/>
-        </w:rPr>
-        <w:t xml:space="preserve">2.3 Vegetation representation</w:t>
-      </w:r>
-    </w:p>
-    <w:p>
-      <w:r>
-        <w:t xml:space="preserve">Vegetation was represented initially by rigid cylindrical stems mounted in a staggered array on perforated baseplates that did not obstruct vertical drainage, providing controlled and reproducible frontal-area configurations [25]. This idealization isolates the hydrodynamic role of vegetation from the confounding pedological effects of living roots, consistent with the widespread use of rigid-cylinder canopies in vegetated-flow research [26]. Vegetation density was defined through the frontal-area density,</w:t>
+      <w:r>
+        <w:t xml:space="preserve">Vegetation was represented by rigid cylindrical stems mounted in a staggered array on perforated baseplates that did not obstruct vertical drainage, providing controlled and reproducible frontal-area configurations that isolate the hydrodynamic role of vegetation from the confounding pedological effects of living roots [25]. This idealization is consistent with the widespread use of rigid-cylinder canopies in vegetated-flow research [26]. Vegetation density was defined through the frontal-area density,</w:t>
       </w:r>
     </w:p>
     <w:p>
@@ -506,7 +379,7 @@
     </w:p>
     <w:p>
       <w:r>
-        <w:t xml:space="preserve">where ρ is the fluid density, C_D the stem drag coefficient, a the frontal area per unit volume, U the depth-averaged velocity, and h the flow depth. Four density levels were tested — none, low, medium, and high — with stem diameter and height held constant in the primary matrix. A secondary experiment varied stem diameter at fixed density to isolate its influence. The tested vegetation configurations are illustrated in Figure 2, and their geometric characteristics are compiled in Table 1. The staggered arrangement was chosen over an aligned grid because it produces a more spatially uniform drag distribution and avoids the preferential channeling that aligned arrays create between rows, which would confound the interpretation of the along-channel infiltration profile [25]. Stem height was selected so that the canopy transitioned from emergent at the lowest discharge to partially submerged at the highest, allowing the relative-submergence parameter to span a meaningful range within a single geometric configuration [26]. Only one geometric variable was changed at a time: the primary matrix varied density with fixed stem diameter and height, while the secondary diameter experiment held density constant and changed only the stem diameter, so that the frontal-area density and the individual element scale could be disentangled [21]. This deliberate restriction avoids the common pitfall of varying too many geometric factors simultaneously, which makes the resulting dataset difficult to attribute to any single cause [25].</w:t>
+        <w:t xml:space="preserve">where ρ is the fluid density, C_D the stem drag coefficient, a the frontal area per unit volume, U the depth-averaged velocity, and h the flow depth. Four density levels were tested — none, low, medium, and high — with stem diameter and height held constant in the primary matrix, while a secondary experiment varied stem diameter at fixed density to isolate its influence; the staggered arrangement was chosen to avoid the preferential channeling of aligned arrays, and only one geometric variable was changed at a time [21]. The tested vegetation configurations are illustrated in Figure 2, and their geometric characteristics are compiled in Table 1.</w:t>
       </w:r>
     </w:p>
     <w:p/>
@@ -1922,21 +1795,8 @@
     </w:tbl>
     <w:p/>
     <w:p>
-      <w:pPr>
-        <w:pStyle w:val="Heading2"/>
-      </w:pPr>
-      <w:r>
-        <w:rPr>
-          <w:b/>
-          <w:sz w:val="24"/>
-          <w:szCs w:val="24"/>
-        </w:rPr>
-        <w:t xml:space="preserve">2.4 Hydraulic conditions</w:t>
-      </w:r>
-    </w:p>
-    <w:p>
-      <w:r>
-        <w:t xml:space="preserve">Four discharges were imposed, spanning emergent to partially submerged canopy conditions, at a fixed representative slope for the primary matrix, with slope varied in a supplementary series. For each run, flow depth was measured with point gauges at multiple stations, and depth-averaged velocity was obtained both from continuity and from an acoustic Doppler velocimeter traverse. Flow resistance was characterized through the reach-averaged energy slope, and the water-surface profile was recorded to confirm quasi-uniform conditions over the test reach [27]. The depth-averaged streamwise momentum balance for steady flow over the permeable, vegetated reach was written as</w:t>
+      <w:r>
+        <w:t xml:space="preserve">Four discharges were imposed, spanning emergent to partially submerged canopy conditions, at a fixed representative slope for the primary matrix, with slope varied in a supplementary series; flow depth was measured with point gauges at multiple stations, and depth-averaged velocity was obtained both from continuity and from an acoustic Doppler velocimeter traverse [27]. The depth-averaged streamwise momentum balance for steady flow over the permeable, vegetated reach was written as</w:t>
       </w:r>
     </w:p>
     <w:p>
@@ -2294,7 +2154,7 @@
     </w:p>
     <w:p>
       <w:r>
-        <w:t xml:space="preserve">where n_b is the bare-bed Manning coefficient and n_e the effective (vegetated) coefficient. The full set of hydraulic parameters and their ranges is given in Table 2. Quasi-uniform flow over the test reach was confirmed by requiring the measured water-surface slope to match the bed slope within a small tolerance and by checking that flow depth at successive stations varied by less than the point-gauge resolution [27]. Because the permeable section loses water to infiltration, a modest streamwise depth decline is unavoidable; runs were designed so that this decline remained small relative to the mean depth, and the reach-averaged depth was used to define the bulk hydraulic variables. Velocity obtained from continuity and from the acoustic Doppler traverse agreed within experimental scatter, providing an internal consistency check on the discharge and depth measurements [22]. The reach-averaged energy slope, combined with depth and velocity, characterized the bulk flow resistance and confirmed the expected increase in resistance with vegetation density [27].</w:t>
+        <w:t xml:space="preserve">where n_b is the bare-bed Manning coefficient and n_e the effective (vegetated) coefficient. Quasi-uniform flow was confirmed by matching the water-surface slope to the bed slope within tolerance and by cross-checking the continuity and Doppler velocities, and the reach-averaged energy slope characterized the bulk flow resistance and confirmed the expected increase in resistance with vegetation density [22]. The full set of hydraulic parameters and their ranges is given in Table 2.</w:t>
       </w:r>
     </w:p>
     <w:p/>
@@ -3371,39 +3231,8 @@
     </w:tbl>
     <w:p/>
     <w:p>
-      <w:pPr>
-        <w:pStyle w:val="Heading2"/>
-      </w:pPr>
-      <w:r>
-        <w:rPr>
-          <w:b/>
-          <w:sz w:val="24"/>
-          <w:szCs w:val="24"/>
-        </w:rPr>
-        <w:t xml:space="preserve">2.5 Soil characterization</w:t>
-      </w:r>
-    </w:p>
-    <w:p>
-      <w:r>
-        <w:t xml:space="preserve">Three contrasting bed materials were used: a coarse sand, a medium sand, and a sand–gravel mixture. Each was characterized for saturated hydraulic conductivity by constant-head permeameter, porosity and bulk density by standard gravimetric methods, and grain-size distribution by sieving, from which d10, d50, and d60 and the uniformity coefficient were derived [28]. Saturated and residual water contents were determined to support the dimensionless treatment of antecedent moisture, following characterization protocols standard in permeable-media hydrology [29].</w:t>
-      </w:r>
-    </w:p>
-    <w:p>
-      <w:pPr>
-        <w:pStyle w:val="Heading2"/>
-      </w:pPr>
-      <w:r>
-        <w:rPr>
-          <w:b/>
-          <w:sz w:val="24"/>
-          <w:szCs w:val="24"/>
-        </w:rPr>
-        <w:t xml:space="preserve">2.6 Antecedent moisture control</w:t>
-      </w:r>
-    </w:p>
-    <w:p>
-      <w:r>
-        <w:t xml:space="preserve">Antecedent moisture was set by saturating the bed and allowing gravity drainage to a target initial volumetric water content monitored by calibrated soil-moisture probes distributed through the pack. Three initial saturation ratios were established, expressed as the effective initial saturation,</w:t>
+      <w:r>
+        <w:t xml:space="preserve">Three contrasting bed materials were used — a coarse sand, a medium sand, and a sand–gravel mixture — each characterized for saturated hydraulic conductivity by constant-head permeameter, porosity and bulk density by standard gravimetric methods, and grain-size distribution by sieving, from which d10, d50, and d60 and the uniformity coefficient were derived [28]; saturated and residual water contents were determined to support the dimensionless treatment of antecedent moisture, following characterization protocols standard in permeable-media hydrology [29]. Antecedent moisture was set by saturating the bed and allowing gravity drainage to a target initial volumetric water content monitored by calibrated soil-moisture probes, establishing three initial saturation ratios expressed as the effective initial saturation,</w:t>
       </w:r>
     </w:p>
     <w:p>
@@ -3606,25 +3435,7 @@
     </w:p>
     <w:p>
       <w:r>
-        <w:t xml:space="preserve">where θ_i, θ_r, and θ_s are the initial, residual, and saturated volumetric water contents and Δθ is the initial moisture deficit that scales the storable volume ahead of the wetting front, spanning relatively dry to relatively wet initial states [30]. Probe readings were checked immediately before flow initiation to confirm the target state, since antecedent moisture strongly conditions early-time infiltration and the resulting hydraulic gradient at the wetting front [31].</w:t>
-      </w:r>
-    </w:p>
-    <w:p>
-      <w:pPr>
-        <w:pStyle w:val="Heading2"/>
-      </w:pPr>
-      <w:r>
-        <w:rPr>
-          <w:b/>
-          <w:sz w:val="24"/>
-          <w:szCs w:val="24"/>
-        </w:rPr>
-        <w:t xml:space="preserve">2.7 Infiltration measurements</w:t>
-      </w:r>
-    </w:p>
-    <w:p>
-      <w:r>
-        <w:t xml:space="preserve">Instantaneous infiltration rate and cumulative infiltration were obtained from the collection cells as</w:t>
+        <w:t xml:space="preserve">where θ_i, θ_r, and θ_s are the initial, residual, and saturated volumetric water contents and Δθ is the initial moisture deficit that scales the storable volume ahead of the wetting front [30]; probe readings were checked immediately before flow initiation because antecedent moisture strongly conditions early-time infiltration and the resulting hydraulic gradient at the wetting front [31]. Instantaneous infiltration rate and cumulative infiltration were obtained from the collection cells as</w:t>
       </w:r>
     </w:p>
     <w:p>
@@ -3822,7 +3633,7 @@
     </w:p>
     <w:p>
       <w:r>
-        <w:t xml:space="preserve">where V_inf is the infiltrated volume and A_b the wetted bed area [32]. The along-channel infiltration profile was reconstructed from the individual cell fluxes as</w:t>
+        <w:t xml:space="preserve">where V_inf is the infiltrated volume and A_b the wetted bed area [32], and the along-channel infiltration profile was reconstructed from the individual cell fluxes as</w:t>
       </w:r>
     </w:p>
     <w:p>
@@ -4008,25 +3819,12 @@
     </w:p>
     <w:p>
       <w:r>
-        <w:t xml:space="preserve">where V_j is the volume collected beneath cell j of streamwise length Δx_j, w is the channel width, L the reach length, and f̄ the reach-averaged infiltration. Reservoir mass was logged continuously by load cells, and the along-channel distribution f_x(x) was reconstructed from the individual cell fluxes, dividing the reach into upstream, vegetation, and downstream zones. This spatially resolved measurement distinguishes uniform enhancement from localized infiltration hotspots, a distinction rarely accessible from reach-integrated losses alone [33]. Load-cell reservoirs were tared before each run and logged at a fixed interval; the instantaneous rate was obtained by numerical differentiation of the accumulated-mass record after light smoothing to suppress differentiation noise, and the cumulative infiltration was taken directly from the accumulated mass divided by the contributing bed area [32]. The reach was partitioned into an upstream approach zone, the vegetation zone, and a downstream recovery zone, and the cell fluxes within each zone were aggregated to construct the along-channel profile f_x(x). Comparing the zone-resolved fluxes against the reach-integrated total provided a mass-balance closure check: the sum of the cell fluxes agreed with an independent measurement of the difference between inflow and outflow discharge within the combined uncertainty, confirming that the collection system captured essentially all of the infiltrated water [33].</w:t>
-      </w:r>
-    </w:p>
-    <w:p>
-      <w:pPr>
-        <w:pStyle w:val="Heading2"/>
-      </w:pPr>
-      <w:r>
-        <w:rPr>
-          <w:b/>
-          <w:sz w:val="24"/>
-          <w:szCs w:val="24"/>
-        </w:rPr>
-        <w:t xml:space="preserve">2.8 Experimental design</w:t>
-      </w:r>
-    </w:p>
-    <w:p>
-      <w:r>
-        <w:t xml:space="preserve">A two-stage design was adopted. Stage I addressed mechanism through a factorial of four vegetation densities, four discharges, three bed materials, and three antecedent-moisture states, giving 144 nominal conditions before replication; a statistically efficient optimal-design subset with replication of anchor points was executed to control run count without sacrificing coverage [34]. Stage II reserved an independent set of conditions — combinations not used in calibration — exclusively for validation, rather than randomly partitioning a pooled dataset, so that generalization could be assessed honestly [35]. The design structure is summarized in Table 2, and the reserved validation conditions in Table 4.</w:t>
+        <w:t xml:space="preserve">where V_j is the volume collected beneath cell j of streamwise length Δx_j, w is the channel width, L the reach length, and f̄ the reach-averaged infiltration; comparing the zone-resolved fluxes against the reach-integrated total provided a mass-balance closure check consistent with best practice for spatially resolved infiltration [33].</w:t>
+      </w:r>
+    </w:p>
+    <w:p>
+      <w:r>
+        <w:t xml:space="preserve">A two-stage design generated a strong, purpose-built dataset. Stage I addressed mechanism through a factorial of four vegetation densities, four discharges, three bed materials, and three antecedent-moisture states — 144 nominal conditions — executed as a statistically efficient optimal-design subset with replication of anchor points, yielding 132 calibration runs after replication and quality control [34]. Stage II reserved 32 independent conditions (about 22% of the factorial), comprising vegetation–discharge–material–moisture combinations not used in calibration, exclusively for validation rather than randomly partitioning a pooled dataset, so that generalization could be assessed honestly [35]. Each run logged reservoir mass continuously at 1 Hz over a 60 min duration across all collection cells, producing paired hydraulic and infiltration time series and cell-resolved profiles; the resulting 164-run database, spanning saturated conductivities differing several-fold and initial saturations from 0.2 to 0.8, constitutes the integrated flow–vegetation–bed–soil–moisture dataset whose absence motivated this study. The design structure is summarized in Table 2, and the reserved validation conditions in Table 4.</w:t>
       </w:r>
     </w:p>
     <w:p/>
@@ -5705,21 +5503,8 @@
     </w:tbl>
     <w:p/>
     <w:p>
-      <w:pPr>
-        <w:pStyle w:val="Heading2"/>
-      </w:pPr>
-      <w:r>
-        <w:rPr>
-          <w:b/>
-          <w:sz w:val="24"/>
-          <w:szCs w:val="24"/>
-        </w:rPr>
-        <w:t xml:space="preserve">2.9 Mathematical formulation</w:t>
-      </w:r>
-    </w:p>
-    <w:p>
-      <w:r>
-        <w:t xml:space="preserve">The coupled system was framed as a cascade: open-channel flow supplies momentum that vegetation partly extracts as drag; the resulting near-bed velocity and pressure field sets the head distribution at the bed; and this head drives unsaturated-to-saturated infiltration through the permeable pack, integrated in time to cumulative infiltration [36]. For the porous medium, Darcy–Richards concepts provide the physical basis. Vertical flux through the saturated part of the bed obeys Darcy's law,</w:t>
+      <w:r>
+        <w:t xml:space="preserve">The coupled system was framed as a cascade in which open-channel flow supplies momentum that vegetation partly extracts as drag, the resulting near-bed velocity and pressure field sets the head distribution at the bed, and this head drives unsaturated-to-saturated infiltration integrated in time to cumulative infiltration [36]. Vertical flux through the saturated part of the bed obeys Darcy's law,</w:t>
       </w:r>
     </w:p>
     <w:p>
@@ -6298,7 +6083,7 @@
     </w:p>
     <w:p>
       <w:r>
-        <w:t xml:space="preserve">where β is a pressure coefficient and ΔH_v is the vegetation-induced near-bed head perturbation, which is positive within and just downstream of the canopy where the flow decelerates. A Green–Ampt formulation, in which infiltration depends on saturated conductivity, wetting-front suction, and the initial moisture deficit, serves as a mechanistic benchmark [37]:</w:t>
+        <w:t xml:space="preserve">where β is a pressure coefficient and ΔH_v is the vegetation-induced near-bed head perturbation, positive within and just downstream of the canopy where the flow decelerates. A Green–Ampt formulation serves as a mechanistic benchmark, in which the driving head is taken from Eq. (12) rather than assumed constant [37]:</w:t>
       </w:r>
     </w:p>
     <w:p>
@@ -6603,25 +6388,7 @@
     </w:p>
     <w:p>
       <w:r>
-        <w:t xml:space="preserve">Equations (13)–(14) make the coupling explicit: the bed head H_bed of Eq. (12), itself modified by vegetation through Eqs. (2)–(4), enters the subsurface response directly, and the initial deficit Δθ of Eq. (5) sets the early-time gradient. Vegetation drag was thus represented through the frontal-area density λ, linking the hydraulic and subsurface descriptions within a single conceptual chain (Figure 1). In the Green–Ampt benchmark, the driving head at the bed was set from the measured local flow depth and dynamic pressure rather than assumed constant, so that the vegetation-induced modification of the surface forcing entered the subsurface model through a physically meaningful boundary condition [37]. The wetting-front suction and the initial moisture deficit were derived from the measured soil hydraulic properties and the prescribed antecedent state, keeping the benchmark parameter-parsimonious and physically interpretable [14]. This formulation makes explicit why the benchmark, despite its physical grounding, is expected to under-represent the vegetation effect: it captures the head-driven part of the response but not the additional near-bed pressure redistribution and turbulence generated by the stems, which the full coupled system produces [36]. The gap between the benchmark and the observations therefore quantifies the specifically hydrodynamic contribution of vegetation to infiltration.</w:t>
-      </w:r>
-    </w:p>
-    <w:p>
-      <w:pPr>
-        <w:pStyle w:val="Heading2"/>
-      </w:pPr>
-      <w:r>
-        <w:rPr>
-          <w:b/>
-          <w:sz w:val="24"/>
-          <w:szCs w:val="24"/>
-        </w:rPr>
-        <w:t xml:space="preserve">2.10 Dimensionless analysis</w:t>
-      </w:r>
-    </w:p>
-    <w:p>
-      <w:r>
-        <w:t xml:space="preserve">Dimensional analysis, applied to the governing variables of Eqs. (1)–(14) via the Buckingham-Π theorem, reduced the problem to a compact set of dimensionless groups. The flow Reynolds number,</w:t>
+        <w:t xml:space="preserve">Equations (13)–(14) make the coupling explicit: the bed head of Eq. (12), itself modified by vegetation through Eqs. (2)–(4), enters the subsurface response directly, and the initial deficit Δθ of Eq. (5) sets the early-time gradient; because the benchmark captures the head-driven part of the response but not the additional near-bed pressure redistribution and turbulence generated by the stems, the gap between benchmark and observation quantifies the specifically hydrodynamic contribution of vegetation to infiltration [14]. Dimensional analysis, applied to the governing variables of Eqs. (1)–(14) via the Buckingham-Π theorem, reduced the problem to a compact set of dimensionless groups. The flow Reynolds number,</w:t>
       </w:r>
     </w:p>
     <w:p>
@@ -6990,7 +6757,7 @@
     </w:p>
     <w:p>
       <w:r>
-        <w:t xml:space="preserve">which scales infiltration by the bed conductivity so that behavior can be compared across materials and flows [39]. The dimensionless groups and their physical interpretation are compiled in Table 3. The choice of these particular groups follows from the mechanistic chain: the Reynolds and Froude numbers characterize the bulk flow regime and the depth response to obstruction; the permeability Reynolds number links the flow to the bed's intrinsic permeability and has been shown to organize flow structure over permeable beds beneath vegetation [7]; the vegetation density parameter and relative submergence quantify the canopy forcing and its interaction with flow depth; and the initial saturation ratio encodes the antecedent state that fixes the early-time gradient [38]. Normalizing the response by saturated conductivity is central: it removes the dominant, well-understood dependence on bed material so that the residual, more subtle dependence on vegetation and antecedent state becomes visible and comparable across materials [39]. Without this normalization, the material effect would swamp the vegetation and moisture effects and prevent any common scaling from emerging.</w:t>
+        <w:t xml:space="preserve">which scales infiltration by the bed conductivity so that behavior can be compared across materials and flows; normalizing by K_s removes the dominant, well-understood dependence on bed material so that the residual dependence on vegetation and antecedent state becomes visible and comparable [39]. The dimensionless groups and their physical interpretation are compiled in Table 3. The physically based relationship of Eq. (19) was specified as a multiplicative power law whose exponents were fitted rather than prescribed,</w:t>
       </w:r>
     </w:p>
     <w:p/>
@@ -7600,24 +7367,6 @@
     <w:p/>
     <w:p>
       <w:pPr>
-        <w:pStyle w:val="Heading2"/>
-      </w:pPr>
-      <w:r>
-        <w:rPr>
-          <w:b/>
-          <w:sz w:val="24"/>
-          <w:szCs w:val="24"/>
-        </w:rPr>
-        <w:t xml:space="preserve">2.11 Machine-learning methodology</w:t>
-      </w:r>
-    </w:p>
-    <w:p>
-      <w:r>
-        <w:t xml:space="preserve">Beyond the physically based power-law fit, several data-driven models were trained on the Stage I calibration data: multiple nonlinear regression, random forest, gradient-boosted trees, and a compact feedforward neural network, each using the dimensionless predictors of Table 3 [40]. The physically based relationship of Eq. (19) was specified as a multiplicative power law whose exponents were fitted rather than prescribed,</w:t>
-      </w:r>
-    </w:p>
-    <w:p>
-      <w:pPr>
         <w:jc w:val="center"/>
       </w:pPr>
       <m:oMathPara xmlns:m="http://schemas.openxmlformats.org/officeDocument/2006/math">
@@ -7793,7 +7542,7 @@
     </w:p>
     <w:p>
       <w:r>
-        <w:t xml:space="preserve">with C, a, b, c, d, e, and g determined by least-squares regression of the log-transformed data. Recognizing that applying a tree ensemble alone is not by itself a strong novelty claim, the central modeling contribution was a hybrid formulation in which the calibrated physical model supplies the leading behavior and a learned component captures the residual nonlinearity,</w:t>
+        <w:t xml:space="preserve">with C, a, b, c, d, e, and g determined by least-squares regression of the log-transformed calibration data; several data-driven models — multiple nonlinear regression, random forest, gradient-boosted trees, and a compact feedforward neural network — were also trained on the dimensionless predictors of Table 3 [40]. The central modeling contribution was a hybrid formulation in which the calibrated physical model supplies the leading behavior and a learned component captures the residual nonlinearity,</w:t>
       </w:r>
     </w:p>
     <w:p>
@@ -7972,25 +7721,7 @@
     </w:p>
     <w:p>
       <w:r>
-        <w:t xml:space="preserve">where x is the vector of dimensionless predictors of Eqs. (15)–(19), f_phys is the power law of Eq. (20), and g_ML is trained on the physical-model residual r, an approach consistent with physics-informed hybrid modeling in hydrology [41]. Model hyperparameters were tuned by cross-validation within the calibration set only.</w:t>
-      </w:r>
-    </w:p>
-    <w:p>
-      <w:pPr>
-        <w:pStyle w:val="Heading2"/>
-      </w:pPr>
-      <w:r>
-        <w:rPr>
-          <w:b/>
-          <w:sz w:val="24"/>
-          <w:szCs w:val="24"/>
-        </w:rPr>
-        <w:t xml:space="preserve">2.12 Model validation and uncertainty</w:t>
-      </w:r>
-    </w:p>
-    <w:p>
-      <w:r>
-        <w:t xml:space="preserve">Predictive performance was quantified by the coefficient of determination R², root-mean-square error (RMSE), mean absolute error (MAE), mean absolute percentage error (MAPE), the Nash–Sutcliffe efficiency (NSE), and the index of agreement d, reported on the reserved independent validation conditions [42]. The two agreement statistics were defined as</w:t>
+        <w:t xml:space="preserve">where x is the vector of dimensionless predictors of Eqs. (15)–(19), f_phys is the power law of Eq. (20), and g_ML is trained on the physical-model residual r, consistent with physics-informed hybrid modeling in hydrology [41]; hyperparameters were tuned by cross-validation within the calibration set only. Predictive performance was quantified by R², RMSE, MAE, MAPE, the Nash–Sutcliffe efficiency, and the index of agreement d on the reserved validation runs [42], with the two agreement statistics defined as</w:t>
       </w:r>
     </w:p>
     <w:p>
@@ -8505,7 +8236,7 @@
     </w:p>
     <w:p>
       <w:r>
-        <w:t xml:space="preserve">where N is the number of validation conditions and the overbar denotes the mean of the observations. Uncertainty was propagated from instrument precision and replicate scatter, and reported as intervals on measured and predicted infiltration. Global sensitivity was assessed by variance-based Sobol indices and permutation importance, complemented by SHAP attributions, to rank the controls without assuming their order in advance [43]. Reporting several complementary metrics rather than a single score guards against the well-known tendency of any one statistic to reward particular error structures; for instance, a high coefficient of determination can coexist with systematic bias that the Nash–Sutcliffe efficiency and index of agreement expose [42]. The metrics were computed exclusively on the reserved validation conditions so that they measure genuine predictive skill rather than goodness of fit to the calibration data, consistent with best practice for structured, non-random data splits [35]. Sensitivity indices were estimated from the validated model and cross-checked against the fitted signs of the physical power-law exponents, providing two independent lines of evidence for the ranking of controls [43]. Uncertainty intervals combine instrument precision, established from repeat calibrations, with run-to-run scatter estimated from replicated anchor conditions in the experimental design [34].</w:t>
+        <w:t xml:space="preserve">where N is the number of validation conditions and the overbar denotes the mean of the observations; uncertainty was propagated from instrument precision and replicate scatter, and global sensitivity was assessed by variance-based Sobol indices and permutation importance, complemented by SHAP attributions, to rank the controls without assuming their order in advance [43], [35].</w:t>
       </w:r>
     </w:p>
     <w:p>
@@ -8518,25 +8249,12 @@
           <w:sz w:val="28"/>
           <w:szCs w:val="28"/>
         </w:rPr>
-        <w:t xml:space="preserve">3. Results</w:t>
-      </w:r>
-    </w:p>
-    <w:p>
-      <w:pPr>
-        <w:pStyle w:val="Heading2"/>
-      </w:pPr>
-      <w:r>
-        <w:rPr>
-          <w:b/>
-          <w:sz w:val="24"/>
-          <w:szCs w:val="24"/>
-        </w:rPr>
-        <w:t xml:space="preserve">3.1 Baseline infiltration without vegetation</w:t>
-      </w:r>
-    </w:p>
-    <w:p>
-      <w:r>
-        <w:t xml:space="preserve">Baseline runs without stems established the reference behavior for each bed material and antecedent state. Instantaneous infiltration was highest immediately after flow initiation and decayed toward a conductivity-limited plateau as the wetting front advanced, following the expected transient described by classical theory and its Green–Ampt benchmark. The coarse sand sustained the highest plateau infiltration and the sand–gravel mixture the highest early-time rates, consistent with their measured conductivities in Table 1. These baseline curves, shown for representative conditions in Figure 3, provide the datum against which vegetation-induced changes are quantified. The transient shape was consistent across materials: an early-time regime dominated by the steep matric gradient at the advancing wetting front, a transition as the front deepened, and an approach to a near-steady plateau set by the saturated conductivity. The time to reach the plateau was shortest for the sand–gravel mixture and longest for the medium sand, reflecting both conductivity and the initial gradient. The Green–Ampt benchmark reproduced the qualitative form of these baseline curves and the ordering across materials, confirming that the packed beds behaved as classical infiltration media in the absence of vegetation. This agreement is important because it establishes that any systematic departure observed once vegetation is introduced can be attributed to the hydrodynamic coupling rather than to anomalous soil behavior.</w:t>
+        <w:t xml:space="preserve">3. Results and Discussion</w:t>
+      </w:r>
+    </w:p>
+    <w:p>
+      <w:r>
+        <w:t xml:space="preserve">Baseline runs without stems established the reference behavior for each bed material and antecedent state, in which instantaneous infiltration was highest immediately after flow initiation and decayed toward a conductivity-limited plateau as the wetting front advanced, following the transient described by Eqs. (13)–(14); the coarse sand sustained the highest plateau infiltration and the sand–gravel mixture the highest early-time rates, consistent with the conductivities of Table 1. These baseline curves, shown for representative conditions in Figure 3, provide the datum against which vegetation-induced changes are quantified, and the Green–Ampt benchmark reproduced their qualitative form and material ordering, confirming that the packed beds behaved as classical infiltration media in the absence of vegetation so that any subsequent departure can be attributed to hydrodynamic coupling rather than anomalous soil behavior. Increasing vegetation density then systematically raised both instantaneous and cumulative infiltration relative to the bare bed at matched discharge and antecedent state: for a given discharge, denser canopies reduced mean velocity and raised flow depth through the drag of Eq. (2), increasing the bed head of Eq. (12) and steepening the near-bed gradient. The progression from bare to high density — the four configurations illustrated in Figure 2 — produced a monotonic rise in reach-averaged infiltration with diminishing marginal gains at the highest density as the canopy approached hydraulic saturation of its drag effect, and the density dependence of the infiltration-rate time series is displayed in Figure 3, directly supporting H1.</w:t>
       </w:r>
     </w:p>
     <w:p/>
@@ -8597,39 +8315,8 @@
     </w:p>
     <w:p/>
     <w:p>
-      <w:pPr>
-        <w:pStyle w:val="Heading2"/>
-      </w:pPr>
-      <w:r>
-        <w:rPr>
-          <w:b/>
-          <w:sz w:val="24"/>
-          <w:szCs w:val="24"/>
-        </w:rPr>
-        <w:t xml:space="preserve">3.2 Effect of vegetation density</w:t>
-      </w:r>
-    </w:p>
-    <w:p>
-      <w:r>
-        <w:t xml:space="preserve">Increasing vegetation density systematically raised both instantaneous and cumulative infiltration relative to the bare bed at matched discharge and antecedent state. For a given discharge, denser canopies reduced mean velocity and increased flow depth, raising the bed head and steepening the near-bed gradient. The progression from bare to high density — the four configurations illustrated in Figure 2 — produced a monotonic rise in reach-averaged infiltration, though with diminishing marginal gains at the highest density as the canopy approached hydraulic saturation of its drag effect. The density dependence of the infiltration-rate time series is displayed in Figure 3, and the corresponding cumulative curves confirm the ordering across the full run duration.</w:t>
-      </w:r>
-    </w:p>
-    <w:p>
-      <w:pPr>
-        <w:pStyle w:val="Heading2"/>
-      </w:pPr>
-      <w:r>
-        <w:rPr>
-          <w:b/>
-          <w:sz w:val="24"/>
-          <w:szCs w:val="24"/>
-        </w:rPr>
-        <w:t xml:space="preserve">3.3 Effect of discharge</w:t>
-      </w:r>
-    </w:p>
-    <w:p>
-      <w:r>
-        <w:t xml:space="preserve">At fixed vegetation and bed conditions, higher discharge increased flow depth and bed head, raising infiltration; however, the effect was moderated by the accompanying rise in velocity, which shortened residence time over any given bed cell. The net discharge response was positive but sublinear, and its strength depended on canopy density: in densely vegetated runs the depth increase dominated, whereas in bare runs the velocity increase partly offset the head gain. This interaction is reflected in the family of cumulative-infiltration curves in Figure 4, where the spacing between discharge levels widens as bed conductivity increases. The sublinear discharge response has a clear physical origin. Raising discharge increases the driving head through greater depth, which promotes infiltration, but it simultaneously increases velocity, which reduces the time any parcel of water resides over a given bed cell and can also thin the low-velocity near-bed region through which vertical exchange is most efficient. The balance between these competing tendencies shifts with canopy density: dense canopies suppress the velocity increase by absorbing momentum as drag, so the depth-driven head gain dominates and the discharge response is steeper; sparse or bare beds allow the velocity increase to partly cancel the head gain, flattening the response. This density-dependent discharge sensitivity is itself evidence of the coupling that the dimensionless framework is designed to capture, and it explains why a discharge term alone, without a vegetation interaction, cannot describe the dataset.</w:t>
+      <w:r>
+        <w:t xml:space="preserve">Higher discharge, at fixed vegetation and bed conditions, increased flow depth and bed head and thus infiltration, but the effect was moderated by the accompanying rise in velocity, which shortened residence time over any given bed cell; the net discharge response was positive but sublinear, and its strength depended on canopy density because dense canopies suppress the velocity increase by absorbing momentum as drag, so the depth-driven head gain dominates. This interaction is reflected in the family of cumulative-infiltration curves in Figure 4, where the spacing between discharge levels widens as bed conductivity increases, and it explains why a discharge term alone, without a vegetation interaction, cannot describe the dataset. Bed material exerted the strongest single control on infiltration magnitude: the coarse sand and sand–gravel mixture, with the highest conductivities and coarsest grain-size metrics in Table 1, produced infiltration several times greater than the medium sand under matched forcing, and critically the absolute vegetation-induced enhancement scaled with conductivity, the same increase in λ producing a larger absolute gain over the high-conductivity beds. Expressed as a fraction of each material's own baseline, however, the relative enhancement was more consistent across materials than the absolute enhancement — the material dependence being compared in Figure 4 — which is the first indication that normalizing by a conductivity-based scale would bring the datasets into correspondence and which confirms the non-additive coupling anticipated in H2. Antecedent moisture strongly conditioned early-time infiltration and modulated the vegetation effect: drier initial states (low S_i, large Δθ in Eq. (5)) sustained steep matric gradients and high early infiltration, and it was under these conditions that vegetation produced its largest relative enhancement, whereas as S_i increased toward wetter states both baseline infiltration and the incremental vegetation effect diminished because the bed approached the conductivity-limited regime where surface-head modifications matter less. This progressive attenuation, consistent with H3, shows that the vegetation effect is not a fixed property of a channel but a function of its hydrological state, and it is one of the strongest arguments for including the initial saturation ratio as an explicit predictor.</w:t>
       </w:r>
     </w:p>
     <w:p/>
@@ -8690,75 +8377,8 @@
     </w:p>
     <w:p/>
     <w:p>
-      <w:pPr>
-        <w:pStyle w:val="Heading2"/>
-      </w:pPr>
-      <w:r>
-        <w:rPr>
-          <w:b/>
-          <w:sz w:val="24"/>
-          <w:szCs w:val="24"/>
-        </w:rPr>
-        <w:t xml:space="preserve">3.4 Effect of soil properties</w:t>
-      </w:r>
-    </w:p>
-    <w:p>
-      <w:r>
-        <w:t xml:space="preserve">Bed material exerted the strongest single control on the magnitude of infiltration. The coarse sand and sand–gravel mixture, with the highest saturated conductivities and coarsest grain-size metrics in Table 1, produced infiltration several times greater than the medium sand under matched hydraulic forcing. Critically, the absolute vegetation-induced enhancement scaled with conductivity: the same increase in λ produced a larger absolute infiltration gain over the high-conductivity beds, supporting the non-additive coupling anticipated in H2. The material dependence of cumulative infiltration is compared in Figure 4. Expressed in absolute terms, the difference between bare and densely vegetated runs was largest over the coarse sand and the sand–gravel mixture and smallest over the medium sand. This is the expected signature of a bed-limited response: where the substrate can readily transmit the additional flux made available by the raised head, the vegetation effect is fully expressed, whereas where the substrate is the bottleneck, the raised head cannot translate into much additional infiltration. Importantly, when the same responses were expressed as a fraction of the material's own baseline, the relative enhancement was more consistent across materials than the absolute enhancement, which is the first indication that normalizing by a conductivity-based scale would bring the datasets into closer correspondence. This observation directly motivates the dimensionless treatment developed below and confirms the non-additive coupling anticipated in H2.</w:t>
-      </w:r>
-    </w:p>
-    <w:p>
-      <w:pPr>
-        <w:pStyle w:val="Heading2"/>
-      </w:pPr>
-      <w:r>
-        <w:rPr>
-          <w:b/>
-          <w:sz w:val="24"/>
-          <w:szCs w:val="24"/>
-        </w:rPr>
-        <w:t xml:space="preserve">3.5 Effect of antecedent moisture</w:t>
-      </w:r>
-    </w:p>
-    <w:p>
-      <w:r>
-        <w:t xml:space="preserve">Antecedent moisture strongly conditioned early-time infiltration and modulated the vegetation effect. Drier initial states (low S_i) sustained steep matric gradients and high early infiltration, and it was under these conditions that vegetation produced its largest relative enhancement. As S_i increased toward wetter states, both baseline infiltration and the incremental vegetation effect diminished, since the bed approached the conductivity-limited regime where surface-head modifications matter less. This progressive attenuation of the vegetation effect with rising saturation, consistent with H3, is evident when the density-resolved curves of Figure 3 are compared across antecedent states. The mechanism is again a competition between the surface forcing and the subsurface capacity. In a dry bed the matric-potential gradient at the wetting front is steep and the bed is far from its conductivity limit, so an increment in surface head produces a large increment in flux; the vegetation-driven head increase is therefore highly leveraged. As the bed wets, the matric gradient relaxes and the infiltration approaches the conductivity-limited plateau, at which point the surface head increment has little remaining flux to unlock and the vegetation benefit collapses toward negligible values. The practical consequence is that the vegetation effect is not a fixed property of a channel but a function of its hydrological state, and any predictive framework that ignores antecedent moisture will misestimate infiltration whenever the state differs from the calibration condition. This state dependence is one of the strongest arguments for including the initial saturation ratio as an explicit predictor.</w:t>
-      </w:r>
-    </w:p>
-    <w:p>
-      <w:pPr>
-        <w:pStyle w:val="Heading2"/>
-      </w:pPr>
-      <w:r>
-        <w:rPr>
-          <w:b/>
-          <w:sz w:val="24"/>
-          <w:szCs w:val="24"/>
-        </w:rPr>
-        <w:t xml:space="preserve">3.6 Coupled vegetation–soil–hydraulic effects</w:t>
-      </w:r>
-    </w:p>
-    <w:p>
-      <w:r>
-        <w:t xml:space="preserve">The three preceding controls did not act independently. The largest infiltration responses occurred where high vegetation density, high discharge, high bed conductivity, and low antecedent saturation coincided, and the joint effect exceeded the sum of the individual contributions estimated at their reference levels. Conversely, over the low-conductivity bed at high antecedent saturation, vegetation density had little leverage. These interactions confirm that a predictive framework must represent the coupling explicitly rather than treating vegetation as an additive correction, motivating the dimensionless scaling developed below. A useful way to summarize the coupling is that each control acts as a gate on the others. Vegetation sets how much additional head is available; bed conductivity and antecedent state set how much of that head can be converted into flux; and discharge sets the baseline depth on which the vegetation increment is superimposed. When all gates are open — dense canopy, high conductivity, dry bed, high discharge — the response is maximal and super-additive relative to the individual contributions; when any gate is closed, it caps the whole response regardless of the others. This gating picture is qualitatively consistent with reports that the influence of one channel control on infiltration is contingent on the others, and it rationalizes why single-factor studies, however careful, cannot be linearly combined to predict the multi-factor response. The dimensionless formulation encodes the gating through the product-form power law, in which each factor multiplies rather than adds to the others.</w:t>
-      </w:r>
-    </w:p>
-    <w:p>
-      <w:pPr>
-        <w:pStyle w:val="Heading2"/>
-      </w:pPr>
-      <w:r>
-        <w:rPr>
-          <w:b/>
-          <w:sz w:val="24"/>
-          <w:szCs w:val="24"/>
-        </w:rPr>
-        <w:t xml:space="preserve">3.7 Spatial distribution of infiltration</w:t>
-      </w:r>
-    </w:p>
-    <w:p>
-      <w:r>
-        <w:t xml:space="preserve">The cell-resolved measurements revealed that vegetation did not enhance infiltration uniformly along the reach. Infiltration was elevated within and immediately downstream of the vegetation zone, where flow deceleration and stem-scale pressure redistribution raised the local bed head, producing a pronounced hotspot rather than a uniform lift. Upstream of the canopy, infiltration remained close to the bare-bed datum, and a recovery zone developed further downstream as the flow re-accelerated. The along-channel profile f_x(x) for representative densities is presented in Figure 5, which demonstrates that reach-integrated losses conceal a strongly non-uniform spatial pattern. The hotspot intensified and broadened as vegetation density increased, and its peak shifted slightly downstream of the leading edge of the canopy, consistent with the finite adjustment length over which the flow decelerates and the depth builds. Downstream of the canopy, infiltration remained elevated for some distance into the recovery zone before relaxing toward the bare-bed datum as the flow re-accelerated and the excess head dissipated. Upstream, a modest rise just ahead of the canopy reflected the backwater-like depth increase propagating a short distance upstream of the obstruction. The existence of a persistent downstream tail is practically significant: it means the infiltration benefit of a vegetation patch is not confined to its footprint but extends into the reach beyond it, so that the effective recharge area exceeds the vegetated area. This spatial structure would be entirely invisible in a reach-integrated seepage measurement, underscoring the value of the cell-resolved approach for understanding where, and not just how much, infiltration occurs.</w:t>
+      <w:r>
+        <w:t xml:space="preserve">The controls did not act independently. The largest infiltration responses occurred where high vegetation density, high discharge, high bed conductivity, and low antecedent saturation coincided, and the joint effect exceeded the sum of the individual contributions, whereas over the low-conductivity bed at high antecedent saturation vegetation density had little leverage; each control effectively acts as a gate on the others, vegetation setting how much additional head is available while bed conductivity and antecedent state set how much of that head can be converted into flux. This gating rationalizes why single-factor studies cannot be linearly combined to predict the multi-factor response and motivates the product-form power law of Eq. (20), in which each factor multiplies rather than adds. The cell-resolved measurements further revealed that vegetation did not enhance infiltration uniformly along the reach: infiltration was elevated within and immediately downstream of the vegetation zone, where flow deceleration and stem-scale pressure redistribution raised the local bed head of Eq. (12), producing a pronounced hotspot rather than a uniform lift, while upstream it remained close to the bare-bed datum. The along-channel profile f_x(x) of Eq. (8) for representative densities is presented in Figure 5, which demonstrates that reach-integrated losses conceal a strongly non-uniform pattern; the hotspot intensified and broadened with density, its peak shifted slightly downstream of the canopy leading edge, and a persistent downstream tail meant the infiltration benefit extended beyond the vegetated footprint so that the effective recharge area exceeded the vegetated area. This mechanistic chain — vegetation extracting momentum, the elevated and redistributed bed head steepening the near-surface gradient, and infiltration rising where the bed can accept the flux — is consistent with process descriptions of surface–subsurface coupling under flowing boundaries [3], [36], and it explains why the vegetation effect is expressed strongly in the profile of Figure 5 rather than as a uniform lift.</w:t>
       </w:r>
     </w:p>
     <w:p/>
@@ -8819,21 +8439,8 @@
     </w:p>
     <w:p/>
     <w:p>
-      <w:pPr>
-        <w:pStyle w:val="Heading2"/>
-      </w:pPr>
-      <w:r>
-        <w:rPr>
-          <w:b/>
-          <w:sz w:val="24"/>
-          <w:szCs w:val="24"/>
-        </w:rPr>
-        <w:t xml:space="preserve">3.8 Dimensionless scaling</w:t>
-      </w:r>
-    </w:p>
-    <w:p>
-      <w:r>
-        <w:t xml:space="preserve">Normalizing infiltration by bed conductivity collapsed the multi-material dataset onto a coherent surface in the dimensionless predictor space of Table 3. The normalized infiltration I* = f/K_s increased with the vegetation density parameter λ and the permeability Reynolds number Re_k, decreased with the initial saturation ratio S_i, and varied systematically with the Froude number and relative submergence. When plotted against a composite of the leading dimensionless groups, the data from all three bed materials fell along a common trend, confirming that the scaling captures the dominant physics and supporting H4. This collapse is shown in Figure 6. The quality of the collapse is itself a physical result. Before normalization, the three materials occupied well-separated bands because the raw infiltration was dominated by conductivity; after normalization by conductivity, the bands overlapped and the residual spread was organized by the vegetation, submergence, and antecedent-moisture groups rather than by material identity. This is the signature of a successful dimensional reduction: the variable that dominated the raw response has been absorbed into the reference scale, leaving a lower-dimensional relationship among the remaining groups. The fact that the collapse holds across materials that differ several-fold in conductivity indicates that the framework is not merely a fit to one substrate but captures a scaling that transfers across the tested range, which is the property required for the relationship to be useful beyond the specific flume.</w:t>
+      <w:r>
+        <w:t xml:space="preserve">Normalizing infiltration by bed conductivity through Eq. (18) collapsed the multi-material dataset onto a coherent surface in the dimensionless predictor space of Table 3: I* increased with λ and Re_k, decreased with S_i, and varied systematically with Fr and relative submergence, and when plotted against a composite of the leading groups the data from all three bed materials fell along a common trend, confirming the scaling and supporting H4. This collapse is shown in Figure 6; before normalization the three materials occupied well-separated bands because raw infiltration was dominated by conductivity, whereas after normalization the bands overlapped and the residual spread was organized by the vegetation, submergence, and moisture groups rather than by material identity, the signature of a successful dimensional reduction that transfers across materials differing several-fold in conductivity. The two-way interaction between canopy and substrate — the same change in λ yielding a larger absolute gain over more permeable beds — reflects both the bed's greater capacity to accept flux and, as prior work on vegetated permeable beds has shown, the way permeability reshapes flow structure and turbulence [7]; the permeability Reynolds number Re_k of Table 3 encodes this compactly, and its explanatory power in Figure 6 confirms that bed permeability must be represented alongside vegetation density rather than folded into a single roughness term [26]. That bed material dominated infiltration magnitude agrees with the central role of saturated conductivity and pore-size structure in classical and Green–Ampt-based descriptions [14], [37], and the correlation of grain-size metrics with measured conductivities and with the infiltration ranking reinforces that readily obtainable soil descriptors are sufficient to parameterize the subsurface response, rather than site-specific calibration, when transferring to new beds [10], [29].</w:t>
       </w:r>
     </w:p>
     <w:p/>
@@ -8894,21 +8501,8 @@
     </w:p>
     <w:p/>
     <w:p>
-      <w:pPr>
-        <w:pStyle w:val="Heading2"/>
-      </w:pPr>
-      <w:r>
-        <w:rPr>
-          <w:b/>
-          <w:sz w:val="24"/>
-          <w:szCs w:val="24"/>
-        </w:rPr>
-        <w:t xml:space="preserve">3.9 Predictive-model development</w:t>
-      </w:r>
-    </w:p>
-    <w:p>
-      <w:r>
-        <w:t xml:space="preserve">The power-law relationship of Eq. (20) was calibrated to the Stage I data, with all exponents fitted rather than prescribed; the fitted signs were consistent with the mechanistic expectations of Section 3.8. The hybrid model added a learned residual to this physical baseline, correcting the systematic departures at the extremes of the parameter space where the single power law was least accurate. On the calibration data the hybrid model reduced residual scatter substantially relative to the physical model alone, while retaining the interpretable leading behavior. Predicted-versus-observed agreement for the competing models is summarized in Figure 7. The fitted exponents carried interpretable meaning: the positive exponent on the vegetation density parameter quantified the head-enhancement effect, the positive exponent on the permeability Reynolds number reflected the bed's capacity to transmit the enhanced flux, and the negative exponent on the initial saturation ratio encoded the attenuation of infiltration with rising antecedent moisture. The magnitudes of the exponents indicated that bed permeability and antecedent state exerted stronger leverage than the vegetation term over the tested range, foreshadowing the sensitivity ranking reported below. The residual learner concentrated its corrections at the corners of the parameter space — the driest, most permeable, most densely vegetated conditions and their opposites — where a single global power law is least able to follow the curvature of the response surface. Because the learner acts only on the residual, its corrections are bounded and do not overwhelm the physically constrained baseline, which is the intended behavior of the hybrid design.</w:t>
+      <w:r>
+        <w:t xml:space="preserve">The power law of Eq. (20) was calibrated to the Stage I data with all exponents fitted, and their signs matched mechanistic expectation — a positive exponent on λ quantifying head enhancement, a positive exponent on Re_k reflecting the bed's capacity to transmit the enhanced flux, and a negative exponent on S_i encoding attenuation with rising antecedent moisture — while the exponent magnitudes indicated that bed permeability and antecedent state exerted stronger leverage than the vegetation term, foreshadowing the sensitivity ranking. The hybrid model of Eq. (21) added a learned residual that concentrated its corrections at the corners of the parameter space where a single global power law least follows the curvature of the response surface, reducing scatter substantially while retaining the interpretable leading behavior; predicted-versus-observed agreement for the competing models is summarized in Figure 7. On the reserved validation runs of Table 4 the hybrid model achieved the highest NSE and index of agreement of Eqs. (22)–(23) and the lowest RMSE, MAE, and MAPE, clearly outperforming the Green–Ampt and Horton benchmarks and the standalone regression and tree-ensemble models, with the observed-versus-predicted comparison for the independent set shown in Figure 7. The contrast between calibration and validation is instructive: the standalone tree ensemble achieved the strongest calibration fit yet its advantage eroded on the reserved conditions, exhibiting the drop in efficiency that signals interpolation rather than generalization, whereas the physical power law showed only a small degradation because its structure embeds the correct qualitative physics; the hybrid combined the ensemble's calibration accuracy with the power law's stability on unseen conditions, and this pattern of stable physics with a flexible residual provides direct empirical support for H5 rather than an in-sample artifact, echoing the case for interpretable, transferable hybrid prediction [15], [16], [17], [41]. Variance-based sensitivity and permutation importance, corroborated by SHAP attributions, ranked bed hydraulic conductivity as the leading control, followed by antecedent saturation and vegetation density, with discharge-related groups and relative submergence of secondary importance; the order emerged from the data rather than being assumed, the three diagnostics converged, and propagated measurement and replicate uncertainties were modest relative to between-condition variation, so the ranking and model comparison are robust within the reported intervals and the scatter bounds of Figure 7.</w:t>
       </w:r>
     </w:p>
     <w:p/>
@@ -8969,39 +8563,8 @@
     </w:p>
     <w:p/>
     <w:p>
-      <w:pPr>
-        <w:pStyle w:val="Heading2"/>
-      </w:pPr>
-      <w:r>
-        <w:rPr>
-          <w:b/>
-          <w:sz w:val="24"/>
-          <w:szCs w:val="24"/>
-        </w:rPr>
-        <w:t xml:space="preserve">3.10 Independent validation</w:t>
-      </w:r>
-    </w:p>
-    <w:p>
-      <w:r>
-        <w:t xml:space="preserve">On the reserved validation conditions of Table 4 — combinations withheld entirely from calibration — the hybrid model achieved the highest NSE and index of agreement and the lowest RMSE, MAE, and MAPE among all approaches, and clearly outperformed the Green–Ampt and Horton benchmarks as well as the standalone regression and tree-ensemble models. Comparative performance metrics across all models are compiled alongside the reserved cases, and the observed-versus-predicted comparison for the independent set is shown in Figure 7. The physical power law alone generalized acceptably, but the residual correction closed most of its remaining bias, supporting H5. The contrast between calibration and validation performance is instructive. The standalone tree ensemble achieved the strongest calibration fit of any model, yet its advantage eroded on the reserved conditions, exhibiting the characteristic drop in efficiency that signals interpolation rather than genuine generalization. The physical power law showed the opposite profile: a more modest calibration fit but only a small degradation on validation, because its structure embeds the correct qualitative physics and cannot deviate arbitrarily outside the training range. The hybrid model combined the strengths of both, matching the ensemble's calibration accuracy while retaining the power law's stability on unseen conditions. This pattern — stable physics, flexible residual — is exactly what motivates hybrid formulations, and its appearance here on an honestly reserved validation set provides direct empirical support for H5 rather than an in-sample artifact.</w:t>
-      </w:r>
-    </w:p>
-    <w:p>
-      <w:pPr>
-        <w:pStyle w:val="Heading2"/>
-      </w:pPr>
-      <w:r>
-        <w:rPr>
-          <w:b/>
-          <w:sz w:val="24"/>
-          <w:szCs w:val="24"/>
-        </w:rPr>
-        <w:t xml:space="preserve">3.11 Sensitivity and uncertainty</w:t>
-      </w:r>
-    </w:p>
-    <w:p>
-      <w:r>
-        <w:t xml:space="preserve">Variance-based sensitivity and permutation-importance analyses, corroborated by SHAP attributions, ranked bed hydraulic conductivity as the leading control of infiltration, followed by antecedent saturation and vegetation density, with discharge-related groups and relative submergence of secondary importance. Notably, the relative order emerged from the data rather than being assumed. Propagated measurement and replicate uncertainties were modest relative to the between-condition variation, so the ranking and the model comparison are robust within the reported intervals, as reflected in the reported metric spread and the scatter bounds of Figure 7. The convergence of three independent diagnostics — variance-based Sobol indices, permutation importance, and SHAP attributions — on the same ordering lends confidence that the ranking is a property of the data rather than of a particular attribution method. The dominance of bed conductivity is consistent with its role as the reference scale in the normalization and with its large fitted exponent; the second rank of antecedent saturation reflects the strong early-time leverage of the initial gradient; and the third rank of vegetation density confirms that, while vegetation is the manipulable design variable of interest, its infiltration effect is conditioned by, and secondary to, the substrate and state variables. The secondary importance of the discharge-related groups and relative submergence does not imply they are negligible but that, over the tested range, they modulate rather than dominate the response. This ordering has direct design implications, developed in the discussion.</w:t>
+      <w:r>
+        <w:t xml:space="preserve">The collapse of Figure 6 and the independent-validation performance of Table 4 together indicate that the dimensionless formulation captures behavior beyond the specific flume geometry, because its predictors are non-dimensional and built from measurable hydraulic, vegetation, and soil quantities and are therefore not tied to the particular channel width or absolute discharge used here [38] — the central advantage of the dimensionless target I* = f/K_s over an equation phrased in raw experimental variables [39]. These results carry direct design implications for vegetated swales, bioretention channels, and infiltration-based green infrastructure [1]: because the vegetation benefit scales with bed conductivity, placing vegetation over the most permeable reaches maximizes recharge per unit of vegetated area; because the benefit is concentrated within and just downstream of the canopy (Figure 5), discrete patches can create a series of recharge hotspots [33]; and because the benefit is greatest at low antecedent saturation, vegetated systems deliver their largest marginal gains early in an event or after dry spells, precisely when rapid infiltration is most valuable for flood attenuation [13]. Several limitations bound the interpretation. Rigid cylinders isolate the hydrodynamic role of vegetation but omit flexibility, root-induced macroporosity, and biological clogging that shape field infiltration over longer timescales [5], [8]; the cohesionless bed materials do not represent structured or fine-textured soils; and the flume imposes steady flow whereas field events are unsteady. A clear priority is therefore external validation against an independent laboratory or field dataset [19], together with extensions to flexible reconfiguring vegetation [4], to structured or fine-textured soils where macropore and capillary effects may challenge the conductivity-based normalization [10], and to unsteady hydrographs during which the antecedent state that governs the vegetation benefit itself evolves [11]; because the framework is dimensionless and mechanistically grounded, its structure is expected to transfer even where the specific coefficients require re-estimation, providing a stable scaffold onto which additional physics can be added [17], [18].</w:t>
       </w:r>
     </w:p>
     <w:p>
@@ -9014,169 +8577,12 @@
           <w:sz w:val="28"/>
           <w:szCs w:val="28"/>
         </w:rPr>
-        <w:t xml:space="preserve">4. Discussion</w:t>
-      </w:r>
-    </w:p>
-    <w:p>
-      <w:pPr>
-        <w:pStyle w:val="Heading2"/>
-      </w:pPr>
-      <w:r>
-        <w:rPr>
-          <w:b/>
-          <w:sz w:val="24"/>
-          <w:szCs w:val="24"/>
-        </w:rPr>
-        <w:t xml:space="preserve">4.1 Physical mechanism controlling infiltration</w:t>
-      </w:r>
-    </w:p>
-    <w:p>
-      <w:r>
-        <w:t xml:space="preserve">The experiments support a clear mechanistic chain: vegetation extracts momentum from the flow, lowering velocity and raising depth for a given discharge; the elevated and locally redistributed bed head steepens the near-surface hydraulic gradient; and, where the bed can accept the additional flux, infiltration rises. This sequence explains why the vegetation effect is expressed strongly in the along-channel infiltration profile of Figure 5 rather than as a uniform lift, and why its magnitude tracks bed conductivity. The mechanistic reading is consistent with process descriptions of surface–subsurface coupling under flowing boundaries reported elsewhere [3], [36].</w:t>
-      </w:r>
-    </w:p>
-    <w:p>
-      <w:pPr>
-        <w:pStyle w:val="Heading2"/>
-      </w:pPr>
-      <w:r>
-        <w:rPr>
-          <w:b/>
-          <w:sz w:val="24"/>
-          <w:szCs w:val="24"/>
-        </w:rPr>
-        <w:t xml:space="preserve">4.2 Interaction between vegetation and permeable beds</w:t>
-      </w:r>
-    </w:p>
-    <w:p>
-      <w:r>
-        <w:t xml:space="preserve">The finding that the same change in λ yields a larger absolute infiltration gain over high-conductivity beds reflects a genuine two-way interaction between the canopy and the permeable substrate. A more permeable bed both accepts more flux for a given head increment and, as prior work on vegetated permeable beds has shown, alters the flow structure and turbulence through its own permeability signature [7]. The permeability Reynolds number Re_k in Table 3 encodes this interaction compactly, and its explanatory power in the dimensionless collapse of Figure 6 confirms that bed permeability must be represented alongside vegetation density rather than folded into a single roughness term [26].</w:t>
-      </w:r>
-    </w:p>
-    <w:p>
-      <w:pPr>
-        <w:pStyle w:val="Heading2"/>
-      </w:pPr>
-      <w:r>
-        <w:rPr>
-          <w:b/>
-          <w:sz w:val="24"/>
-          <w:szCs w:val="24"/>
-        </w:rPr>
-        <w:t xml:space="preserve">4.3 Influence of soil hydraulic properties</w:t>
-      </w:r>
-    </w:p>
-    <w:p>
-      <w:r>
-        <w:t xml:space="preserve">Bed material dominated infiltration magnitude, in agreement with the central role that saturated conductivity and pore-size structure play in classical and Green–Ampt-based descriptions [14], [37]. The grain-size metrics correlated with the measured conductivities and with the ranking of infiltration across materials, reinforcing that measurable soil properties are sufficient to parameterize the subsurface response within the proposed framework [29]. This supports the use of readily obtainable soil descriptors, rather than site-specific calibration, when transferring the model to new beds [10].</w:t>
-      </w:r>
-    </w:p>
-    <w:p>
-      <w:pPr>
-        <w:pStyle w:val="Heading2"/>
-      </w:pPr>
-      <w:r>
-        <w:rPr>
-          <w:b/>
-          <w:sz w:val="24"/>
-          <w:szCs w:val="24"/>
-        </w:rPr>
-        <w:t xml:space="preserve">4.4 Role of antecedent moisture</w:t>
-      </w:r>
-    </w:p>
-    <w:p>
-      <w:r>
-        <w:t xml:space="preserve">The strong attenuation of both baseline infiltration and the vegetation effect with rising antecedent saturation confirms antecedent moisture as a first-order control, echoing its established influence in ponded and permeable-surface infiltration [11], [12]. The practical implication is that the benefit of vegetation for infiltration is state-dependent: it is greatest for dry beds early in an event and diminishes as the bed wets toward the conductivity-limited regime [31]. Capturing this through the initial saturation ratio S_i was essential to the dimensionless collapse and to the model's cross-condition transferability.</w:t>
-      </w:r>
-    </w:p>
-    <w:p>
-      <w:pPr>
-        <w:pStyle w:val="Heading2"/>
-      </w:pPr>
-      <w:r>
-        <w:rPr>
-          <w:b/>
-          <w:sz w:val="24"/>
-          <w:szCs w:val="24"/>
-        </w:rPr>
-        <w:t xml:space="preserve">4.5 Generalization across hydraulic conditions</w:t>
-      </w:r>
-    </w:p>
-    <w:p>
-      <w:r>
-        <w:t xml:space="preserve">The collapse of the multi-material dataset in Figure 6 and the independent-validation performance in Table 4 together indicate that the dimensionless formulation captures behavior beyond the specific flume geometry. Because the predictors are non-dimensional and built from measurable hydraulic, vegetation, and soil quantities, the relationship is not tied to the particular channel width or absolute discharge used here [38]. This is the central advantage of the dimensionless target I* = f/K_s over an equation phrased in raw experimental variables, which would be flume-specific [39].</w:t>
-      </w:r>
-    </w:p>
-    <w:p>
-      <w:pPr>
-        <w:pStyle w:val="Heading2"/>
-      </w:pPr>
-      <w:r>
-        <w:rPr>
-          <w:b/>
-          <w:sz w:val="24"/>
-          <w:szCs w:val="24"/>
-        </w:rPr>
-        <w:t xml:space="preserve">4.6 Comparison with existing infiltration models</w:t>
-      </w:r>
-    </w:p>
-    <w:p>
-      <w:r>
-        <w:t xml:space="preserve">The hybrid model outperformed Green–Ampt, Horton, standalone regression, and standalone tree ensembles on the independent set (Table 4). Green–Ampt and Horton, lacking explicit dependence on vegetation and channel hydraulics, systematically underpredicted the vegetation-enhanced conditions [15]. The tree ensemble fitted the calibration data well but generalized less reliably than the hybrid model, consistent with concerns that purely data-driven infiltration models can extrapolate poorly [16]. The hybrid structure retained the physical model's leading behavior while learning only the residual, which is precisely the property advocated for interpretable, transferable hydrological prediction [17], [41].</w:t>
-      </w:r>
-    </w:p>
-    <w:p>
-      <w:pPr>
-        <w:pStyle w:val="Heading2"/>
-      </w:pPr>
-      <w:r>
-        <w:rPr>
-          <w:b/>
-          <w:sz w:val="24"/>
-          <w:szCs w:val="24"/>
-        </w:rPr>
-        <w:t xml:space="preserve">4.7 Implications for nature-based drainage systems</w:t>
-      </w:r>
-    </w:p>
-    <w:p>
-      <w:r>
-        <w:t xml:space="preserve">The results have direct implications for the design of vegetated swales, bioretention channels, and infiltration-based green infrastructure [1]. Because infiltration enhancement is concentrated within and just downstream of the vegetation zone (Figure 5), targeted placement of vegetation can be used to steer recharge to preferred locations rather than assuming uniform benefit. The state dependence on antecedent moisture also implies that design performance should be assessed across a range of initial conditions rather than at a single reference state [13]. The generalized model provides a tool for such multi-condition assessment without bespoke calibration. Three design principles follow from the results. First, because the vegetation benefit scales with bed conductivity, placing vegetation over the most permeable reaches maximizes recharge per unit of vegetated area, whereas vegetating a low-conductivity reach yields little return [1]. Second, because the benefit is concentrated within and just downstream of the canopy, discrete vegetation patches distributed along a channel can create a series of recharge hotspots whose combined effect may exceed that of a single continuous stand of the same total area, offering a lever for spatially targeting recharge [33]. Third, because the benefit is greatest at low antecedent saturation, vegetated infiltration systems deliver their largest marginal gains early in an event or after dry spells, which is often precisely when rapid infiltration is most valuable for flood attenuation [13]. These principles convert the mechanistic findings into actionable guidance rather than leaving them as descriptive results.</w:t>
-      </w:r>
-    </w:p>
-    <w:p>
-      <w:pPr>
-        <w:pStyle w:val="Heading2"/>
-      </w:pPr>
-      <w:r>
-        <w:rPr>
-          <w:b/>
-          <w:sz w:val="24"/>
-          <w:szCs w:val="24"/>
-        </w:rPr>
-        <w:t xml:space="preserve">4.8 Limitations and transferability</w:t>
-      </w:r>
-    </w:p>
-    <w:p>
-      <w:r>
-        <w:t xml:space="preserve">Several limitations bound the interpretation. Rigid cylinders isolate the hydrodynamic role of vegetation but omit flexibility, root-induced macroporosity, and biological clogging that shape field infiltration over longer timescales [5], [8]. The bed materials, though contrasting, are cohesionless and do not represent structured or fine-textured soils. The flume imposes steady flow, whereas field events are unsteady. These constraints suggest that the calibrated exponents should be treated as flume-derived and re-examined against field or independent-laboratory datasets before operational use [19]. Nonetheless, because the framework is dimensionless and mechanistically grounded, its structure is expected to transfer even where the specific coefficients require re-estimation [18]. A clear priority for future work is therefore an external validation against an independent laboratory or field dataset, which would test whether the fitted exponents hold beyond the present apparatus or require regional recalibration [19]. Extending the vegetation representation from rigid cylinders to flexible, reconfiguring elements would test whether canopy flexibility, which reduces drag at high flow through streamlining, weakens the infiltration enhancement relative to the rigid-stem baseline established here [4]. Incorporating structured or fine-textured soils would probe whether the conductivity-based normalization remains adequate when macropore flow or capillary effects become important [10]. Finally, replacing steady flow with unsteady hydrographs would reveal how the strong antecedent-moisture dependence interacts with the time-varying head of a real event, since the state that governs the vegetation benefit itself evolves during the event [11]. Each of these extensions builds naturally on the present framework rather than replacing it, because the dimensionless structure provides a stable scaffold onto which additional physics can be added [17].</w:t>
-      </w:r>
-    </w:p>
-    <w:p>
-      <w:pPr>
-        <w:pStyle w:val="Heading1"/>
-      </w:pPr>
-      <w:r>
-        <w:rPr>
-          <w:b/>
-          <w:sz w:val="28"/>
-          <w:szCs w:val="28"/>
-        </w:rPr>
-        <w:t xml:space="preserve">5. Conclusions</w:t>
-      </w:r>
-    </w:p>
-    <w:p>
-      <w:r>
-        <w:t xml:space="preserve">This study developed and tested a coupled, mechanistically grounded framework for predicting infiltration from flowing channels into permeable beds under the joint influence of vegetation, soil properties, and antecedent moisture. Four quantitative conclusions follow. First, increasing vegetation density systematically raises both instantaneous and cumulative infiltration by reducing velocity and raising the bed head, but the enhancement is non-additive and scales with bed hydraulic conductivity, being largest over the most permeable beds. Second, antecedent moisture is a first-order control: the vegetation-induced enhancement is greatest for dry initial states and attenuates markedly as the bed approaches the conductivity-limited regime at high initial saturation. Third, vegetation enhances infiltration non-uniformly, generating a pronounced hotspot within and immediately downstream of the canopy rather than a uniform lift, so reach-integrated losses conceal the true spatial pattern. Fourth, normalizing infiltration by saturated conductivity collapses multi-material data onto a common dimensionless surface governed by the vegetation density parameter, permeability Reynolds number, Froude number, relative submergence, and initial saturation ratio, and a hybrid physical–data-driven model built on these groups generalized to independent validation conditions and outperformed Green–Ampt, Horton, standalone regression, and standalone tree-ensemble models, with sensitivity analysis ranking bed conductivity, antecedent saturation, and vegetation density as the leading controls in that order. Together these results provide a transferable predictive tool and a mechanistic basis for the design of vegetated, infiltration-based drainage systems, while highlighting the need for future validation against flexible vegetation, structured soils, unsteady flows, and independent field datasets.</w:t>
+        <w:t xml:space="preserve">4. Conclusions</w:t>
+      </w:r>
+    </w:p>
+    <w:p>
+      <w:r>
+        <w:t xml:space="preserve">This study developed and tested a coupled, mechanistically grounded framework for predicting infiltration from flowing channels into permeable beds under the joint influence of vegetation, soil properties, and antecedent moisture, supported by a purpose-built dataset of 164 flume runs spanning vegetation density, discharge, bed material, and antecedent moisture with cell-resolved along-channel infiltration. Four quantitative conclusions follow. First, increasing vegetation density systematically raises both instantaneous and cumulative infiltration by reducing velocity and raising the bed head, but the enhancement is non-additive and scales with bed hydraulic conductivity, being largest over the most permeable beds. Second, antecedent moisture is a first-order control: the vegetation-induced enhancement is greatest for dry initial states and attenuates markedly as the bed approaches the conductivity-limited regime at high initial saturation. Third, vegetation enhances infiltration non-uniformly, generating a pronounced hotspot within and immediately downstream of the canopy rather than a uniform lift, with a persistent downstream tail, so reach-integrated losses conceal the true spatial pattern. Fourth, normalizing infiltration by saturated conductivity collapses multi-material data onto a common dimensionless surface governed by the vegetation density parameter, permeability Reynolds number, Froude number, relative submergence, and initial saturation ratio, and a hybrid physical–data-driven model built on these groups generalized to independent validation conditions and outperformed Green–Ampt, Horton, standalone regression, and standalone tree-ensemble models, with sensitivity analysis ranking bed conductivity, antecedent saturation, and vegetation density as the leading controls in that order. Together these results provide a transferable predictive tool and a mechanistic basis for the design of vegetated, infiltration-based drainage systems, while highlighting the need for future validation against flexible vegetation, structured soils, unsteady flows, and independent field datasets.</w:t>
       </w:r>
     </w:p>
     <w:p>

</xml_diff>